<commit_message>
feat: Introduce estimate summary materialized view, including its Alembic migration, test script, and comprehensive documentation.
</commit_message>
<xml_diff>
--- a/IA Model selection.docx
+++ b/IA Model selection.docx
@@ -349,10 +349,16 @@
             <w:hideMark/>
           </w:tcPr>
           <w:p>
-            <w:r>
-              <w:rPr>
-                <w:b/>
-                <w:bCs/>
+            <w:pPr>
+              <w:rPr>
+                <w:highlight w:val="green"/>
+              </w:rPr>
+            </w:pPr>
+            <w:r>
+              <w:rPr>
+                <w:b/>
+                <w:bCs/>
+                <w:highlight w:val="green"/>
               </w:rPr>
               <w:t>1.1</w:t>
             </w:r>
@@ -377,11 +383,22 @@
             <w:hideMark/>
           </w:tcPr>
           <w:p>
-            <w:r>
+            <w:pPr>
+              <w:rPr>
+                <w:highlight w:val="green"/>
+              </w:rPr>
+            </w:pPr>
+            <w:r>
+              <w:rPr>
+                <w:highlight w:val="green"/>
+              </w:rPr>
               <w:t xml:space="preserve">Setup Struttura Layer </w:t>
             </w:r>
             <w:proofErr w:type="spellStart"/>
             <w:r>
+              <w:rPr>
+                <w:highlight w:val="green"/>
+              </w:rPr>
               <w:t>Backend</w:t>
             </w:r>
             <w:proofErr w:type="spellEnd"/>
@@ -406,10 +423,16 @@
             <w:hideMark/>
           </w:tcPr>
           <w:p>
-            <w:r>
-              <w:rPr>
-                <w:b/>
-                <w:bCs/>
+            <w:pPr>
+              <w:rPr>
+                <w:highlight w:val="green"/>
+              </w:rPr>
+            </w:pPr>
+            <w:r>
+              <w:rPr>
+                <w:b/>
+                <w:bCs/>
+                <w:highlight w:val="green"/>
               </w:rPr>
               <w:t>GPT-4o</w:t>
             </w:r>
@@ -434,7 +457,15 @@
             <w:hideMark/>
           </w:tcPr>
           <w:p>
-            <w:r>
+            <w:pPr>
+              <w:rPr>
+                <w:highlight w:val="green"/>
+              </w:rPr>
+            </w:pPr>
+            <w:r>
+              <w:rPr>
+                <w:highlight w:val="green"/>
+              </w:rPr>
               <w:t>GPT-5 mini</w:t>
             </w:r>
           </w:p>
@@ -458,7 +489,15 @@
             <w:hideMark/>
           </w:tcPr>
           <w:p>
-            <w:r>
+            <w:pPr>
+              <w:rPr>
+                <w:highlight w:val="green"/>
+              </w:rPr>
+            </w:pPr>
+            <w:r>
+              <w:rPr>
+                <w:highlight w:val="green"/>
+              </w:rPr>
               <w:t>0x/0x</w:t>
             </w:r>
           </w:p>
@@ -482,13 +521,22 @@
             <w:hideMark/>
           </w:tcPr>
           <w:p>
+            <w:pPr>
+              <w:rPr>
+                <w:highlight w:val="green"/>
+              </w:rPr>
+            </w:pPr>
             <w:r>
               <w:rPr>
                 <w:rFonts w:ascii="Segoe UI Emoji" w:hAnsi="Segoe UI Emoji" w:cs="Segoe UI Emoji"/>
+                <w:highlight w:val="green"/>
               </w:rPr>
               <w:t>❌</w:t>
             </w:r>
             <w:r>
+              <w:rPr>
+                <w:highlight w:val="green"/>
+              </w:rPr>
               <w:t xml:space="preserve"> Non necessario</w:t>
             </w:r>
           </w:p>
@@ -517,10 +565,16 @@
             <w:hideMark/>
           </w:tcPr>
           <w:p>
-            <w:r>
-              <w:rPr>
-                <w:b/>
-                <w:bCs/>
+            <w:pPr>
+              <w:rPr>
+                <w:highlight w:val="green"/>
+              </w:rPr>
+            </w:pPr>
+            <w:r>
+              <w:rPr>
+                <w:b/>
+                <w:bCs/>
+                <w:highlight w:val="green"/>
               </w:rPr>
               <w:t>1.2</w:t>
             </w:r>
@@ -545,15 +599,29 @@
             <w:hideMark/>
           </w:tcPr>
           <w:p>
-            <w:r>
+            <w:pPr>
+              <w:rPr>
+                <w:highlight w:val="green"/>
+              </w:rPr>
+            </w:pPr>
+            <w:r>
+              <w:rPr>
+                <w:highlight w:val="green"/>
+              </w:rPr>
               <w:t xml:space="preserve">Modello API </w:t>
             </w:r>
             <w:proofErr w:type="spellStart"/>
             <w:r>
+              <w:rPr>
+                <w:highlight w:val="green"/>
+              </w:rPr>
               <w:t>Response</w:t>
             </w:r>
             <w:proofErr w:type="spellEnd"/>
             <w:r>
+              <w:rPr>
+                <w:highlight w:val="green"/>
+              </w:rPr>
               <w:t xml:space="preserve"> Standard</w:t>
             </w:r>
           </w:p>
@@ -577,10 +645,16 @@
             <w:hideMark/>
           </w:tcPr>
           <w:p>
-            <w:r>
-              <w:rPr>
-                <w:b/>
-                <w:bCs/>
+            <w:pPr>
+              <w:rPr>
+                <w:highlight w:val="green"/>
+              </w:rPr>
+            </w:pPr>
+            <w:r>
+              <w:rPr>
+                <w:b/>
+                <w:bCs/>
+                <w:highlight w:val="green"/>
               </w:rPr>
               <w:t>GPT-4o</w:t>
             </w:r>
@@ -605,7 +679,15 @@
             <w:hideMark/>
           </w:tcPr>
           <w:p>
-            <w:r>
+            <w:pPr>
+              <w:rPr>
+                <w:highlight w:val="green"/>
+              </w:rPr>
+            </w:pPr>
+            <w:r>
+              <w:rPr>
+                <w:highlight w:val="green"/>
+              </w:rPr>
               <w:t>GPT-5.1-Codex</w:t>
             </w:r>
           </w:p>
@@ -629,7 +711,15 @@
             <w:hideMark/>
           </w:tcPr>
           <w:p>
-            <w:r>
+            <w:pPr>
+              <w:rPr>
+                <w:highlight w:val="green"/>
+              </w:rPr>
+            </w:pPr>
+            <w:r>
+              <w:rPr>
+                <w:highlight w:val="green"/>
+              </w:rPr>
               <w:t>0x/1x</w:t>
             </w:r>
           </w:p>
@@ -653,13 +743,22 @@
             <w:hideMark/>
           </w:tcPr>
           <w:p>
+            <w:pPr>
+              <w:rPr>
+                <w:highlight w:val="green"/>
+              </w:rPr>
+            </w:pPr>
             <w:r>
               <w:rPr>
                 <w:rFonts w:ascii="Segoe UI Emoji" w:hAnsi="Segoe UI Emoji" w:cs="Segoe UI Emoji"/>
+                <w:highlight w:val="green"/>
               </w:rPr>
               <w:t>❌</w:t>
             </w:r>
             <w:r>
+              <w:rPr>
+                <w:highlight w:val="green"/>
+              </w:rPr>
               <w:t xml:space="preserve"> Non necessario</w:t>
             </w:r>
           </w:p>
@@ -688,10 +787,16 @@
             <w:hideMark/>
           </w:tcPr>
           <w:p>
-            <w:r>
-              <w:rPr>
-                <w:b/>
-                <w:bCs/>
+            <w:pPr>
+              <w:rPr>
+                <w:highlight w:val="green"/>
+              </w:rPr>
+            </w:pPr>
+            <w:r>
+              <w:rPr>
+                <w:b/>
+                <w:bCs/>
+                <w:highlight w:val="green"/>
               </w:rPr>
               <w:t>1.3</w:t>
             </w:r>
@@ -716,7 +821,15 @@
             <w:hideMark/>
           </w:tcPr>
           <w:p>
-            <w:r>
+            <w:pPr>
+              <w:rPr>
+                <w:highlight w:val="green"/>
+              </w:rPr>
+            </w:pPr>
+            <w:r>
+              <w:rPr>
+                <w:highlight w:val="green"/>
+              </w:rPr>
               <w:t>Value Object Money</w:t>
             </w:r>
           </w:p>
@@ -740,10 +853,16 @@
             <w:hideMark/>
           </w:tcPr>
           <w:p>
-            <w:r>
-              <w:rPr>
-                <w:b/>
-                <w:bCs/>
+            <w:pPr>
+              <w:rPr>
+                <w:highlight w:val="green"/>
+              </w:rPr>
+            </w:pPr>
+            <w:r>
+              <w:rPr>
+                <w:b/>
+                <w:bCs/>
+                <w:highlight w:val="green"/>
               </w:rPr>
               <w:t>Claude Sonnet 4.5</w:t>
             </w:r>
@@ -768,7 +887,15 @@
             <w:hideMark/>
           </w:tcPr>
           <w:p>
-            <w:r>
+            <w:pPr>
+              <w:rPr>
+                <w:highlight w:val="green"/>
+              </w:rPr>
+            </w:pPr>
+            <w:r>
+              <w:rPr>
+                <w:highlight w:val="green"/>
+              </w:rPr>
               <w:t>GPT-5.2-Codex</w:t>
             </w:r>
           </w:p>
@@ -792,7 +919,15 @@
             <w:hideMark/>
           </w:tcPr>
           <w:p>
-            <w:r>
+            <w:pPr>
+              <w:rPr>
+                <w:highlight w:val="green"/>
+              </w:rPr>
+            </w:pPr>
+            <w:r>
+              <w:rPr>
+                <w:highlight w:val="green"/>
+              </w:rPr>
               <w:t>1x/1x</w:t>
             </w:r>
           </w:p>
@@ -816,39 +951,64 @@
             <w:hideMark/>
           </w:tcPr>
           <w:p>
+            <w:pPr>
+              <w:rPr>
+                <w:highlight w:val="green"/>
+              </w:rPr>
+            </w:pPr>
             <w:r>
               <w:rPr>
                 <w:rFonts w:ascii="Segoe UI Emoji" w:hAnsi="Segoe UI Emoji" w:cs="Segoe UI Emoji"/>
+                <w:highlight w:val="green"/>
               </w:rPr>
               <w:t>✅</w:t>
             </w:r>
             <w:r>
+              <w:rPr>
+                <w:highlight w:val="green"/>
+              </w:rPr>
               <w:t> </w:t>
             </w:r>
             <w:r>
               <w:rPr>
                 <w:b/>
                 <w:bCs/>
+                <w:highlight w:val="green"/>
               </w:rPr>
               <w:t>GPT-5 mini</w:t>
             </w:r>
             <w:r>
+              <w:rPr>
+                <w:highlight w:val="green"/>
+              </w:rPr>
               <w:t xml:space="preserve"> (test </w:t>
             </w:r>
             <w:proofErr w:type="spellStart"/>
             <w:r>
+              <w:rPr>
+                <w:highlight w:val="green"/>
+              </w:rPr>
               <w:t>Decimal</w:t>
             </w:r>
             <w:proofErr w:type="spellEnd"/>
             <w:r>
+              <w:rPr>
+                <w:highlight w:val="green"/>
+              </w:rPr>
               <w:t xml:space="preserve"> </w:t>
             </w:r>
             <w:proofErr w:type="spellStart"/>
             <w:r>
+              <w:rPr>
+                <w:highlight w:val="green"/>
+              </w:rPr>
               <w:t>precision</w:t>
             </w:r>
             <w:proofErr w:type="spellEnd"/>
             <w:r>
+              <w:rPr>
+                <w:highlight w:val="green"/>
+              </w:rPr>
               <w:t>)</w:t>
             </w:r>
           </w:p>
@@ -877,10 +1037,16 @@
             <w:hideMark/>
           </w:tcPr>
           <w:p>
-            <w:r>
-              <w:rPr>
-                <w:b/>
-                <w:bCs/>
+            <w:pPr>
+              <w:rPr>
+                <w:highlight w:val="green"/>
+              </w:rPr>
+            </w:pPr>
+            <w:r>
+              <w:rPr>
+                <w:b/>
+                <w:bCs/>
+                <w:highlight w:val="green"/>
               </w:rPr>
               <w:t>1.4</w:t>
             </w:r>
@@ -905,11 +1071,22 @@
             <w:hideMark/>
           </w:tcPr>
           <w:p>
-            <w:r>
+            <w:pPr>
+              <w:rPr>
+                <w:highlight w:val="green"/>
+              </w:rPr>
+            </w:pPr>
+            <w:r>
+              <w:rPr>
+                <w:highlight w:val="green"/>
+              </w:rPr>
               <w:t xml:space="preserve">Value Object </w:t>
             </w:r>
             <w:proofErr w:type="spellStart"/>
             <w:r>
+              <w:rPr>
+                <w:highlight w:val="green"/>
+              </w:rPr>
               <w:t>Percentage</w:t>
             </w:r>
             <w:proofErr w:type="spellEnd"/>
@@ -934,10 +1111,16 @@
             <w:hideMark/>
           </w:tcPr>
           <w:p>
-            <w:r>
-              <w:rPr>
-                <w:b/>
-                <w:bCs/>
+            <w:pPr>
+              <w:rPr>
+                <w:highlight w:val="green"/>
+              </w:rPr>
+            </w:pPr>
+            <w:r>
+              <w:rPr>
+                <w:b/>
+                <w:bCs/>
+                <w:highlight w:val="green"/>
               </w:rPr>
               <w:t>Claude Sonnet 4.5</w:t>
             </w:r>
@@ -962,7 +1145,15 @@
             <w:hideMark/>
           </w:tcPr>
           <w:p>
-            <w:r>
+            <w:pPr>
+              <w:rPr>
+                <w:highlight w:val="green"/>
+              </w:rPr>
+            </w:pPr>
+            <w:r>
+              <w:rPr>
+                <w:highlight w:val="green"/>
+              </w:rPr>
               <w:t>GPT-5.2-Codex</w:t>
             </w:r>
           </w:p>
@@ -986,7 +1177,15 @@
             <w:hideMark/>
           </w:tcPr>
           <w:p>
-            <w:r>
+            <w:pPr>
+              <w:rPr>
+                <w:highlight w:val="green"/>
+              </w:rPr>
+            </w:pPr>
+            <w:r>
+              <w:rPr>
+                <w:highlight w:val="green"/>
+              </w:rPr>
               <w:t>1x/1x</w:t>
             </w:r>
           </w:p>
@@ -1012,18 +1211,21 @@
           <w:p>
             <w:pPr>
               <w:rPr>
+                <w:highlight w:val="green"/>
                 <w:lang w:val="en-US"/>
               </w:rPr>
             </w:pPr>
             <w:r>
               <w:rPr>
                 <w:rFonts w:ascii="Segoe UI Emoji" w:hAnsi="Segoe UI Emoji" w:cs="Segoe UI Emoji"/>
+                <w:highlight w:val="green"/>
                 <w:lang w:val="en-US"/>
               </w:rPr>
               <w:t>✅</w:t>
             </w:r>
             <w:r>
               <w:rPr>
+                <w:highlight w:val="green"/>
                 <w:lang w:val="en-US"/>
               </w:rPr>
               <w:t> </w:t>
@@ -1032,12 +1234,14 @@
               <w:rPr>
                 <w:b/>
                 <w:bCs/>
+                <w:highlight w:val="green"/>
                 <w:lang w:val="en-US"/>
               </w:rPr>
               <w:t>GPT-5 mini</w:t>
             </w:r>
             <w:r>
               <w:rPr>
+                <w:highlight w:val="green"/>
                 <w:lang w:val="en-US"/>
               </w:rPr>
               <w:t> (test basis points)</w:t>
@@ -1068,10 +1272,16 @@
             <w:hideMark/>
           </w:tcPr>
           <w:p>
-            <w:r>
-              <w:rPr>
-                <w:b/>
-                <w:bCs/>
+            <w:pPr>
+              <w:rPr>
+                <w:highlight w:val="green"/>
+              </w:rPr>
+            </w:pPr>
+            <w:r>
+              <w:rPr>
+                <w:b/>
+                <w:bCs/>
+                <w:highlight w:val="green"/>
               </w:rPr>
               <w:t>1.5</w:t>
             </w:r>
@@ -1096,11 +1306,22 @@
             <w:hideMark/>
           </w:tcPr>
           <w:p>
-            <w:r>
+            <w:pPr>
+              <w:rPr>
+                <w:highlight w:val="green"/>
+              </w:rPr>
+            </w:pPr>
+            <w:r>
+              <w:rPr>
+                <w:highlight w:val="green"/>
+              </w:rPr>
               <w:t xml:space="preserve">Value Object </w:t>
             </w:r>
             <w:proofErr w:type="spellStart"/>
             <w:r>
+              <w:rPr>
+                <w:highlight w:val="green"/>
+              </w:rPr>
               <w:t>PriceTarget</w:t>
             </w:r>
             <w:proofErr w:type="spellEnd"/>
@@ -1125,10 +1346,16 @@
             <w:hideMark/>
           </w:tcPr>
           <w:p>
-            <w:r>
-              <w:rPr>
-                <w:b/>
-                <w:bCs/>
+            <w:pPr>
+              <w:rPr>
+                <w:highlight w:val="green"/>
+              </w:rPr>
+            </w:pPr>
+            <w:r>
+              <w:rPr>
+                <w:b/>
+                <w:bCs/>
+                <w:highlight w:val="green"/>
               </w:rPr>
               <w:t>Claude Sonnet 4.5</w:t>
             </w:r>
@@ -1153,7 +1380,15 @@
             <w:hideMark/>
           </w:tcPr>
           <w:p>
-            <w:r>
+            <w:pPr>
+              <w:rPr>
+                <w:highlight w:val="green"/>
+              </w:rPr>
+            </w:pPr>
+            <w:r>
+              <w:rPr>
+                <w:highlight w:val="green"/>
+              </w:rPr>
               <w:t>GPT-4o</w:t>
             </w:r>
           </w:p>
@@ -1177,7 +1412,15 @@
             <w:hideMark/>
           </w:tcPr>
           <w:p>
-            <w:r>
+            <w:pPr>
+              <w:rPr>
+                <w:highlight w:val="green"/>
+              </w:rPr>
+            </w:pPr>
+            <w:r>
+              <w:rPr>
+                <w:highlight w:val="green"/>
+              </w:rPr>
               <w:t>1x/0x</w:t>
             </w:r>
           </w:p>
@@ -1203,18 +1446,21 @@
           <w:p>
             <w:pPr>
               <w:rPr>
+                <w:highlight w:val="green"/>
                 <w:lang w:val="en-US"/>
               </w:rPr>
             </w:pPr>
             <w:r>
               <w:rPr>
                 <w:rFonts w:ascii="Segoe UI Emoji" w:hAnsi="Segoe UI Emoji" w:cs="Segoe UI Emoji"/>
+                <w:highlight w:val="green"/>
                 <w:lang w:val="en-US"/>
               </w:rPr>
               <w:t>✅</w:t>
             </w:r>
             <w:r>
               <w:rPr>
+                <w:highlight w:val="green"/>
                 <w:lang w:val="en-US"/>
               </w:rPr>
               <w:t> </w:t>
@@ -1223,15 +1469,33 @@
               <w:rPr>
                 <w:b/>
                 <w:bCs/>
+                <w:highlight w:val="green"/>
                 <w:lang w:val="en-US"/>
               </w:rPr>
               <w:t>Grok Code Fast 1</w:t>
             </w:r>
             <w:r>
               <w:rPr>
+                <w:highlight w:val="green"/>
                 <w:lang w:val="en-US"/>
               </w:rPr>
-              <w:t> (validazioni LONG/SHORT)</w:t>
+              <w:t> (</w:t>
+            </w:r>
+            <w:proofErr w:type="spellStart"/>
+            <w:r>
+              <w:rPr>
+                <w:highlight w:val="green"/>
+                <w:lang w:val="en-US"/>
+              </w:rPr>
+              <w:t>validazioni</w:t>
+            </w:r>
+            <w:proofErr w:type="spellEnd"/>
+            <w:r>
+              <w:rPr>
+                <w:highlight w:val="green"/>
+                <w:lang w:val="en-US"/>
+              </w:rPr>
+              <w:t xml:space="preserve"> LONG/SHORT)</w:t>
             </w:r>
           </w:p>
         </w:tc>
@@ -1259,10 +1523,16 @@
             <w:hideMark/>
           </w:tcPr>
           <w:p>
-            <w:r>
-              <w:rPr>
-                <w:b/>
-                <w:bCs/>
+            <w:pPr>
+              <w:rPr>
+                <w:highlight w:val="green"/>
+              </w:rPr>
+            </w:pPr>
+            <w:r>
+              <w:rPr>
+                <w:b/>
+                <w:bCs/>
+                <w:highlight w:val="green"/>
               </w:rPr>
               <w:t>1.6</w:t>
             </w:r>
@@ -1287,20 +1557,37 @@
             <w:hideMark/>
           </w:tcPr>
           <w:p>
+            <w:pPr>
+              <w:rPr>
+                <w:highlight w:val="green"/>
+              </w:rPr>
+            </w:pPr>
             <w:proofErr w:type="spellStart"/>
             <w:r>
+              <w:rPr>
+                <w:highlight w:val="green"/>
+              </w:rPr>
               <w:t>Config</w:t>
             </w:r>
             <w:proofErr w:type="spellEnd"/>
             <w:r>
+              <w:rPr>
+                <w:highlight w:val="green"/>
+              </w:rPr>
               <w:t xml:space="preserve"> </w:t>
             </w:r>
             <w:proofErr w:type="spellStart"/>
             <w:r>
+              <w:rPr>
+                <w:highlight w:val="green"/>
+              </w:rPr>
               <w:t>Pydantic</w:t>
             </w:r>
             <w:proofErr w:type="spellEnd"/>
             <w:r>
+              <w:rPr>
+                <w:highlight w:val="green"/>
+              </w:rPr>
               <w:t xml:space="preserve"> Settings</w:t>
             </w:r>
           </w:p>
@@ -1324,10 +1611,16 @@
             <w:hideMark/>
           </w:tcPr>
           <w:p>
-            <w:r>
-              <w:rPr>
-                <w:b/>
-                <w:bCs/>
+            <w:pPr>
+              <w:rPr>
+                <w:highlight w:val="green"/>
+              </w:rPr>
+            </w:pPr>
+            <w:r>
+              <w:rPr>
+                <w:b/>
+                <w:bCs/>
+                <w:highlight w:val="green"/>
               </w:rPr>
               <w:t>GPT-4o</w:t>
             </w:r>
@@ -1352,7 +1645,15 @@
             <w:hideMark/>
           </w:tcPr>
           <w:p>
-            <w:r>
+            <w:pPr>
+              <w:rPr>
+                <w:highlight w:val="green"/>
+              </w:rPr>
+            </w:pPr>
+            <w:r>
+              <w:rPr>
+                <w:highlight w:val="green"/>
+              </w:rPr>
               <w:t>GPT-5 mini</w:t>
             </w:r>
           </w:p>
@@ -1376,7 +1677,15 @@
             <w:hideMark/>
           </w:tcPr>
           <w:p>
-            <w:r>
+            <w:pPr>
+              <w:rPr>
+                <w:highlight w:val="green"/>
+              </w:rPr>
+            </w:pPr>
+            <w:r>
+              <w:rPr>
+                <w:highlight w:val="green"/>
+              </w:rPr>
               <w:t>0x/0x</w:t>
             </w:r>
           </w:p>
@@ -1400,13 +1709,22 @@
             <w:hideMark/>
           </w:tcPr>
           <w:p>
+            <w:pPr>
+              <w:rPr>
+                <w:highlight w:val="green"/>
+              </w:rPr>
+            </w:pPr>
             <w:r>
               <w:rPr>
                 <w:rFonts w:ascii="Segoe UI Emoji" w:hAnsi="Segoe UI Emoji" w:cs="Segoe UI Emoji"/>
+                <w:highlight w:val="green"/>
               </w:rPr>
               <w:t>❌</w:t>
             </w:r>
             <w:r>
+              <w:rPr>
+                <w:highlight w:val="green"/>
+              </w:rPr>
               <w:t xml:space="preserve"> Non necessario</w:t>
             </w:r>
           </w:p>
@@ -1435,10 +1753,16 @@
             <w:hideMark/>
           </w:tcPr>
           <w:p>
-            <w:r>
-              <w:rPr>
-                <w:b/>
-                <w:bCs/>
+            <w:pPr>
+              <w:rPr>
+                <w:highlight w:val="green"/>
+              </w:rPr>
+            </w:pPr>
+            <w:r>
+              <w:rPr>
+                <w:b/>
+                <w:bCs/>
+                <w:highlight w:val="green"/>
               </w:rPr>
               <w:t>1.7</w:t>
             </w:r>
@@ -1463,7 +1787,15 @@
             <w:hideMark/>
           </w:tcPr>
           <w:p>
-            <w:r>
+            <w:pPr>
+              <w:rPr>
+                <w:highlight w:val="green"/>
+              </w:rPr>
+            </w:pPr>
+            <w:r>
+              <w:rPr>
+                <w:highlight w:val="green"/>
+              </w:rPr>
               <w:t>Middleware Sicurezza Base</w:t>
             </w:r>
           </w:p>
@@ -1487,10 +1819,16 @@
             <w:hideMark/>
           </w:tcPr>
           <w:p>
-            <w:r>
-              <w:rPr>
-                <w:b/>
-                <w:bCs/>
+            <w:pPr>
+              <w:rPr>
+                <w:highlight w:val="green"/>
+              </w:rPr>
+            </w:pPr>
+            <w:r>
+              <w:rPr>
+                <w:b/>
+                <w:bCs/>
+                <w:highlight w:val="green"/>
               </w:rPr>
               <w:t>GPT-4o</w:t>
             </w:r>
@@ -1515,7 +1853,15 @@
             <w:hideMark/>
           </w:tcPr>
           <w:p>
-            <w:r>
+            <w:pPr>
+              <w:rPr>
+                <w:highlight w:val="green"/>
+              </w:rPr>
+            </w:pPr>
+            <w:r>
+              <w:rPr>
+                <w:highlight w:val="green"/>
+              </w:rPr>
               <w:t>GPT-5 mini</w:t>
             </w:r>
           </w:p>
@@ -1539,7 +1885,15 @@
             <w:hideMark/>
           </w:tcPr>
           <w:p>
-            <w:r>
+            <w:pPr>
+              <w:rPr>
+                <w:highlight w:val="green"/>
+              </w:rPr>
+            </w:pPr>
+            <w:r>
+              <w:rPr>
+                <w:highlight w:val="green"/>
+              </w:rPr>
               <w:t>0x/0x</w:t>
             </w:r>
           </w:p>
@@ -1565,18 +1919,21 @@
           <w:p>
             <w:pPr>
               <w:rPr>
+                <w:highlight w:val="green"/>
                 <w:lang w:val="en-US"/>
               </w:rPr>
             </w:pPr>
             <w:r>
               <w:rPr>
                 <w:rFonts w:ascii="Segoe UI Emoji" w:hAnsi="Segoe UI Emoji" w:cs="Segoe UI Emoji"/>
+                <w:highlight w:val="green"/>
                 <w:lang w:val="en-US"/>
               </w:rPr>
               <w:t>✅</w:t>
             </w:r>
             <w:r>
               <w:rPr>
+                <w:highlight w:val="green"/>
                 <w:lang w:val="en-US"/>
               </w:rPr>
               <w:t> </w:t>
@@ -1585,12 +1942,14 @@
               <w:rPr>
                 <w:b/>
                 <w:bCs/>
+                <w:highlight w:val="green"/>
                 <w:lang w:val="en-US"/>
               </w:rPr>
               <w:t>DeepSeek-V3.2</w:t>
             </w:r>
             <w:r>
               <w:rPr>
+                <w:highlight w:val="green"/>
                 <w:lang w:val="en-US"/>
               </w:rPr>
               <w:t> (security headers check)</w:t>
@@ -1621,10 +1980,16 @@
             <w:hideMark/>
           </w:tcPr>
           <w:p>
-            <w:r>
-              <w:rPr>
-                <w:b/>
-                <w:bCs/>
+            <w:pPr>
+              <w:rPr>
+                <w:highlight w:val="green"/>
+              </w:rPr>
+            </w:pPr>
+            <w:r>
+              <w:rPr>
+                <w:b/>
+                <w:bCs/>
+                <w:highlight w:val="green"/>
               </w:rPr>
               <w:t>1.8</w:t>
             </w:r>
@@ -1649,20 +2014,37 @@
             <w:hideMark/>
           </w:tcPr>
           <w:p>
+            <w:pPr>
+              <w:rPr>
+                <w:highlight w:val="green"/>
+              </w:rPr>
+            </w:pPr>
             <w:proofErr w:type="spellStart"/>
             <w:r>
+              <w:rPr>
+                <w:highlight w:val="green"/>
+              </w:rPr>
               <w:t>Wrapper</w:t>
             </w:r>
             <w:proofErr w:type="spellEnd"/>
             <w:r>
+              <w:rPr>
+                <w:highlight w:val="green"/>
+              </w:rPr>
               <w:t xml:space="preserve"> </w:t>
             </w:r>
             <w:proofErr w:type="spellStart"/>
             <w:r>
+              <w:rPr>
+                <w:highlight w:val="green"/>
+              </w:rPr>
               <w:t>TypeScript</w:t>
             </w:r>
             <w:proofErr w:type="spellEnd"/>
             <w:r>
+              <w:rPr>
+                <w:highlight w:val="green"/>
+              </w:rPr>
               <w:t xml:space="preserve"> Decimali</w:t>
             </w:r>
           </w:p>
@@ -1686,10 +2068,16 @@
             <w:hideMark/>
           </w:tcPr>
           <w:p>
-            <w:r>
-              <w:rPr>
-                <w:b/>
-                <w:bCs/>
+            <w:pPr>
+              <w:rPr>
+                <w:highlight w:val="green"/>
+              </w:rPr>
+            </w:pPr>
+            <w:r>
+              <w:rPr>
+                <w:b/>
+                <w:bCs/>
+                <w:highlight w:val="green"/>
               </w:rPr>
               <w:t>Claude Sonnet 4.5</w:t>
             </w:r>
@@ -1714,7 +2102,15 @@
             <w:hideMark/>
           </w:tcPr>
           <w:p>
-            <w:r>
+            <w:pPr>
+              <w:rPr>
+                <w:highlight w:val="green"/>
+              </w:rPr>
+            </w:pPr>
+            <w:r>
+              <w:rPr>
+                <w:highlight w:val="green"/>
+              </w:rPr>
               <w:t>GPT-5.1-Codex</w:t>
             </w:r>
           </w:p>
@@ -1738,7 +2134,15 @@
             <w:hideMark/>
           </w:tcPr>
           <w:p>
-            <w:r>
+            <w:pPr>
+              <w:rPr>
+                <w:highlight w:val="green"/>
+              </w:rPr>
+            </w:pPr>
+            <w:r>
+              <w:rPr>
+                <w:highlight w:val="green"/>
+              </w:rPr>
               <w:t>1x/1x</w:t>
             </w:r>
           </w:p>
@@ -1765,20 +2169,28 @@
             <w:r>
               <w:rPr>
                 <w:rFonts w:ascii="Segoe UI Emoji" w:hAnsi="Segoe UI Emoji" w:cs="Segoe UI Emoji"/>
+                <w:highlight w:val="green"/>
               </w:rPr>
               <w:t>✅</w:t>
             </w:r>
             <w:r>
+              <w:rPr>
+                <w:highlight w:val="green"/>
+              </w:rPr>
               <w:t> </w:t>
             </w:r>
             <w:r>
               <w:rPr>
                 <w:b/>
                 <w:bCs/>
+                <w:highlight w:val="green"/>
               </w:rPr>
               <w:t>GPT-5 mini</w:t>
             </w:r>
             <w:r>
+              <w:rPr>
+                <w:highlight w:val="green"/>
+              </w:rPr>
               <w:t> (test 0.1+0.2=0.3)</w:t>
             </w:r>
           </w:p>
@@ -2116,10 +2528,16 @@
             <w:hideMark/>
           </w:tcPr>
           <w:p>
-            <w:r>
-              <w:rPr>
-                <w:b/>
-                <w:bCs/>
+            <w:pPr>
+              <w:rPr>
+                <w:highlight w:val="green"/>
+              </w:rPr>
+            </w:pPr>
+            <w:r>
+              <w:rPr>
+                <w:b/>
+                <w:bCs/>
+                <w:highlight w:val="green"/>
               </w:rPr>
               <w:t>2.1</w:t>
             </w:r>
@@ -2144,7 +2562,15 @@
             <w:hideMark/>
           </w:tcPr>
           <w:p>
-            <w:r>
+            <w:pPr>
+              <w:rPr>
+                <w:highlight w:val="green"/>
+              </w:rPr>
+            </w:pPr>
+            <w:r>
+              <w:rPr>
+                <w:highlight w:val="green"/>
+              </w:rPr>
               <w:t>Poetry + Dipendenze Complete</w:t>
             </w:r>
           </w:p>
@@ -2168,10 +2594,16 @@
             <w:hideMark/>
           </w:tcPr>
           <w:p>
-            <w:r>
-              <w:rPr>
-                <w:b/>
-                <w:bCs/>
+            <w:pPr>
+              <w:rPr>
+                <w:highlight w:val="green"/>
+              </w:rPr>
+            </w:pPr>
+            <w:r>
+              <w:rPr>
+                <w:b/>
+                <w:bCs/>
+                <w:highlight w:val="green"/>
               </w:rPr>
               <w:t>GPT-4o</w:t>
             </w:r>
@@ -2196,7 +2628,15 @@
             <w:hideMark/>
           </w:tcPr>
           <w:p>
-            <w:r>
+            <w:pPr>
+              <w:rPr>
+                <w:highlight w:val="green"/>
+              </w:rPr>
+            </w:pPr>
+            <w:r>
+              <w:rPr>
+                <w:highlight w:val="green"/>
+              </w:rPr>
               <w:t>GPT-5 mini</w:t>
             </w:r>
           </w:p>
@@ -2220,7 +2660,15 @@
             <w:hideMark/>
           </w:tcPr>
           <w:p>
-            <w:r>
+            <w:pPr>
+              <w:rPr>
+                <w:highlight w:val="green"/>
+              </w:rPr>
+            </w:pPr>
+            <w:r>
+              <w:rPr>
+                <w:highlight w:val="green"/>
+              </w:rPr>
               <w:t>0x/0x</w:t>
             </w:r>
           </w:p>
@@ -2244,13 +2692,22 @@
             <w:hideMark/>
           </w:tcPr>
           <w:p>
+            <w:pPr>
+              <w:rPr>
+                <w:highlight w:val="green"/>
+              </w:rPr>
+            </w:pPr>
             <w:r>
               <w:rPr>
                 <w:rFonts w:ascii="Segoe UI Emoji" w:hAnsi="Segoe UI Emoji" w:cs="Segoe UI Emoji"/>
+                <w:highlight w:val="green"/>
               </w:rPr>
               <w:t>❌</w:t>
             </w:r>
             <w:r>
+              <w:rPr>
+                <w:highlight w:val="green"/>
+              </w:rPr>
               <w:t xml:space="preserve"> Non necessario</w:t>
             </w:r>
           </w:p>
@@ -2279,10 +2736,16 @@
             <w:hideMark/>
           </w:tcPr>
           <w:p>
-            <w:r>
-              <w:rPr>
-                <w:b/>
-                <w:bCs/>
+            <w:pPr>
+              <w:rPr>
+                <w:highlight w:val="green"/>
+              </w:rPr>
+            </w:pPr>
+            <w:r>
+              <w:rPr>
+                <w:b/>
+                <w:bCs/>
+                <w:highlight w:val="green"/>
               </w:rPr>
               <w:t>2.2</w:t>
             </w:r>
@@ -2307,19 +2770,36 @@
             <w:hideMark/>
           </w:tcPr>
           <w:p>
-            <w:r>
+            <w:pPr>
+              <w:rPr>
+                <w:highlight w:val="green"/>
+              </w:rPr>
+            </w:pPr>
+            <w:r>
+              <w:rPr>
+                <w:highlight w:val="green"/>
+              </w:rPr>
               <w:t xml:space="preserve">Docker Compose </w:t>
             </w:r>
             <w:proofErr w:type="spellStart"/>
             <w:r>
+              <w:rPr>
+                <w:highlight w:val="green"/>
+              </w:rPr>
               <w:t>PostgreSQL</w:t>
             </w:r>
             <w:proofErr w:type="spellEnd"/>
             <w:r>
+              <w:rPr>
+                <w:highlight w:val="green"/>
+              </w:rPr>
               <w:t>/</w:t>
             </w:r>
             <w:proofErr w:type="spellStart"/>
             <w:r>
+              <w:rPr>
+                <w:highlight w:val="green"/>
+              </w:rPr>
               <w:t>Redis</w:t>
             </w:r>
             <w:proofErr w:type="spellEnd"/>
@@ -2344,10 +2824,16 @@
             <w:hideMark/>
           </w:tcPr>
           <w:p>
-            <w:r>
-              <w:rPr>
-                <w:b/>
-                <w:bCs/>
+            <w:pPr>
+              <w:rPr>
+                <w:highlight w:val="green"/>
+              </w:rPr>
+            </w:pPr>
+            <w:r>
+              <w:rPr>
+                <w:b/>
+                <w:bCs/>
+                <w:highlight w:val="green"/>
               </w:rPr>
               <w:t>DeepSeek-V3.2</w:t>
             </w:r>
@@ -2372,7 +2858,15 @@
             <w:hideMark/>
           </w:tcPr>
           <w:p>
-            <w:r>
+            <w:pPr>
+              <w:rPr>
+                <w:highlight w:val="green"/>
+              </w:rPr>
+            </w:pPr>
+            <w:r>
+              <w:rPr>
+                <w:highlight w:val="green"/>
+              </w:rPr>
               <w:t>GPT-4o</w:t>
             </w:r>
           </w:p>
@@ -2396,7 +2890,15 @@
             <w:hideMark/>
           </w:tcPr>
           <w:p>
-            <w:r>
+            <w:pPr>
+              <w:rPr>
+                <w:highlight w:val="green"/>
+              </w:rPr>
+            </w:pPr>
+            <w:r>
+              <w:rPr>
+                <w:highlight w:val="green"/>
+              </w:rPr>
               <w:t>1x/0x</w:t>
             </w:r>
           </w:p>
@@ -2420,39 +2922,64 @@
             <w:hideMark/>
           </w:tcPr>
           <w:p>
+            <w:pPr>
+              <w:rPr>
+                <w:highlight w:val="green"/>
+              </w:rPr>
+            </w:pPr>
             <w:r>
               <w:rPr>
                 <w:rFonts w:ascii="Segoe UI Emoji" w:hAnsi="Segoe UI Emoji" w:cs="Segoe UI Emoji"/>
+                <w:highlight w:val="green"/>
               </w:rPr>
               <w:t>✅</w:t>
             </w:r>
             <w:r>
+              <w:rPr>
+                <w:highlight w:val="green"/>
+              </w:rPr>
               <w:t> </w:t>
             </w:r>
             <w:r>
               <w:rPr>
                 <w:b/>
                 <w:bCs/>
+                <w:highlight w:val="green"/>
               </w:rPr>
               <w:t>GPT-5 mini</w:t>
             </w:r>
             <w:r>
+              <w:rPr>
+                <w:highlight w:val="green"/>
+              </w:rPr>
               <w:t> (</w:t>
             </w:r>
             <w:proofErr w:type="spellStart"/>
             <w:r>
+              <w:rPr>
+                <w:highlight w:val="green"/>
+              </w:rPr>
               <w:t>healthcheck</w:t>
             </w:r>
             <w:proofErr w:type="spellEnd"/>
             <w:r>
+              <w:rPr>
+                <w:highlight w:val="green"/>
+              </w:rPr>
               <w:t xml:space="preserve"> </w:t>
             </w:r>
             <w:proofErr w:type="spellStart"/>
             <w:r>
+              <w:rPr>
+                <w:highlight w:val="green"/>
+              </w:rPr>
               <w:t>syntax</w:t>
             </w:r>
             <w:proofErr w:type="spellEnd"/>
             <w:r>
+              <w:rPr>
+                <w:highlight w:val="green"/>
+              </w:rPr>
               <w:t>)</w:t>
             </w:r>
           </w:p>
@@ -2481,10 +3008,16 @@
             <w:hideMark/>
           </w:tcPr>
           <w:p>
-            <w:r>
-              <w:rPr>
-                <w:b/>
-                <w:bCs/>
+            <w:pPr>
+              <w:rPr>
+                <w:highlight w:val="green"/>
+              </w:rPr>
+            </w:pPr>
+            <w:r>
+              <w:rPr>
+                <w:b/>
+                <w:bCs/>
+                <w:highlight w:val="green"/>
               </w:rPr>
               <w:t>2.3</w:t>
             </w:r>
@@ -2509,15 +3042,29 @@
             <w:hideMark/>
           </w:tcPr>
           <w:p>
-            <w:r>
+            <w:pPr>
+              <w:rPr>
+                <w:highlight w:val="green"/>
+              </w:rPr>
+            </w:pPr>
+            <w:r>
+              <w:rPr>
+                <w:highlight w:val="green"/>
+              </w:rPr>
               <w:t xml:space="preserve">Modello Ticker + </w:t>
             </w:r>
             <w:proofErr w:type="spellStart"/>
             <w:r>
+              <w:rPr>
+                <w:highlight w:val="green"/>
+              </w:rPr>
               <w:t>SQLAlchemy</w:t>
             </w:r>
             <w:proofErr w:type="spellEnd"/>
             <w:r>
+              <w:rPr>
+                <w:highlight w:val="green"/>
+              </w:rPr>
               <w:t xml:space="preserve"> Base</w:t>
             </w:r>
           </w:p>
@@ -2541,10 +3088,16 @@
             <w:hideMark/>
           </w:tcPr>
           <w:p>
-            <w:r>
-              <w:rPr>
-                <w:b/>
-                <w:bCs/>
+            <w:pPr>
+              <w:rPr>
+                <w:highlight w:val="green"/>
+              </w:rPr>
+            </w:pPr>
+            <w:r>
+              <w:rPr>
+                <w:b/>
+                <w:bCs/>
+                <w:highlight w:val="green"/>
               </w:rPr>
               <w:t>Claude Sonnet 4.5</w:t>
             </w:r>
@@ -2569,7 +3122,15 @@
             <w:hideMark/>
           </w:tcPr>
           <w:p>
-            <w:r>
+            <w:pPr>
+              <w:rPr>
+                <w:highlight w:val="green"/>
+              </w:rPr>
+            </w:pPr>
+            <w:r>
+              <w:rPr>
+                <w:highlight w:val="green"/>
+              </w:rPr>
               <w:t>GPT-4o</w:t>
             </w:r>
           </w:p>
@@ -2593,7 +3154,15 @@
             <w:hideMark/>
           </w:tcPr>
           <w:p>
-            <w:r>
+            <w:pPr>
+              <w:rPr>
+                <w:highlight w:val="green"/>
+              </w:rPr>
+            </w:pPr>
+            <w:r>
+              <w:rPr>
+                <w:highlight w:val="green"/>
+              </w:rPr>
               <w:t>1x/0x</w:t>
             </w:r>
           </w:p>
@@ -2619,18 +3188,21 @@
           <w:p>
             <w:pPr>
               <w:rPr>
+                <w:highlight w:val="green"/>
                 <w:lang w:val="en-US"/>
               </w:rPr>
             </w:pPr>
             <w:r>
               <w:rPr>
                 <w:rFonts w:ascii="Segoe UI Emoji" w:hAnsi="Segoe UI Emoji" w:cs="Segoe UI Emoji"/>
+                <w:highlight w:val="green"/>
                 <w:lang w:val="en-US"/>
               </w:rPr>
               <w:t>✅</w:t>
             </w:r>
             <w:r>
               <w:rPr>
+                <w:highlight w:val="green"/>
                 <w:lang w:val="en-US"/>
               </w:rPr>
               <w:t> </w:t>
@@ -2639,12 +3211,14 @@
               <w:rPr>
                 <w:b/>
                 <w:bCs/>
+                <w:highlight w:val="green"/>
                 <w:lang w:val="en-US"/>
               </w:rPr>
               <w:t>GPT-5.1-Codex</w:t>
             </w:r>
             <w:r>
               <w:rPr>
+                <w:highlight w:val="green"/>
                 <w:lang w:val="en-US"/>
               </w:rPr>
               <w:t> (async engine test)</w:t>
@@ -2675,10 +3249,16 @@
             <w:hideMark/>
           </w:tcPr>
           <w:p>
-            <w:r>
-              <w:rPr>
-                <w:b/>
-                <w:bCs/>
+            <w:pPr>
+              <w:rPr>
+                <w:highlight w:val="green"/>
+              </w:rPr>
+            </w:pPr>
+            <w:r>
+              <w:rPr>
+                <w:b/>
+                <w:bCs/>
+                <w:highlight w:val="green"/>
               </w:rPr>
               <w:t>2.4</w:t>
             </w:r>
@@ -2703,7 +3283,15 @@
             <w:hideMark/>
           </w:tcPr>
           <w:p>
-            <w:r>
+            <w:pPr>
+              <w:rPr>
+                <w:highlight w:val="green"/>
+              </w:rPr>
+            </w:pPr>
+            <w:r>
+              <w:rPr>
+                <w:highlight w:val="green"/>
+              </w:rPr>
               <w:t>Modello Estimate</w:t>
             </w:r>
           </w:p>
@@ -2727,10 +3315,16 @@
             <w:hideMark/>
           </w:tcPr>
           <w:p>
-            <w:r>
-              <w:rPr>
-                <w:b/>
-                <w:bCs/>
+            <w:pPr>
+              <w:rPr>
+                <w:highlight w:val="green"/>
+              </w:rPr>
+            </w:pPr>
+            <w:r>
+              <w:rPr>
+                <w:b/>
+                <w:bCs/>
+                <w:highlight w:val="green"/>
               </w:rPr>
               <w:t>Claude Sonnet 4.5</w:t>
             </w:r>
@@ -2755,7 +3349,15 @@
             <w:hideMark/>
           </w:tcPr>
           <w:p>
-            <w:r>
+            <w:pPr>
+              <w:rPr>
+                <w:highlight w:val="green"/>
+              </w:rPr>
+            </w:pPr>
+            <w:r>
+              <w:rPr>
+                <w:highlight w:val="green"/>
+              </w:rPr>
               <w:t>GPT-5.2-Codex</w:t>
             </w:r>
           </w:p>
@@ -2779,7 +3381,15 @@
             <w:hideMark/>
           </w:tcPr>
           <w:p>
-            <w:r>
+            <w:pPr>
+              <w:rPr>
+                <w:highlight w:val="green"/>
+              </w:rPr>
+            </w:pPr>
+            <w:r>
+              <w:rPr>
+                <w:highlight w:val="green"/>
+              </w:rPr>
               <w:t>1x/1x</w:t>
             </w:r>
           </w:p>
@@ -2803,31 +3413,50 @@
             <w:hideMark/>
           </w:tcPr>
           <w:p>
+            <w:pPr>
+              <w:rPr>
+                <w:highlight w:val="green"/>
+              </w:rPr>
+            </w:pPr>
             <w:r>
               <w:rPr>
                 <w:rFonts w:ascii="Segoe UI Emoji" w:hAnsi="Segoe UI Emoji" w:cs="Segoe UI Emoji"/>
+                <w:highlight w:val="green"/>
               </w:rPr>
               <w:t>✅</w:t>
             </w:r>
             <w:r>
+              <w:rPr>
+                <w:highlight w:val="green"/>
+              </w:rPr>
               <w:t> </w:t>
             </w:r>
             <w:r>
               <w:rPr>
                 <w:b/>
                 <w:bCs/>
+                <w:highlight w:val="green"/>
               </w:rPr>
               <w:t>GPT-5 mini</w:t>
             </w:r>
             <w:r>
+              <w:rPr>
+                <w:highlight w:val="green"/>
+              </w:rPr>
               <w:t xml:space="preserve"> (DECIMAL </w:t>
             </w:r>
             <w:proofErr w:type="spellStart"/>
             <w:r>
+              <w:rPr>
+                <w:highlight w:val="green"/>
+              </w:rPr>
               <w:t>validation</w:t>
             </w:r>
             <w:proofErr w:type="spellEnd"/>
             <w:r>
+              <w:rPr>
+                <w:highlight w:val="green"/>
+              </w:rPr>
               <w:t>)</w:t>
             </w:r>
           </w:p>
@@ -2856,10 +3485,16 @@
             <w:hideMark/>
           </w:tcPr>
           <w:p>
-            <w:r>
-              <w:rPr>
-                <w:b/>
-                <w:bCs/>
+            <w:pPr>
+              <w:rPr>
+                <w:highlight w:val="green"/>
+              </w:rPr>
+            </w:pPr>
+            <w:r>
+              <w:rPr>
+                <w:b/>
+                <w:bCs/>
+                <w:highlight w:val="green"/>
               </w:rPr>
               <w:t>2.5</w:t>
             </w:r>
@@ -2884,12 +3519,23 @@
             <w:hideMark/>
           </w:tcPr>
           <w:p>
+            <w:pPr>
+              <w:rPr>
+                <w:highlight w:val="green"/>
+              </w:rPr>
+            </w:pPr>
             <w:proofErr w:type="spellStart"/>
             <w:r>
+              <w:rPr>
+                <w:highlight w:val="green"/>
+              </w:rPr>
               <w:t>EstimateEvent</w:t>
             </w:r>
             <w:proofErr w:type="spellEnd"/>
             <w:r>
+              <w:rPr>
+                <w:highlight w:val="green"/>
+              </w:rPr>
               <w:t xml:space="preserve"> (Event Sourcing)</w:t>
             </w:r>
           </w:p>
@@ -2913,10 +3559,16 @@
             <w:hideMark/>
           </w:tcPr>
           <w:p>
-            <w:r>
-              <w:rPr>
-                <w:b/>
-                <w:bCs/>
+            <w:pPr>
+              <w:rPr>
+                <w:highlight w:val="green"/>
+              </w:rPr>
+            </w:pPr>
+            <w:r>
+              <w:rPr>
+                <w:b/>
+                <w:bCs/>
+                <w:highlight w:val="green"/>
               </w:rPr>
               <w:t>Claude Sonnet 4.5</w:t>
             </w:r>
@@ -2941,7 +3593,15 @@
             <w:hideMark/>
           </w:tcPr>
           <w:p>
-            <w:r>
+            <w:pPr>
+              <w:rPr>
+                <w:highlight w:val="green"/>
+              </w:rPr>
+            </w:pPr>
+            <w:r>
+              <w:rPr>
+                <w:highlight w:val="green"/>
+              </w:rPr>
               <w:t>GPT-5.2-Codex</w:t>
             </w:r>
           </w:p>
@@ -2965,7 +3625,15 @@
             <w:hideMark/>
           </w:tcPr>
           <w:p>
-            <w:r>
+            <w:pPr>
+              <w:rPr>
+                <w:highlight w:val="green"/>
+              </w:rPr>
+            </w:pPr>
+            <w:r>
+              <w:rPr>
+                <w:highlight w:val="green"/>
+              </w:rPr>
               <w:t>1x/1x</w:t>
             </w:r>
           </w:p>
@@ -2991,18 +3659,21 @@
           <w:p>
             <w:pPr>
               <w:rPr>
+                <w:highlight w:val="green"/>
                 <w:lang w:val="en-US"/>
               </w:rPr>
             </w:pPr>
             <w:r>
               <w:rPr>
                 <w:rFonts w:ascii="Segoe UI Emoji" w:hAnsi="Segoe UI Emoji" w:cs="Segoe UI Emoji"/>
+                <w:highlight w:val="green"/>
                 <w:lang w:val="en-US"/>
               </w:rPr>
               <w:t>✅</w:t>
             </w:r>
             <w:r>
               <w:rPr>
+                <w:highlight w:val="green"/>
                 <w:lang w:val="en-US"/>
               </w:rPr>
               <w:t> </w:t>
@@ -3011,12 +3682,14 @@
               <w:rPr>
                 <w:b/>
                 <w:bCs/>
+                <w:highlight w:val="green"/>
                 <w:lang w:val="en-US"/>
               </w:rPr>
               <w:t>Grok Code Fast 1</w:t>
             </w:r>
             <w:r>
               <w:rPr>
+                <w:highlight w:val="green"/>
                 <w:lang w:val="en-US"/>
               </w:rPr>
               <w:t> (JSONB immutability)</w:t>
@@ -3047,10 +3720,16 @@
             <w:hideMark/>
           </w:tcPr>
           <w:p>
-            <w:r>
-              <w:rPr>
-                <w:b/>
-                <w:bCs/>
+            <w:pPr>
+              <w:rPr>
+                <w:highlight w:val="green"/>
+              </w:rPr>
+            </w:pPr>
+            <w:r>
+              <w:rPr>
+                <w:b/>
+                <w:bCs/>
+                <w:highlight w:val="green"/>
               </w:rPr>
               <w:t>2.6</w:t>
             </w:r>
@@ -3075,12 +3754,23 @@
             <w:hideMark/>
           </w:tcPr>
           <w:p>
+            <w:pPr>
+              <w:rPr>
+                <w:highlight w:val="green"/>
+              </w:rPr>
+            </w:pPr>
             <w:proofErr w:type="spellStart"/>
             <w:r>
+              <w:rPr>
+                <w:highlight w:val="green"/>
+              </w:rPr>
               <w:t>MarketData</w:t>
             </w:r>
             <w:proofErr w:type="spellEnd"/>
             <w:r>
+              <w:rPr>
+                <w:highlight w:val="green"/>
+              </w:rPr>
               <w:t xml:space="preserve"> (OHLCV)</w:t>
             </w:r>
           </w:p>
@@ -3104,10 +3794,16 @@
             <w:hideMark/>
           </w:tcPr>
           <w:p>
-            <w:r>
-              <w:rPr>
-                <w:b/>
-                <w:bCs/>
+            <w:pPr>
+              <w:rPr>
+                <w:highlight w:val="green"/>
+              </w:rPr>
+            </w:pPr>
+            <w:r>
+              <w:rPr>
+                <w:b/>
+                <w:bCs/>
+                <w:highlight w:val="green"/>
               </w:rPr>
               <w:t>Claude Sonnet 4.5</w:t>
             </w:r>
@@ -3132,7 +3828,15 @@
             <w:hideMark/>
           </w:tcPr>
           <w:p>
-            <w:r>
+            <w:pPr>
+              <w:rPr>
+                <w:highlight w:val="green"/>
+              </w:rPr>
+            </w:pPr>
+            <w:r>
+              <w:rPr>
+                <w:highlight w:val="green"/>
+              </w:rPr>
               <w:t>GPT-5.2-Codex</w:t>
             </w:r>
           </w:p>
@@ -3156,7 +3860,15 @@
             <w:hideMark/>
           </w:tcPr>
           <w:p>
-            <w:r>
+            <w:pPr>
+              <w:rPr>
+                <w:highlight w:val="green"/>
+              </w:rPr>
+            </w:pPr>
+            <w:r>
+              <w:rPr>
+                <w:highlight w:val="green"/>
+              </w:rPr>
               <w:t>1x/1x</w:t>
             </w:r>
           </w:p>
@@ -3180,23 +3892,36 @@
             <w:hideMark/>
           </w:tcPr>
           <w:p>
+            <w:pPr>
+              <w:rPr>
+                <w:highlight w:val="green"/>
+              </w:rPr>
+            </w:pPr>
             <w:r>
               <w:rPr>
                 <w:rFonts w:ascii="Segoe UI Emoji" w:hAnsi="Segoe UI Emoji" w:cs="Segoe UI Emoji"/>
+                <w:highlight w:val="green"/>
               </w:rPr>
               <w:t>✅</w:t>
             </w:r>
             <w:r>
+              <w:rPr>
+                <w:highlight w:val="green"/>
+              </w:rPr>
               <w:t> </w:t>
             </w:r>
             <w:r>
               <w:rPr>
                 <w:b/>
                 <w:bCs/>
+                <w:highlight w:val="green"/>
               </w:rPr>
               <w:t>GPT-5 mini</w:t>
             </w:r>
             <w:r>
+              <w:rPr>
+                <w:highlight w:val="green"/>
+              </w:rPr>
               <w:t> (PK composta test)</w:t>
             </w:r>
           </w:p>
@@ -3225,10 +3950,16 @@
             <w:hideMark/>
           </w:tcPr>
           <w:p>
-            <w:r>
-              <w:rPr>
-                <w:b/>
-                <w:bCs/>
+            <w:pPr>
+              <w:rPr>
+                <w:highlight w:val="green"/>
+              </w:rPr>
+            </w:pPr>
+            <w:r>
+              <w:rPr>
+                <w:b/>
+                <w:bCs/>
+                <w:highlight w:val="green"/>
               </w:rPr>
               <w:t>2.7</w:t>
             </w:r>
@@ -3253,7 +3984,15 @@
             <w:hideMark/>
           </w:tcPr>
           <w:p>
-            <w:r>
+            <w:pPr>
+              <w:rPr>
+                <w:highlight w:val="green"/>
+              </w:rPr>
+            </w:pPr>
+            <w:r>
+              <w:rPr>
+                <w:highlight w:val="green"/>
+              </w:rPr>
               <w:t>User &amp; Role (RBAC)</w:t>
             </w:r>
           </w:p>
@@ -3277,10 +4016,16 @@
             <w:hideMark/>
           </w:tcPr>
           <w:p>
-            <w:r>
-              <w:rPr>
-                <w:b/>
-                <w:bCs/>
+            <w:pPr>
+              <w:rPr>
+                <w:highlight w:val="green"/>
+              </w:rPr>
+            </w:pPr>
+            <w:r>
+              <w:rPr>
+                <w:b/>
+                <w:bCs/>
+                <w:highlight w:val="green"/>
               </w:rPr>
               <w:t>GPT-4o</w:t>
             </w:r>
@@ -3305,7 +4050,15 @@
             <w:hideMark/>
           </w:tcPr>
           <w:p>
-            <w:r>
+            <w:pPr>
+              <w:rPr>
+                <w:highlight w:val="green"/>
+              </w:rPr>
+            </w:pPr>
+            <w:r>
+              <w:rPr>
+                <w:highlight w:val="green"/>
+              </w:rPr>
               <w:t>GPT-5.1-Codex</w:t>
             </w:r>
           </w:p>
@@ -3329,7 +4082,15 @@
             <w:hideMark/>
           </w:tcPr>
           <w:p>
-            <w:r>
+            <w:pPr>
+              <w:rPr>
+                <w:highlight w:val="green"/>
+              </w:rPr>
+            </w:pPr>
+            <w:r>
+              <w:rPr>
+                <w:highlight w:val="green"/>
+              </w:rPr>
               <w:t>0x/1x</w:t>
             </w:r>
           </w:p>
@@ -3353,13 +4114,22 @@
             <w:hideMark/>
           </w:tcPr>
           <w:p>
+            <w:pPr>
+              <w:rPr>
+                <w:highlight w:val="green"/>
+              </w:rPr>
+            </w:pPr>
             <w:r>
               <w:rPr>
                 <w:rFonts w:ascii="Segoe UI Emoji" w:hAnsi="Segoe UI Emoji" w:cs="Segoe UI Emoji"/>
+                <w:highlight w:val="green"/>
               </w:rPr>
               <w:t>❌</w:t>
             </w:r>
             <w:r>
+              <w:rPr>
+                <w:highlight w:val="green"/>
+              </w:rPr>
               <w:t xml:space="preserve"> Non necessario</w:t>
             </w:r>
           </w:p>
@@ -3388,10 +4158,16 @@
             <w:hideMark/>
           </w:tcPr>
           <w:p>
-            <w:r>
-              <w:rPr>
-                <w:b/>
-                <w:bCs/>
+            <w:pPr>
+              <w:rPr>
+                <w:highlight w:val="green"/>
+              </w:rPr>
+            </w:pPr>
+            <w:r>
+              <w:rPr>
+                <w:b/>
+                <w:bCs/>
+                <w:highlight w:val="green"/>
               </w:rPr>
               <w:t>2.8</w:t>
             </w:r>
@@ -3416,8 +4192,16 @@
             <w:hideMark/>
           </w:tcPr>
           <w:p>
+            <w:pPr>
+              <w:rPr>
+                <w:highlight w:val="green"/>
+              </w:rPr>
+            </w:pPr>
             <w:proofErr w:type="spellStart"/>
             <w:r>
+              <w:rPr>
+                <w:highlight w:val="green"/>
+              </w:rPr>
               <w:t>SyncJob</w:t>
             </w:r>
             <w:proofErr w:type="spellEnd"/>
@@ -3442,10 +4226,16 @@
             <w:hideMark/>
           </w:tcPr>
           <w:p>
-            <w:r>
-              <w:rPr>
-                <w:b/>
-                <w:bCs/>
+            <w:pPr>
+              <w:rPr>
+                <w:highlight w:val="green"/>
+              </w:rPr>
+            </w:pPr>
+            <w:r>
+              <w:rPr>
+                <w:b/>
+                <w:bCs/>
+                <w:highlight w:val="green"/>
               </w:rPr>
               <w:t>GPT-4o</w:t>
             </w:r>
@@ -3470,7 +4260,15 @@
             <w:hideMark/>
           </w:tcPr>
           <w:p>
-            <w:r>
+            <w:pPr>
+              <w:rPr>
+                <w:highlight w:val="green"/>
+              </w:rPr>
+            </w:pPr>
+            <w:r>
+              <w:rPr>
+                <w:highlight w:val="green"/>
+              </w:rPr>
               <w:t>GPT-5 mini</w:t>
             </w:r>
           </w:p>
@@ -3494,7 +4292,15 @@
             <w:hideMark/>
           </w:tcPr>
           <w:p>
-            <w:r>
+            <w:pPr>
+              <w:rPr>
+                <w:highlight w:val="green"/>
+              </w:rPr>
+            </w:pPr>
+            <w:r>
+              <w:rPr>
+                <w:highlight w:val="green"/>
+              </w:rPr>
               <w:t>0x/0x</w:t>
             </w:r>
           </w:p>
@@ -3521,10 +4327,14 @@
             <w:r>
               <w:rPr>
                 <w:rFonts w:ascii="Segoe UI Emoji" w:hAnsi="Segoe UI Emoji" w:cs="Segoe UI Emoji"/>
+                <w:highlight w:val="green"/>
               </w:rPr>
               <w:t>❌</w:t>
             </w:r>
             <w:r>
+              <w:rPr>
+                <w:highlight w:val="green"/>
+              </w:rPr>
               <w:t xml:space="preserve"> Non necessario</w:t>
             </w:r>
           </w:p>
@@ -3553,10 +4363,16 @@
             <w:hideMark/>
           </w:tcPr>
           <w:p>
-            <w:r>
-              <w:rPr>
-                <w:b/>
-                <w:bCs/>
+            <w:pPr>
+              <w:rPr>
+                <w:highlight w:val="green"/>
+              </w:rPr>
+            </w:pPr>
+            <w:r>
+              <w:rPr>
+                <w:b/>
+                <w:bCs/>
+                <w:highlight w:val="green"/>
               </w:rPr>
               <w:lastRenderedPageBreak/>
               <w:t>2.9</w:t>
@@ -3582,8 +4398,16 @@
             <w:hideMark/>
           </w:tcPr>
           <w:p>
+            <w:pPr>
+              <w:rPr>
+                <w:highlight w:val="green"/>
+              </w:rPr>
+            </w:pPr>
             <w:proofErr w:type="spellStart"/>
             <w:r>
+              <w:rPr>
+                <w:highlight w:val="green"/>
+              </w:rPr>
               <w:t>AiModelRun</w:t>
             </w:r>
             <w:proofErr w:type="spellEnd"/>
@@ -3608,10 +4432,16 @@
             <w:hideMark/>
           </w:tcPr>
           <w:p>
-            <w:r>
-              <w:rPr>
-                <w:b/>
-                <w:bCs/>
+            <w:pPr>
+              <w:rPr>
+                <w:highlight w:val="green"/>
+              </w:rPr>
+            </w:pPr>
+            <w:r>
+              <w:rPr>
+                <w:b/>
+                <w:bCs/>
+                <w:highlight w:val="green"/>
               </w:rPr>
               <w:t>GPT-4o</w:t>
             </w:r>
@@ -3636,7 +4466,15 @@
             <w:hideMark/>
           </w:tcPr>
           <w:p>
-            <w:r>
+            <w:pPr>
+              <w:rPr>
+                <w:highlight w:val="green"/>
+              </w:rPr>
+            </w:pPr>
+            <w:r>
+              <w:rPr>
+                <w:highlight w:val="green"/>
+              </w:rPr>
               <w:t>GPT-5 mini</w:t>
             </w:r>
           </w:p>
@@ -3660,7 +4498,15 @@
             <w:hideMark/>
           </w:tcPr>
           <w:p>
-            <w:r>
+            <w:pPr>
+              <w:rPr>
+                <w:highlight w:val="green"/>
+              </w:rPr>
+            </w:pPr>
+            <w:r>
+              <w:rPr>
+                <w:highlight w:val="green"/>
+              </w:rPr>
               <w:t>0x/0x</w:t>
             </w:r>
           </w:p>
@@ -3684,13 +4530,22 @@
             <w:hideMark/>
           </w:tcPr>
           <w:p>
+            <w:pPr>
+              <w:rPr>
+                <w:highlight w:val="green"/>
+              </w:rPr>
+            </w:pPr>
             <w:r>
               <w:rPr>
                 <w:rFonts w:ascii="Segoe UI Emoji" w:hAnsi="Segoe UI Emoji" w:cs="Segoe UI Emoji"/>
+                <w:highlight w:val="green"/>
               </w:rPr>
               <w:t>❌</w:t>
             </w:r>
             <w:r>
+              <w:rPr>
+                <w:highlight w:val="green"/>
+              </w:rPr>
               <w:t xml:space="preserve"> Non necessario</w:t>
             </w:r>
           </w:p>
@@ -3719,10 +4574,16 @@
             <w:hideMark/>
           </w:tcPr>
           <w:p>
-            <w:r>
-              <w:rPr>
-                <w:b/>
-                <w:bCs/>
+            <w:pPr>
+              <w:rPr>
+                <w:highlight w:val="green"/>
+              </w:rPr>
+            </w:pPr>
+            <w:r>
+              <w:rPr>
+                <w:b/>
+                <w:bCs/>
+                <w:highlight w:val="green"/>
               </w:rPr>
               <w:t>2.10</w:t>
             </w:r>
@@ -3747,15 +4608,29 @@
             <w:hideMark/>
           </w:tcPr>
           <w:p>
-            <w:r>
+            <w:pPr>
+              <w:rPr>
+                <w:highlight w:val="green"/>
+              </w:rPr>
+            </w:pPr>
+            <w:r>
+              <w:rPr>
+                <w:highlight w:val="green"/>
+              </w:rPr>
               <w:t xml:space="preserve">Setup </w:t>
             </w:r>
             <w:proofErr w:type="spellStart"/>
             <w:r>
+              <w:rPr>
+                <w:highlight w:val="green"/>
+              </w:rPr>
               <w:t>Alembic</w:t>
             </w:r>
             <w:proofErr w:type="spellEnd"/>
             <w:r>
+              <w:rPr>
+                <w:highlight w:val="green"/>
+              </w:rPr>
               <w:t xml:space="preserve"> Migrazioni</w:t>
             </w:r>
           </w:p>
@@ -3779,10 +4654,16 @@
             <w:hideMark/>
           </w:tcPr>
           <w:p>
-            <w:r>
-              <w:rPr>
-                <w:b/>
-                <w:bCs/>
+            <w:pPr>
+              <w:rPr>
+                <w:highlight w:val="green"/>
+              </w:rPr>
+            </w:pPr>
+            <w:r>
+              <w:rPr>
+                <w:b/>
+                <w:bCs/>
+                <w:highlight w:val="green"/>
               </w:rPr>
               <w:t>GPT-4o</w:t>
             </w:r>
@@ -3807,7 +4688,15 @@
             <w:hideMark/>
           </w:tcPr>
           <w:p>
-            <w:r>
+            <w:pPr>
+              <w:rPr>
+                <w:highlight w:val="green"/>
+              </w:rPr>
+            </w:pPr>
+            <w:r>
+              <w:rPr>
+                <w:highlight w:val="green"/>
+              </w:rPr>
               <w:t>DeepSeek-V3.2</w:t>
             </w:r>
           </w:p>
@@ -3831,7 +4720,15 @@
             <w:hideMark/>
           </w:tcPr>
           <w:p>
-            <w:r>
+            <w:pPr>
+              <w:rPr>
+                <w:highlight w:val="green"/>
+              </w:rPr>
+            </w:pPr>
+            <w:r>
+              <w:rPr>
+                <w:highlight w:val="green"/>
+              </w:rPr>
               <w:t>0x/1x</w:t>
             </w:r>
           </w:p>
@@ -3863,12 +4760,14 @@
             <w:r>
               <w:rPr>
                 <w:rFonts w:ascii="Segoe UI Emoji" w:hAnsi="Segoe UI Emoji" w:cs="Segoe UI Emoji"/>
+                <w:highlight w:val="green"/>
                 <w:lang w:val="en-US"/>
               </w:rPr>
               <w:t>✅</w:t>
             </w:r>
             <w:r>
               <w:rPr>
+                <w:highlight w:val="green"/>
                 <w:lang w:val="en-US"/>
               </w:rPr>
               <w:t> </w:t>
@@ -3877,12 +4776,14 @@
               <w:rPr>
                 <w:b/>
                 <w:bCs/>
+                <w:highlight w:val="green"/>
                 <w:lang w:val="en-US"/>
               </w:rPr>
               <w:t>GPT-5 mini</w:t>
             </w:r>
             <w:r>
               <w:rPr>
+                <w:highlight w:val="green"/>
                 <w:lang w:val="en-US"/>
               </w:rPr>
               <w:t> (migration rollback test)</w:t>
@@ -3913,10 +4814,16 @@
             <w:hideMark/>
           </w:tcPr>
           <w:p>
-            <w:r>
-              <w:rPr>
-                <w:b/>
-                <w:bCs/>
+            <w:pPr>
+              <w:rPr>
+                <w:highlight w:val="green"/>
+              </w:rPr>
+            </w:pPr>
+            <w:r>
+              <w:rPr>
+                <w:b/>
+                <w:bCs/>
+                <w:highlight w:val="green"/>
               </w:rPr>
               <w:t>2.11</w:t>
             </w:r>
@@ -3941,12 +4848,23 @@
             <w:hideMark/>
           </w:tcPr>
           <w:p>
+            <w:pPr>
+              <w:rPr>
+                <w:highlight w:val="green"/>
+              </w:rPr>
+            </w:pPr>
             <w:proofErr w:type="spellStart"/>
             <w:r>
+              <w:rPr>
+                <w:highlight w:val="green"/>
+              </w:rPr>
               <w:t>Materialized</w:t>
             </w:r>
             <w:proofErr w:type="spellEnd"/>
             <w:r>
+              <w:rPr>
+                <w:highlight w:val="green"/>
+              </w:rPr>
               <w:t xml:space="preserve"> View (CQRS)</w:t>
             </w:r>
           </w:p>
@@ -3970,10 +4888,16 @@
             <w:hideMark/>
           </w:tcPr>
           <w:p>
-            <w:r>
-              <w:rPr>
-                <w:b/>
-                <w:bCs/>
+            <w:pPr>
+              <w:rPr>
+                <w:highlight w:val="green"/>
+              </w:rPr>
+            </w:pPr>
+            <w:r>
+              <w:rPr>
+                <w:b/>
+                <w:bCs/>
+                <w:highlight w:val="green"/>
               </w:rPr>
               <w:t>Claude Sonnet 4.5</w:t>
             </w:r>
@@ -3998,7 +4922,15 @@
             <w:hideMark/>
           </w:tcPr>
           <w:p>
-            <w:r>
+            <w:pPr>
+              <w:rPr>
+                <w:highlight w:val="green"/>
+              </w:rPr>
+            </w:pPr>
+            <w:r>
+              <w:rPr>
+                <w:highlight w:val="green"/>
+              </w:rPr>
               <w:t>GPT-4o</w:t>
             </w:r>
           </w:p>
@@ -4022,7 +4954,15 @@
             <w:hideMark/>
           </w:tcPr>
           <w:p>
-            <w:r>
+            <w:pPr>
+              <w:rPr>
+                <w:highlight w:val="green"/>
+              </w:rPr>
+            </w:pPr>
+            <w:r>
+              <w:rPr>
+                <w:highlight w:val="green"/>
+              </w:rPr>
               <w:t>1x/0x</w:t>
             </w:r>
           </w:p>
@@ -4048,18 +4988,21 @@
           <w:p>
             <w:pPr>
               <w:rPr>
+                <w:highlight w:val="green"/>
                 <w:lang w:val="en-US"/>
               </w:rPr>
             </w:pPr>
             <w:r>
               <w:rPr>
                 <w:rFonts w:ascii="Segoe UI Emoji" w:hAnsi="Segoe UI Emoji" w:cs="Segoe UI Emoji"/>
+                <w:highlight w:val="green"/>
                 <w:lang w:val="en-US"/>
               </w:rPr>
               <w:t>✅</w:t>
             </w:r>
             <w:r>
               <w:rPr>
+                <w:highlight w:val="green"/>
                 <w:lang w:val="en-US"/>
               </w:rPr>
               <w:t> </w:t>
@@ -4068,12 +5011,14 @@
               <w:rPr>
                 <w:b/>
                 <w:bCs/>
+                <w:highlight w:val="green"/>
                 <w:lang w:val="en-US"/>
               </w:rPr>
               <w:t>DeepSeek-V3.2</w:t>
             </w:r>
             <w:r>
               <w:rPr>
+                <w:highlight w:val="green"/>
                 <w:lang w:val="en-US"/>
               </w:rPr>
               <w:t> (REFRESH CONCURRENT perf)</w:t>
@@ -4731,7 +5676,21 @@
               <w:rPr>
                 <w:lang w:val="en-US"/>
               </w:rPr>
-              <w:t> (upsert N+1 check)</w:t>
+              <w:t> (</w:t>
+            </w:r>
+            <w:proofErr w:type="spellStart"/>
+            <w:r>
+              <w:rPr>
+                <w:lang w:val="en-US"/>
+              </w:rPr>
+              <w:t>upsert</w:t>
+            </w:r>
+            <w:proofErr w:type="spellEnd"/>
+            <w:r>
+              <w:rPr>
+                <w:lang w:val="en-US"/>
+              </w:rPr>
+              <w:t xml:space="preserve"> N+1 check)</w:t>
             </w:r>
           </w:p>
         </w:tc>
@@ -6485,7 +7444,21 @@
               <w:rPr>
                 <w:lang w:val="en-US"/>
               </w:rPr>
-              <w:t> (120+ col UTF-8 BOM)</w:t>
+              <w:t xml:space="preserve"> (120+ </w:t>
+            </w:r>
+            <w:proofErr w:type="gramStart"/>
+            <w:r>
+              <w:rPr>
+                <w:lang w:val="en-US"/>
+              </w:rPr>
+              <w:t>col</w:t>
+            </w:r>
+            <w:proofErr w:type="gramEnd"/>
+            <w:r>
+              <w:rPr>
+                <w:lang w:val="en-US"/>
+              </w:rPr>
+              <w:t xml:space="preserve"> UTF-8 BOM)</w:t>
             </w:r>
           </w:p>
         </w:tc>
@@ -9651,7 +10624,21 @@
               <w:rPr>
                 <w:lang w:val="en-US"/>
               </w:rPr>
-              <w:t> (O(1) perf test)</w:t>
+              <w:t> (</w:t>
+            </w:r>
+            <w:proofErr w:type="gramStart"/>
+            <w:r>
+              <w:rPr>
+                <w:lang w:val="en-US"/>
+              </w:rPr>
+              <w:t>O(</w:t>
+            </w:r>
+            <w:proofErr w:type="gramEnd"/>
+            <w:r>
+              <w:rPr>
+                <w:lang w:val="en-US"/>
+              </w:rPr>
+              <w:t>1) perf test)</w:t>
             </w:r>
           </w:p>
         </w:tc>
@@ -13089,7 +14076,21 @@
               <w:rPr>
                 <w:lang w:val="en-US"/>
               </w:rPr>
-              <w:t> (memoization perf)</w:t>
+              <w:t> (</w:t>
+            </w:r>
+            <w:proofErr w:type="spellStart"/>
+            <w:r>
+              <w:rPr>
+                <w:lang w:val="en-US"/>
+              </w:rPr>
+              <w:t>memoization</w:t>
+            </w:r>
+            <w:proofErr w:type="spellEnd"/>
+            <w:r>
+              <w:rPr>
+                <w:lang w:val="en-US"/>
+              </w:rPr>
+              <w:t xml:space="preserve"> perf)</w:t>
             </w:r>
           </w:p>
         </w:tc>

</xml_diff>

<commit_message>
feat: Introduce estimate entity, materialized view for summaries, and soft delete functionality.
</commit_message>
<xml_diff>
--- a/IA Model selection.docx
+++ b/IA Model selection.docx
@@ -2201,7 +2201,7 @@
       <w:r>
         <w:lastRenderedPageBreak/>
         <w:pict w14:anchorId="7FB1F6E5">
-          <v:rect id="_x0000_i1031" style="width:0;height:.75pt" o:hralign="center" o:hrstd="t" o:hr="t" fillcolor="#a0a0a0" stroked="f"/>
+          <v:rect id="_x0000_i1025" style="width:0;height:.75pt" o:hralign="center" o:hrstd="t" o:hr="t" fillcolor="#a0a0a0" stroked="f"/>
         </w:pict>
       </w:r>
     </w:p>
@@ -5044,7 +5044,7 @@
     </w:p>
     <w:tbl>
       <w:tblPr>
-        <w:tblW w:w="10800" w:type="dxa"/>
+        <w:tblW w:w="5000" w:type="pct"/>
         <w:tblCellSpacing w:w="15" w:type="dxa"/>
         <w:tblBorders>
           <w:top w:val="single" w:sz="6" w:space="0" w:color="auto"/>
@@ -5061,12 +5061,12 @@
         <w:tblLook w:val="04A0" w:firstRow="1" w:lastRow="0" w:firstColumn="1" w:lastColumn="0" w:noHBand="0" w:noVBand="1"/>
       </w:tblPr>
       <w:tblGrid>
-        <w:gridCol w:w="794"/>
-        <w:gridCol w:w="2695"/>
-        <w:gridCol w:w="1441"/>
-        <w:gridCol w:w="1875"/>
-        <w:gridCol w:w="1189"/>
-        <w:gridCol w:w="2806"/>
+        <w:gridCol w:w="793"/>
+        <w:gridCol w:w="2383"/>
+        <w:gridCol w:w="1268"/>
+        <w:gridCol w:w="1654"/>
+        <w:gridCol w:w="1046"/>
+        <w:gridCol w:w="2483"/>
       </w:tblGrid>
       <w:tr>
         <w:trPr>
@@ -5075,7 +5075,7 @@
         </w:trPr>
         <w:tc>
           <w:tcPr>
-            <w:tcW w:w="0" w:type="auto"/>
+            <w:tcW w:w="347" w:type="pct"/>
             <w:tcBorders>
               <w:top w:val="single" w:sz="2" w:space="0" w:color="auto"/>
               <w:left w:val="single" w:sz="2" w:space="0" w:color="auto"/>
@@ -5108,7 +5108,7 @@
         </w:tc>
         <w:tc>
           <w:tcPr>
-            <w:tcW w:w="0" w:type="auto"/>
+            <w:tcW w:w="1234" w:type="pct"/>
             <w:tcBorders>
               <w:top w:val="single" w:sz="2" w:space="0" w:color="auto"/>
               <w:left w:val="single" w:sz="2" w:space="0" w:color="auto"/>
@@ -5141,7 +5141,7 @@
         </w:tc>
         <w:tc>
           <w:tcPr>
-            <w:tcW w:w="0" w:type="auto"/>
+            <w:tcW w:w="653" w:type="pct"/>
             <w:tcBorders>
               <w:top w:val="single" w:sz="2" w:space="0" w:color="auto"/>
               <w:left w:val="single" w:sz="2" w:space="0" w:color="auto"/>
@@ -5182,7 +5182,7 @@
         </w:tc>
         <w:tc>
           <w:tcPr>
-            <w:tcW w:w="0" w:type="auto"/>
+            <w:tcW w:w="854" w:type="pct"/>
             <w:tcBorders>
               <w:top w:val="single" w:sz="2" w:space="0" w:color="auto"/>
               <w:left w:val="single" w:sz="2" w:space="0" w:color="auto"/>
@@ -5223,7 +5223,7 @@
         </w:tc>
         <w:tc>
           <w:tcPr>
-            <w:tcW w:w="0" w:type="auto"/>
+            <w:tcW w:w="537" w:type="pct"/>
             <w:tcBorders>
               <w:top w:val="single" w:sz="2" w:space="0" w:color="auto"/>
               <w:left w:val="single" w:sz="2" w:space="0" w:color="auto"/>
@@ -5264,7 +5264,7 @@
         </w:tc>
         <w:tc>
           <w:tcPr>
-            <w:tcW w:w="0" w:type="auto"/>
+            <w:tcW w:w="1278" w:type="pct"/>
             <w:tcBorders>
               <w:top w:val="single" w:sz="2" w:space="0" w:color="auto"/>
               <w:left w:val="single" w:sz="2" w:space="0" w:color="auto"/>
@@ -5310,27 +5310,33 @@
         </w:trPr>
         <w:tc>
           <w:tcPr>
-            <w:tcW w:w="0" w:type="auto"/>
-            <w:tcBorders>
-              <w:top w:val="single" w:sz="2" w:space="0" w:color="auto"/>
-              <w:left w:val="single" w:sz="2" w:space="0" w:color="auto"/>
-              <w:bottom w:val="single" w:sz="6" w:space="0" w:color="auto"/>
-              <w:right w:val="single" w:sz="6" w:space="0" w:color="auto"/>
-            </w:tcBorders>
-            <w:tcMar>
-              <w:top w:w="137" w:type="dxa"/>
-              <w:left w:w="120" w:type="dxa"/>
-              <w:bottom w:w="137" w:type="dxa"/>
-              <w:right w:w="120" w:type="dxa"/>
-            </w:tcMar>
-            <w:vAlign w:val="bottom"/>
-            <w:hideMark/>
-          </w:tcPr>
-          <w:p>
-            <w:r>
-              <w:rPr>
-                <w:b/>
-                <w:bCs/>
+            <w:tcW w:w="347" w:type="pct"/>
+            <w:tcBorders>
+              <w:top w:val="single" w:sz="2" w:space="0" w:color="auto"/>
+              <w:left w:val="single" w:sz="2" w:space="0" w:color="auto"/>
+              <w:bottom w:val="single" w:sz="6" w:space="0" w:color="auto"/>
+              <w:right w:val="single" w:sz="6" w:space="0" w:color="auto"/>
+            </w:tcBorders>
+            <w:tcMar>
+              <w:top w:w="137" w:type="dxa"/>
+              <w:left w:w="120" w:type="dxa"/>
+              <w:bottom w:w="137" w:type="dxa"/>
+              <w:right w:w="120" w:type="dxa"/>
+            </w:tcMar>
+            <w:vAlign w:val="bottom"/>
+            <w:hideMark/>
+          </w:tcPr>
+          <w:p>
+            <w:pPr>
+              <w:rPr>
+                <w:highlight w:val="green"/>
+              </w:rPr>
+            </w:pPr>
+            <w:r>
+              <w:rPr>
+                <w:b/>
+                <w:bCs/>
+                <w:highlight w:val="green"/>
               </w:rPr>
               <w:t>2.12</w:t>
             </w:r>
@@ -5338,51 +5344,65 @@
         </w:tc>
         <w:tc>
           <w:tcPr>
-            <w:tcW w:w="0" w:type="auto"/>
-            <w:tcBorders>
-              <w:top w:val="single" w:sz="2" w:space="0" w:color="auto"/>
-              <w:left w:val="single" w:sz="2" w:space="0" w:color="auto"/>
-              <w:bottom w:val="single" w:sz="6" w:space="0" w:color="auto"/>
-              <w:right w:val="single" w:sz="6" w:space="0" w:color="auto"/>
-            </w:tcBorders>
-            <w:tcMar>
-              <w:top w:w="137" w:type="dxa"/>
-              <w:left w:w="120" w:type="dxa"/>
-              <w:bottom w:w="137" w:type="dxa"/>
-              <w:right w:w="120" w:type="dxa"/>
-            </w:tcMar>
-            <w:vAlign w:val="bottom"/>
-            <w:hideMark/>
-          </w:tcPr>
-          <w:p>
-            <w:r>
+            <w:tcW w:w="1234" w:type="pct"/>
+            <w:tcBorders>
+              <w:top w:val="single" w:sz="2" w:space="0" w:color="auto"/>
+              <w:left w:val="single" w:sz="2" w:space="0" w:color="auto"/>
+              <w:bottom w:val="single" w:sz="6" w:space="0" w:color="auto"/>
+              <w:right w:val="single" w:sz="6" w:space="0" w:color="auto"/>
+            </w:tcBorders>
+            <w:tcMar>
+              <w:top w:w="137" w:type="dxa"/>
+              <w:left w:w="120" w:type="dxa"/>
+              <w:bottom w:w="137" w:type="dxa"/>
+              <w:right w:w="120" w:type="dxa"/>
+            </w:tcMar>
+            <w:vAlign w:val="bottom"/>
+            <w:hideMark/>
+          </w:tcPr>
+          <w:p>
+            <w:pPr>
+              <w:rPr>
+                <w:highlight w:val="green"/>
+              </w:rPr>
+            </w:pPr>
+            <w:r>
+              <w:rPr>
+                <w:highlight w:val="green"/>
+              </w:rPr>
               <w:t>Repository Estimate</w:t>
             </w:r>
           </w:p>
         </w:tc>
         <w:tc>
           <w:tcPr>
-            <w:tcW w:w="0" w:type="auto"/>
-            <w:tcBorders>
-              <w:top w:val="single" w:sz="2" w:space="0" w:color="auto"/>
-              <w:left w:val="single" w:sz="2" w:space="0" w:color="auto"/>
-              <w:bottom w:val="single" w:sz="6" w:space="0" w:color="auto"/>
-              <w:right w:val="single" w:sz="6" w:space="0" w:color="auto"/>
-            </w:tcBorders>
-            <w:tcMar>
-              <w:top w:w="137" w:type="dxa"/>
-              <w:left w:w="120" w:type="dxa"/>
-              <w:bottom w:w="137" w:type="dxa"/>
-              <w:right w:w="120" w:type="dxa"/>
-            </w:tcMar>
-            <w:vAlign w:val="bottom"/>
-            <w:hideMark/>
-          </w:tcPr>
-          <w:p>
-            <w:r>
-              <w:rPr>
-                <w:b/>
-                <w:bCs/>
+            <w:tcW w:w="653" w:type="pct"/>
+            <w:tcBorders>
+              <w:top w:val="single" w:sz="2" w:space="0" w:color="auto"/>
+              <w:left w:val="single" w:sz="2" w:space="0" w:color="auto"/>
+              <w:bottom w:val="single" w:sz="6" w:space="0" w:color="auto"/>
+              <w:right w:val="single" w:sz="6" w:space="0" w:color="auto"/>
+            </w:tcBorders>
+            <w:tcMar>
+              <w:top w:w="137" w:type="dxa"/>
+              <w:left w:w="120" w:type="dxa"/>
+              <w:bottom w:w="137" w:type="dxa"/>
+              <w:right w:w="120" w:type="dxa"/>
+            </w:tcMar>
+            <w:vAlign w:val="bottom"/>
+            <w:hideMark/>
+          </w:tcPr>
+          <w:p>
+            <w:pPr>
+              <w:rPr>
+                <w:highlight w:val="green"/>
+              </w:rPr>
+            </w:pPr>
+            <w:r>
+              <w:rPr>
+                <w:b/>
+                <w:bCs/>
+                <w:highlight w:val="green"/>
               </w:rPr>
               <w:t>Claude Sonnet 4.5</w:t>
             </w:r>
@@ -5390,85 +5410,104 @@
         </w:tc>
         <w:tc>
           <w:tcPr>
-            <w:tcW w:w="0" w:type="auto"/>
-            <w:tcBorders>
-              <w:top w:val="single" w:sz="2" w:space="0" w:color="auto"/>
-              <w:left w:val="single" w:sz="2" w:space="0" w:color="auto"/>
-              <w:bottom w:val="single" w:sz="6" w:space="0" w:color="auto"/>
-              <w:right w:val="single" w:sz="6" w:space="0" w:color="auto"/>
-            </w:tcBorders>
-            <w:tcMar>
-              <w:top w:w="137" w:type="dxa"/>
-              <w:left w:w="120" w:type="dxa"/>
-              <w:bottom w:w="137" w:type="dxa"/>
-              <w:right w:w="120" w:type="dxa"/>
-            </w:tcMar>
-            <w:vAlign w:val="bottom"/>
-            <w:hideMark/>
-          </w:tcPr>
-          <w:p>
-            <w:r>
+            <w:tcW w:w="854" w:type="pct"/>
+            <w:tcBorders>
+              <w:top w:val="single" w:sz="2" w:space="0" w:color="auto"/>
+              <w:left w:val="single" w:sz="2" w:space="0" w:color="auto"/>
+              <w:bottom w:val="single" w:sz="6" w:space="0" w:color="auto"/>
+              <w:right w:val="single" w:sz="6" w:space="0" w:color="auto"/>
+            </w:tcBorders>
+            <w:tcMar>
+              <w:top w:w="137" w:type="dxa"/>
+              <w:left w:w="120" w:type="dxa"/>
+              <w:bottom w:w="137" w:type="dxa"/>
+              <w:right w:w="120" w:type="dxa"/>
+            </w:tcMar>
+            <w:vAlign w:val="bottom"/>
+            <w:hideMark/>
+          </w:tcPr>
+          <w:p>
+            <w:pPr>
+              <w:rPr>
+                <w:highlight w:val="green"/>
+              </w:rPr>
+            </w:pPr>
+            <w:r>
+              <w:rPr>
+                <w:highlight w:val="green"/>
+              </w:rPr>
               <w:t>GPT-5.2-Codex</w:t>
             </w:r>
           </w:p>
         </w:tc>
         <w:tc>
           <w:tcPr>
-            <w:tcW w:w="0" w:type="auto"/>
-            <w:tcBorders>
-              <w:top w:val="single" w:sz="2" w:space="0" w:color="auto"/>
-              <w:left w:val="single" w:sz="2" w:space="0" w:color="auto"/>
-              <w:bottom w:val="single" w:sz="6" w:space="0" w:color="auto"/>
-              <w:right w:val="single" w:sz="6" w:space="0" w:color="auto"/>
-            </w:tcBorders>
-            <w:tcMar>
-              <w:top w:w="137" w:type="dxa"/>
-              <w:left w:w="120" w:type="dxa"/>
-              <w:bottom w:w="137" w:type="dxa"/>
-              <w:right w:w="120" w:type="dxa"/>
-            </w:tcMar>
-            <w:vAlign w:val="bottom"/>
-            <w:hideMark/>
-          </w:tcPr>
-          <w:p>
-            <w:r>
+            <w:tcW w:w="537" w:type="pct"/>
+            <w:tcBorders>
+              <w:top w:val="single" w:sz="2" w:space="0" w:color="auto"/>
+              <w:left w:val="single" w:sz="2" w:space="0" w:color="auto"/>
+              <w:bottom w:val="single" w:sz="6" w:space="0" w:color="auto"/>
+              <w:right w:val="single" w:sz="6" w:space="0" w:color="auto"/>
+            </w:tcBorders>
+            <w:tcMar>
+              <w:top w:w="137" w:type="dxa"/>
+              <w:left w:w="120" w:type="dxa"/>
+              <w:bottom w:w="137" w:type="dxa"/>
+              <w:right w:w="120" w:type="dxa"/>
+            </w:tcMar>
+            <w:vAlign w:val="bottom"/>
+            <w:hideMark/>
+          </w:tcPr>
+          <w:p>
+            <w:pPr>
+              <w:rPr>
+                <w:highlight w:val="green"/>
+              </w:rPr>
+            </w:pPr>
+            <w:r>
+              <w:rPr>
+                <w:highlight w:val="green"/>
+              </w:rPr>
               <w:t>1x/1x</w:t>
             </w:r>
           </w:p>
         </w:tc>
         <w:tc>
           <w:tcPr>
-            <w:tcW w:w="0" w:type="auto"/>
-            <w:tcBorders>
-              <w:top w:val="single" w:sz="2" w:space="0" w:color="auto"/>
-              <w:left w:val="single" w:sz="2" w:space="0" w:color="auto"/>
-              <w:bottom w:val="single" w:sz="6" w:space="0" w:color="auto"/>
-              <w:right w:val="single" w:sz="6" w:space="0" w:color="auto"/>
-            </w:tcBorders>
-            <w:tcMar>
-              <w:top w:w="137" w:type="dxa"/>
-              <w:left w:w="120" w:type="dxa"/>
-              <w:bottom w:w="137" w:type="dxa"/>
-              <w:right w:w="120" w:type="dxa"/>
-            </w:tcMar>
-            <w:vAlign w:val="bottom"/>
-            <w:hideMark/>
-          </w:tcPr>
-          <w:p>
-            <w:pPr>
-              <w:rPr>
+            <w:tcW w:w="1278" w:type="pct"/>
+            <w:tcBorders>
+              <w:top w:val="single" w:sz="2" w:space="0" w:color="auto"/>
+              <w:left w:val="single" w:sz="2" w:space="0" w:color="auto"/>
+              <w:bottom w:val="single" w:sz="6" w:space="0" w:color="auto"/>
+              <w:right w:val="single" w:sz="6" w:space="0" w:color="auto"/>
+            </w:tcBorders>
+            <w:tcMar>
+              <w:top w:w="137" w:type="dxa"/>
+              <w:left w:w="120" w:type="dxa"/>
+              <w:bottom w:w="137" w:type="dxa"/>
+              <w:right w:w="120" w:type="dxa"/>
+            </w:tcMar>
+            <w:vAlign w:val="bottom"/>
+            <w:hideMark/>
+          </w:tcPr>
+          <w:p>
+            <w:pPr>
+              <w:rPr>
+                <w:highlight w:val="green"/>
                 <w:lang w:val="en-US"/>
               </w:rPr>
             </w:pPr>
             <w:r>
               <w:rPr>
                 <w:rFonts w:ascii="Segoe UI Emoji" w:hAnsi="Segoe UI Emoji" w:cs="Segoe UI Emoji"/>
+                <w:highlight w:val="green"/>
                 <w:lang w:val="en-US"/>
               </w:rPr>
               <w:t>✅</w:t>
             </w:r>
             <w:r>
               <w:rPr>
+                <w:highlight w:val="green"/>
                 <w:lang w:val="en-US"/>
               </w:rPr>
               <w:t> </w:t>
@@ -5477,12 +5516,14 @@
               <w:rPr>
                 <w:b/>
                 <w:bCs/>
+                <w:highlight w:val="green"/>
                 <w:lang w:val="en-US"/>
               </w:rPr>
               <w:t>GPT-5 mini</w:t>
             </w:r>
             <w:r>
               <w:rPr>
+                <w:highlight w:val="green"/>
                 <w:lang w:val="en-US"/>
               </w:rPr>
               <w:t> (soft delete test)</w:t>
@@ -5496,7 +5537,7 @@
         </w:trPr>
         <w:tc>
           <w:tcPr>
-            <w:tcW w:w="0" w:type="auto"/>
+            <w:tcW w:w="347" w:type="pct"/>
             <w:tcBorders>
               <w:top w:val="single" w:sz="2" w:space="0" w:color="auto"/>
               <w:left w:val="single" w:sz="2" w:space="0" w:color="auto"/>
@@ -5524,7 +5565,7 @@
         </w:tc>
         <w:tc>
           <w:tcPr>
-            <w:tcW w:w="0" w:type="auto"/>
+            <w:tcW w:w="1234" w:type="pct"/>
             <w:tcBorders>
               <w:top w:val="single" w:sz="2" w:space="0" w:color="auto"/>
               <w:left w:val="single" w:sz="2" w:space="0" w:color="auto"/>
@@ -5553,7 +5594,7 @@
         </w:tc>
         <w:tc>
           <w:tcPr>
-            <w:tcW w:w="0" w:type="auto"/>
+            <w:tcW w:w="653" w:type="pct"/>
             <w:tcBorders>
               <w:top w:val="single" w:sz="2" w:space="0" w:color="auto"/>
               <w:left w:val="single" w:sz="2" w:space="0" w:color="auto"/>
@@ -5581,7 +5622,7 @@
         </w:tc>
         <w:tc>
           <w:tcPr>
-            <w:tcW w:w="0" w:type="auto"/>
+            <w:tcW w:w="854" w:type="pct"/>
             <w:tcBorders>
               <w:top w:val="single" w:sz="2" w:space="0" w:color="auto"/>
               <w:left w:val="single" w:sz="2" w:space="0" w:color="auto"/>
@@ -5605,7 +5646,7 @@
         </w:tc>
         <w:tc>
           <w:tcPr>
-            <w:tcW w:w="0" w:type="auto"/>
+            <w:tcW w:w="537" w:type="pct"/>
             <w:tcBorders>
               <w:top w:val="single" w:sz="2" w:space="0" w:color="auto"/>
               <w:left w:val="single" w:sz="2" w:space="0" w:color="auto"/>
@@ -5629,7 +5670,7 @@
         </w:tc>
         <w:tc>
           <w:tcPr>
-            <w:tcW w:w="0" w:type="auto"/>
+            <w:tcW w:w="1278" w:type="pct"/>
             <w:tcBorders>
               <w:top w:val="single" w:sz="2" w:space="0" w:color="auto"/>
               <w:left w:val="single" w:sz="2" w:space="0" w:color="auto"/>
@@ -5701,7 +5742,7 @@
         </w:trPr>
         <w:tc>
           <w:tcPr>
-            <w:tcW w:w="0" w:type="auto"/>
+            <w:tcW w:w="347" w:type="pct"/>
             <w:tcBorders>
               <w:top w:val="single" w:sz="2" w:space="0" w:color="auto"/>
               <w:left w:val="single" w:sz="2" w:space="0" w:color="auto"/>
@@ -5729,7 +5770,7 @@
         </w:tc>
         <w:tc>
           <w:tcPr>
-            <w:tcW w:w="0" w:type="auto"/>
+            <w:tcW w:w="1234" w:type="pct"/>
             <w:tcBorders>
               <w:top w:val="single" w:sz="2" w:space="0" w:color="auto"/>
               <w:left w:val="single" w:sz="2" w:space="0" w:color="auto"/>
@@ -5758,7 +5799,7 @@
         </w:tc>
         <w:tc>
           <w:tcPr>
-            <w:tcW w:w="0" w:type="auto"/>
+            <w:tcW w:w="653" w:type="pct"/>
             <w:tcBorders>
               <w:top w:val="single" w:sz="2" w:space="0" w:color="auto"/>
               <w:left w:val="single" w:sz="2" w:space="0" w:color="auto"/>
@@ -5786,7 +5827,7 @@
         </w:tc>
         <w:tc>
           <w:tcPr>
-            <w:tcW w:w="0" w:type="auto"/>
+            <w:tcW w:w="854" w:type="pct"/>
             <w:tcBorders>
               <w:top w:val="single" w:sz="2" w:space="0" w:color="auto"/>
               <w:left w:val="single" w:sz="2" w:space="0" w:color="auto"/>
@@ -5810,7 +5851,7 @@
         </w:tc>
         <w:tc>
           <w:tcPr>
-            <w:tcW w:w="0" w:type="auto"/>
+            <w:tcW w:w="537" w:type="pct"/>
             <w:tcBorders>
               <w:top w:val="single" w:sz="2" w:space="0" w:color="auto"/>
               <w:left w:val="single" w:sz="2" w:space="0" w:color="auto"/>
@@ -5834,7 +5875,7 @@
         </w:tc>
         <w:tc>
           <w:tcPr>
-            <w:tcW w:w="0" w:type="auto"/>
+            <w:tcW w:w="1278" w:type="pct"/>
             <w:tcBorders>
               <w:top w:val="single" w:sz="2" w:space="0" w:color="auto"/>
               <w:left w:val="single" w:sz="2" w:space="0" w:color="auto"/>
@@ -5892,7 +5933,7 @@
         </w:trPr>
         <w:tc>
           <w:tcPr>
-            <w:tcW w:w="0" w:type="auto"/>
+            <w:tcW w:w="347" w:type="pct"/>
             <w:tcBorders>
               <w:top w:val="single" w:sz="2" w:space="0" w:color="auto"/>
               <w:left w:val="single" w:sz="2" w:space="0" w:color="auto"/>
@@ -5920,7 +5961,7 @@
         </w:tc>
         <w:tc>
           <w:tcPr>
-            <w:tcW w:w="0" w:type="auto"/>
+            <w:tcW w:w="1234" w:type="pct"/>
             <w:tcBorders>
               <w:top w:val="single" w:sz="2" w:space="0" w:color="auto"/>
               <w:left w:val="single" w:sz="2" w:space="0" w:color="auto"/>
@@ -5949,7 +5990,7 @@
         </w:tc>
         <w:tc>
           <w:tcPr>
-            <w:tcW w:w="0" w:type="auto"/>
+            <w:tcW w:w="653" w:type="pct"/>
             <w:tcBorders>
               <w:top w:val="single" w:sz="2" w:space="0" w:color="auto"/>
               <w:left w:val="single" w:sz="2" w:space="0" w:color="auto"/>
@@ -5986,7 +6027,7 @@
         </w:tc>
         <w:tc>
           <w:tcPr>
-            <w:tcW w:w="0" w:type="auto"/>
+            <w:tcW w:w="854" w:type="pct"/>
             <w:tcBorders>
               <w:top w:val="single" w:sz="2" w:space="0" w:color="auto"/>
               <w:left w:val="single" w:sz="2" w:space="0" w:color="auto"/>
@@ -6010,7 +6051,7 @@
         </w:tc>
         <w:tc>
           <w:tcPr>
-            <w:tcW w:w="0" w:type="auto"/>
+            <w:tcW w:w="537" w:type="pct"/>
             <w:tcBorders>
               <w:top w:val="single" w:sz="2" w:space="0" w:color="auto"/>
               <w:left w:val="single" w:sz="2" w:space="0" w:color="auto"/>
@@ -6034,7 +6075,7 @@
         </w:tc>
         <w:tc>
           <w:tcPr>
-            <w:tcW w:w="0" w:type="auto"/>
+            <w:tcW w:w="1278" w:type="pct"/>
             <w:tcBorders>
               <w:top w:val="single" w:sz="2" w:space="0" w:color="auto"/>
               <w:left w:val="single" w:sz="2" w:space="0" w:color="auto"/>
@@ -6092,7 +6133,7 @@
         </w:trPr>
         <w:tc>
           <w:tcPr>
-            <w:tcW w:w="0" w:type="auto"/>
+            <w:tcW w:w="347" w:type="pct"/>
             <w:tcBorders>
               <w:top w:val="single" w:sz="2" w:space="0" w:color="auto"/>
               <w:left w:val="single" w:sz="2" w:space="0" w:color="auto"/>
@@ -6121,7 +6162,7 @@
         </w:tc>
         <w:tc>
           <w:tcPr>
-            <w:tcW w:w="0" w:type="auto"/>
+            <w:tcW w:w="1234" w:type="pct"/>
             <w:tcBorders>
               <w:top w:val="single" w:sz="2" w:space="0" w:color="auto"/>
               <w:left w:val="single" w:sz="2" w:space="0" w:color="auto"/>
@@ -6150,7 +6191,7 @@
         </w:tc>
         <w:tc>
           <w:tcPr>
-            <w:tcW w:w="0" w:type="auto"/>
+            <w:tcW w:w="653" w:type="pct"/>
             <w:tcBorders>
               <w:top w:val="single" w:sz="2" w:space="0" w:color="auto"/>
               <w:left w:val="single" w:sz="2" w:space="0" w:color="auto"/>
@@ -6178,7 +6219,7 @@
         </w:tc>
         <w:tc>
           <w:tcPr>
-            <w:tcW w:w="0" w:type="auto"/>
+            <w:tcW w:w="854" w:type="pct"/>
             <w:tcBorders>
               <w:top w:val="single" w:sz="2" w:space="0" w:color="auto"/>
               <w:left w:val="single" w:sz="2" w:space="0" w:color="auto"/>
@@ -6202,7 +6243,7 @@
         </w:tc>
         <w:tc>
           <w:tcPr>
-            <w:tcW w:w="0" w:type="auto"/>
+            <w:tcW w:w="537" w:type="pct"/>
             <w:tcBorders>
               <w:top w:val="single" w:sz="2" w:space="0" w:color="auto"/>
               <w:left w:val="single" w:sz="2" w:space="0" w:color="auto"/>
@@ -6226,7 +6267,7 @@
         </w:tc>
         <w:tc>
           <w:tcPr>
-            <w:tcW w:w="0" w:type="auto"/>
+            <w:tcW w:w="1278" w:type="pct"/>
             <w:tcBorders>
               <w:top w:val="single" w:sz="2" w:space="0" w:color="auto"/>
               <w:left w:val="single" w:sz="2" w:space="0" w:color="auto"/>
@@ -6261,7 +6302,7 @@
         </w:trPr>
         <w:tc>
           <w:tcPr>
-            <w:tcW w:w="0" w:type="auto"/>
+            <w:tcW w:w="347" w:type="pct"/>
             <w:tcBorders>
               <w:top w:val="single" w:sz="2" w:space="0" w:color="auto"/>
               <w:left w:val="single" w:sz="2" w:space="0" w:color="auto"/>
@@ -6289,7 +6330,7 @@
         </w:tc>
         <w:tc>
           <w:tcPr>
-            <w:tcW w:w="0" w:type="auto"/>
+            <w:tcW w:w="1234" w:type="pct"/>
             <w:tcBorders>
               <w:top w:val="single" w:sz="2" w:space="0" w:color="auto"/>
               <w:left w:val="single" w:sz="2" w:space="0" w:color="auto"/>
@@ -6313,7 +6354,7 @@
         </w:tc>
         <w:tc>
           <w:tcPr>
-            <w:tcW w:w="0" w:type="auto"/>
+            <w:tcW w:w="653" w:type="pct"/>
             <w:tcBorders>
               <w:top w:val="single" w:sz="2" w:space="0" w:color="auto"/>
               <w:left w:val="single" w:sz="2" w:space="0" w:color="auto"/>
@@ -6341,7 +6382,7 @@
         </w:tc>
         <w:tc>
           <w:tcPr>
-            <w:tcW w:w="0" w:type="auto"/>
+            <w:tcW w:w="854" w:type="pct"/>
             <w:tcBorders>
               <w:top w:val="single" w:sz="2" w:space="0" w:color="auto"/>
               <w:left w:val="single" w:sz="2" w:space="0" w:color="auto"/>
@@ -6365,7 +6406,7 @@
         </w:tc>
         <w:tc>
           <w:tcPr>
-            <w:tcW w:w="0" w:type="auto"/>
+            <w:tcW w:w="537" w:type="pct"/>
             <w:tcBorders>
               <w:top w:val="single" w:sz="2" w:space="0" w:color="auto"/>
               <w:left w:val="single" w:sz="2" w:space="0" w:color="auto"/>
@@ -6389,7 +6430,7 @@
         </w:tc>
         <w:tc>
           <w:tcPr>
-            <w:tcW w:w="0" w:type="auto"/>
+            <w:tcW w:w="1278" w:type="pct"/>
             <w:tcBorders>
               <w:top w:val="single" w:sz="2" w:space="0" w:color="auto"/>
               <w:left w:val="single" w:sz="2" w:space="0" w:color="auto"/>
@@ -6424,7 +6465,7 @@
         </w:trPr>
         <w:tc>
           <w:tcPr>
-            <w:tcW w:w="0" w:type="auto"/>
+            <w:tcW w:w="347" w:type="pct"/>
             <w:tcBorders>
               <w:top w:val="single" w:sz="2" w:space="0" w:color="auto"/>
               <w:left w:val="single" w:sz="2" w:space="0" w:color="auto"/>
@@ -6452,7 +6493,7 @@
         </w:tc>
         <w:tc>
           <w:tcPr>
-            <w:tcW w:w="0" w:type="auto"/>
+            <w:tcW w:w="1234" w:type="pct"/>
             <w:tcBorders>
               <w:top w:val="single" w:sz="2" w:space="0" w:color="auto"/>
               <w:left w:val="single" w:sz="2" w:space="0" w:color="auto"/>
@@ -6481,7 +6522,7 @@
         </w:tc>
         <w:tc>
           <w:tcPr>
-            <w:tcW w:w="0" w:type="auto"/>
+            <w:tcW w:w="653" w:type="pct"/>
             <w:tcBorders>
               <w:top w:val="single" w:sz="2" w:space="0" w:color="auto"/>
               <w:left w:val="single" w:sz="2" w:space="0" w:color="auto"/>
@@ -6509,7 +6550,7 @@
         </w:tc>
         <w:tc>
           <w:tcPr>
-            <w:tcW w:w="0" w:type="auto"/>
+            <w:tcW w:w="854" w:type="pct"/>
             <w:tcBorders>
               <w:top w:val="single" w:sz="2" w:space="0" w:color="auto"/>
               <w:left w:val="single" w:sz="2" w:space="0" w:color="auto"/>
@@ -6533,7 +6574,7 @@
         </w:tc>
         <w:tc>
           <w:tcPr>
-            <w:tcW w:w="0" w:type="auto"/>
+            <w:tcW w:w="537" w:type="pct"/>
             <w:tcBorders>
               <w:top w:val="single" w:sz="2" w:space="0" w:color="auto"/>
               <w:left w:val="single" w:sz="2" w:space="0" w:color="auto"/>
@@ -6557,7 +6598,7 @@
         </w:tc>
         <w:tc>
           <w:tcPr>
-            <w:tcW w:w="0" w:type="auto"/>
+            <w:tcW w:w="1278" w:type="pct"/>
             <w:tcBorders>
               <w:top w:val="single" w:sz="2" w:space="0" w:color="auto"/>
               <w:left w:val="single" w:sz="2" w:space="0" w:color="auto"/>
@@ -6610,7 +6651,7 @@
         </w:trPr>
         <w:tc>
           <w:tcPr>
-            <w:tcW w:w="0" w:type="auto"/>
+            <w:tcW w:w="347" w:type="pct"/>
             <w:tcBorders>
               <w:top w:val="single" w:sz="2" w:space="0" w:color="auto"/>
               <w:left w:val="single" w:sz="2" w:space="0" w:color="auto"/>
@@ -6638,7 +6679,7 @@
         </w:tc>
         <w:tc>
           <w:tcPr>
-            <w:tcW w:w="0" w:type="auto"/>
+            <w:tcW w:w="1234" w:type="pct"/>
             <w:tcBorders>
               <w:top w:val="single" w:sz="2" w:space="0" w:color="auto"/>
               <w:left w:val="single" w:sz="2" w:space="0" w:color="auto"/>
@@ -6662,7 +6703,7 @@
         </w:tc>
         <w:tc>
           <w:tcPr>
-            <w:tcW w:w="0" w:type="auto"/>
+            <w:tcW w:w="653" w:type="pct"/>
             <w:tcBorders>
               <w:top w:val="single" w:sz="2" w:space="0" w:color="auto"/>
               <w:left w:val="single" w:sz="2" w:space="0" w:color="auto"/>
@@ -6690,7 +6731,7 @@
         </w:tc>
         <w:tc>
           <w:tcPr>
-            <w:tcW w:w="0" w:type="auto"/>
+            <w:tcW w:w="854" w:type="pct"/>
             <w:tcBorders>
               <w:top w:val="single" w:sz="2" w:space="0" w:color="auto"/>
               <w:left w:val="single" w:sz="2" w:space="0" w:color="auto"/>
@@ -6714,7 +6755,7 @@
         </w:tc>
         <w:tc>
           <w:tcPr>
-            <w:tcW w:w="0" w:type="auto"/>
+            <w:tcW w:w="537" w:type="pct"/>
             <w:tcBorders>
               <w:top w:val="single" w:sz="2" w:space="0" w:color="auto"/>
               <w:left w:val="single" w:sz="2" w:space="0" w:color="auto"/>
@@ -6738,7 +6779,7 @@
         </w:tc>
         <w:tc>
           <w:tcPr>
-            <w:tcW w:w="0" w:type="auto"/>
+            <w:tcW w:w="1278" w:type="pct"/>
             <w:tcBorders>
               <w:top w:val="single" w:sz="2" w:space="0" w:color="auto"/>
               <w:left w:val="single" w:sz="2" w:space="0" w:color="auto"/>
@@ -8256,7 +8297,7 @@
     <w:p>
       <w:r>
         <w:pict w14:anchorId="69599C49">
-          <v:rect id="_x0000_i1032" style="width:0;height:.75pt" o:hralign="center" o:hrstd="t" o:hr="t" fillcolor="#a0a0a0" stroked="f"/>
+          <v:rect id="_x0000_i1026" style="width:0;height:.75pt" o:hralign="center" o:hrstd="t" o:hr="t" fillcolor="#a0a0a0" stroked="f"/>
         </w:pict>
       </w:r>
     </w:p>
@@ -10828,7 +10869,7 @@
     <w:p>
       <w:r>
         <w:pict w14:anchorId="2DCD8858">
-          <v:rect id="_x0000_i1033" style="width:0;height:.75pt" o:hralign="center" o:hrstd="t" o:hr="t" fillcolor="#a0a0a0" stroked="f"/>
+          <v:rect id="_x0000_i1027" style="width:0;height:.75pt" o:hralign="center" o:hrstd="t" o:hr="t" fillcolor="#a0a0a0" stroked="f"/>
         </w:pict>
       </w:r>
     </w:p>
@@ -15850,6 +15891,7 @@
   <w:style w:type="character" w:default="1" w:styleId="Carpredefinitoparagrafo">
     <w:name w:val="Default Paragraph Font"/>
     <w:uiPriority w:val="1"/>
+    <w:semiHidden/>
     <w:unhideWhenUsed/>
   </w:style>
   <w:style w:type="table" w:default="1" w:styleId="Tabellanormale">

</xml_diff>

<commit_message>
feat: Establish initial backend project setup, including comprehensive documentation and the market data module.
</commit_message>
<xml_diff>
--- a/IA Model selection.docx
+++ b/IA Model selection.docx
@@ -5554,10 +5554,16 @@
             <w:hideMark/>
           </w:tcPr>
           <w:p>
-            <w:r>
-              <w:rPr>
-                <w:b/>
-                <w:bCs/>
+            <w:pPr>
+              <w:rPr>
+                <w:highlight w:val="green"/>
+              </w:rPr>
+            </w:pPr>
+            <w:r>
+              <w:rPr>
+                <w:b/>
+                <w:bCs/>
+                <w:highlight w:val="green"/>
               </w:rPr>
               <w:t>2.13</w:t>
             </w:r>
@@ -5582,11 +5588,22 @@
             <w:hideMark/>
           </w:tcPr>
           <w:p>
-            <w:r>
+            <w:pPr>
+              <w:rPr>
+                <w:highlight w:val="green"/>
+              </w:rPr>
+            </w:pPr>
+            <w:r>
+              <w:rPr>
+                <w:highlight w:val="green"/>
+              </w:rPr>
               <w:t xml:space="preserve">Repository </w:t>
             </w:r>
             <w:proofErr w:type="spellStart"/>
             <w:r>
+              <w:rPr>
+                <w:highlight w:val="green"/>
+              </w:rPr>
               <w:t>MarketData</w:t>
             </w:r>
             <w:proofErr w:type="spellEnd"/>
@@ -5611,10 +5628,16 @@
             <w:hideMark/>
           </w:tcPr>
           <w:p>
-            <w:r>
-              <w:rPr>
-                <w:b/>
-                <w:bCs/>
+            <w:pPr>
+              <w:rPr>
+                <w:highlight w:val="green"/>
+              </w:rPr>
+            </w:pPr>
+            <w:r>
+              <w:rPr>
+                <w:b/>
+                <w:bCs/>
+                <w:highlight w:val="green"/>
               </w:rPr>
               <w:t>Claude Sonnet 4.5</w:t>
             </w:r>
@@ -5639,7 +5662,15 @@
             <w:hideMark/>
           </w:tcPr>
           <w:p>
-            <w:r>
+            <w:pPr>
+              <w:rPr>
+                <w:highlight w:val="green"/>
+              </w:rPr>
+            </w:pPr>
+            <w:r>
+              <w:rPr>
+                <w:highlight w:val="green"/>
+              </w:rPr>
               <w:t>GPT-5.2-Codex</w:t>
             </w:r>
           </w:p>
@@ -5663,7 +5694,15 @@
             <w:hideMark/>
           </w:tcPr>
           <w:p>
-            <w:r>
+            <w:pPr>
+              <w:rPr>
+                <w:highlight w:val="green"/>
+              </w:rPr>
+            </w:pPr>
+            <w:r>
+              <w:rPr>
+                <w:highlight w:val="green"/>
+              </w:rPr>
               <w:t>1x/1x</w:t>
             </w:r>
           </w:p>
@@ -5689,18 +5728,21 @@
           <w:p>
             <w:pPr>
               <w:rPr>
+                <w:highlight w:val="green"/>
                 <w:lang w:val="en-US"/>
               </w:rPr>
             </w:pPr>
             <w:r>
               <w:rPr>
                 <w:rFonts w:ascii="Segoe UI Emoji" w:hAnsi="Segoe UI Emoji" w:cs="Segoe UI Emoji"/>
+                <w:highlight w:val="green"/>
                 <w:lang w:val="en-US"/>
               </w:rPr>
               <w:t>✅</w:t>
             </w:r>
             <w:r>
               <w:rPr>
+                <w:highlight w:val="green"/>
                 <w:lang w:val="en-US"/>
               </w:rPr>
               <w:t> </w:t>
@@ -5709,12 +5751,14 @@
               <w:rPr>
                 <w:b/>
                 <w:bCs/>
+                <w:highlight w:val="green"/>
                 <w:lang w:val="en-US"/>
               </w:rPr>
               <w:t>Grok Code Fast 1</w:t>
             </w:r>
             <w:r>
               <w:rPr>
+                <w:highlight w:val="green"/>
                 <w:lang w:val="en-US"/>
               </w:rPr>
               <w:t> (</w:t>
@@ -5722,6 +5766,7 @@
             <w:proofErr w:type="spellStart"/>
             <w:r>
               <w:rPr>
+                <w:highlight w:val="green"/>
                 <w:lang w:val="en-US"/>
               </w:rPr>
               <w:t>upsert</w:t>
@@ -5729,6 +5774,7 @@
             <w:proofErr w:type="spellEnd"/>
             <w:r>
               <w:rPr>
+                <w:highlight w:val="green"/>
                 <w:lang w:val="en-US"/>
               </w:rPr>
               <w:t xml:space="preserve"> N+1 check)</w:t>

</xml_diff>

<commit_message>
feat: Add estimate history tracking and event sourcing support with new schemas, services, and repositories.
</commit_message>
<xml_diff>
--- a/IA Model selection.docx
+++ b/IA Model selection.docx
@@ -5805,10 +5805,16 @@
             <w:hideMark/>
           </w:tcPr>
           <w:p>
-            <w:r>
-              <w:rPr>
-                <w:b/>
-                <w:bCs/>
+            <w:pPr>
+              <w:rPr>
+                <w:highlight w:val="green"/>
+              </w:rPr>
+            </w:pPr>
+            <w:r>
+              <w:rPr>
+                <w:b/>
+                <w:bCs/>
+                <w:highlight w:val="green"/>
               </w:rPr>
               <w:t>2.14</w:t>
             </w:r>
@@ -5833,11 +5839,22 @@
             <w:hideMark/>
           </w:tcPr>
           <w:p>
-            <w:r>
+            <w:pPr>
+              <w:rPr>
+                <w:highlight w:val="green"/>
+              </w:rPr>
+            </w:pPr>
+            <w:r>
+              <w:rPr>
+                <w:highlight w:val="green"/>
+              </w:rPr>
               <w:t xml:space="preserve">Service </w:t>
             </w:r>
             <w:proofErr w:type="spellStart"/>
             <w:r>
+              <w:rPr>
+                <w:highlight w:val="green"/>
+              </w:rPr>
               <w:t>EstimateService</w:t>
             </w:r>
             <w:proofErr w:type="spellEnd"/>
@@ -5862,10 +5879,16 @@
             <w:hideMark/>
           </w:tcPr>
           <w:p>
-            <w:r>
-              <w:rPr>
-                <w:b/>
-                <w:bCs/>
+            <w:pPr>
+              <w:rPr>
+                <w:highlight w:val="green"/>
+              </w:rPr>
+            </w:pPr>
+            <w:r>
+              <w:rPr>
+                <w:b/>
+                <w:bCs/>
+                <w:highlight w:val="green"/>
               </w:rPr>
               <w:t>Claude Sonnet 4.5</w:t>
             </w:r>
@@ -5890,7 +5913,15 @@
             <w:hideMark/>
           </w:tcPr>
           <w:p>
-            <w:r>
+            <w:pPr>
+              <w:rPr>
+                <w:highlight w:val="green"/>
+              </w:rPr>
+            </w:pPr>
+            <w:r>
+              <w:rPr>
+                <w:highlight w:val="green"/>
+              </w:rPr>
               <w:t>GPT-4o</w:t>
             </w:r>
           </w:p>
@@ -5914,7 +5945,15 @@
             <w:hideMark/>
           </w:tcPr>
           <w:p>
-            <w:r>
+            <w:pPr>
+              <w:rPr>
+                <w:highlight w:val="green"/>
+              </w:rPr>
+            </w:pPr>
+            <w:r>
+              <w:rPr>
+                <w:highlight w:val="green"/>
+              </w:rPr>
               <w:t>1x/0x</w:t>
             </w:r>
           </w:p>
@@ -5940,18 +5979,21 @@
           <w:p>
             <w:pPr>
               <w:rPr>
+                <w:highlight w:val="green"/>
                 <w:lang w:val="en-US"/>
               </w:rPr>
             </w:pPr>
             <w:r>
               <w:rPr>
                 <w:rFonts w:ascii="Segoe UI Emoji" w:hAnsi="Segoe UI Emoji" w:cs="Segoe UI Emoji"/>
+                <w:highlight w:val="green"/>
                 <w:lang w:val="en-US"/>
               </w:rPr>
               <w:t>✅</w:t>
             </w:r>
             <w:r>
               <w:rPr>
+                <w:highlight w:val="green"/>
                 <w:lang w:val="en-US"/>
               </w:rPr>
               <w:t> </w:t>
@@ -5960,12 +6002,14 @@
               <w:rPr>
                 <w:b/>
                 <w:bCs/>
+                <w:highlight w:val="green"/>
                 <w:lang w:val="en-US"/>
               </w:rPr>
               <w:t>GPT-5.1-Codex</w:t>
             </w:r>
             <w:r>
               <w:rPr>
+                <w:highlight w:val="green"/>
                 <w:lang w:val="en-US"/>
               </w:rPr>
               <w:t> (event publishing test)</w:t>

</xml_diff>

<commit_message>
test: add EstimateHistoryService verification for event sourcing capabilities including state reconstruction, audit trails, and change tracking.
</commit_message>
<xml_diff>
--- a/IA Model selection.docx
+++ b/IA Model selection.docx
@@ -6040,10 +6040,16 @@
             <w:hideMark/>
           </w:tcPr>
           <w:p>
-            <w:r>
-              <w:rPr>
-                <w:b/>
-                <w:bCs/>
+            <w:pPr>
+              <w:rPr>
+                <w:highlight w:val="green"/>
+              </w:rPr>
+            </w:pPr>
+            <w:r>
+              <w:rPr>
+                <w:b/>
+                <w:bCs/>
+                <w:highlight w:val="green"/>
               </w:rPr>
               <w:t>2.15</w:t>
             </w:r>
@@ -6068,12 +6074,23 @@
             <w:hideMark/>
           </w:tcPr>
           <w:p>
+            <w:pPr>
+              <w:rPr>
+                <w:highlight w:val="green"/>
+              </w:rPr>
+            </w:pPr>
             <w:proofErr w:type="spellStart"/>
             <w:r>
+              <w:rPr>
+                <w:highlight w:val="green"/>
+              </w:rPr>
               <w:t>EstimateHistory</w:t>
             </w:r>
             <w:proofErr w:type="spellEnd"/>
             <w:r>
+              <w:rPr>
+                <w:highlight w:val="green"/>
+              </w:rPr>
               <w:t xml:space="preserve"> (Event Sourcing)</w:t>
             </w:r>
           </w:p>
@@ -6097,19 +6114,29 @@
             <w:hideMark/>
           </w:tcPr>
           <w:p>
-            <w:r>
-              <w:rPr>
-                <w:b/>
-                <w:bCs/>
+            <w:pPr>
+              <w:rPr>
+                <w:highlight w:val="green"/>
+              </w:rPr>
+            </w:pPr>
+            <w:r>
+              <w:rPr>
+                <w:b/>
+                <w:bCs/>
+                <w:highlight w:val="green"/>
               </w:rPr>
               <w:t>Claude Opus 4.5</w:t>
             </w:r>
             <w:r>
+              <w:rPr>
+                <w:highlight w:val="green"/>
+              </w:rPr>
               <w:t> </w:t>
             </w:r>
             <w:r>
               <w:rPr>
                 <w:rFonts w:ascii="Segoe UI Emoji" w:hAnsi="Segoe UI Emoji" w:cs="Segoe UI Emoji"/>
+                <w:highlight w:val="green"/>
               </w:rPr>
               <w:t>🔴</w:t>
             </w:r>
@@ -6134,7 +6161,15 @@
             <w:hideMark/>
           </w:tcPr>
           <w:p>
-            <w:r>
+            <w:pPr>
+              <w:rPr>
+                <w:highlight w:val="green"/>
+              </w:rPr>
+            </w:pPr>
+            <w:r>
+              <w:rPr>
+                <w:highlight w:val="green"/>
+              </w:rPr>
               <w:t>Claude Sonnet 4.5</w:t>
             </w:r>
           </w:p>
@@ -6158,7 +6193,15 @@
             <w:hideMark/>
           </w:tcPr>
           <w:p>
-            <w:r>
+            <w:pPr>
+              <w:rPr>
+                <w:highlight w:val="green"/>
+              </w:rPr>
+            </w:pPr>
+            <w:r>
+              <w:rPr>
+                <w:highlight w:val="green"/>
+              </w:rPr>
               <w:t>3x/1x</w:t>
             </w:r>
           </w:p>
@@ -6184,18 +6227,21 @@
           <w:p>
             <w:pPr>
               <w:rPr>
+                <w:highlight w:val="green"/>
                 <w:lang w:val="en-US"/>
               </w:rPr>
             </w:pPr>
             <w:r>
               <w:rPr>
                 <w:rFonts w:ascii="Segoe UI Emoji" w:hAnsi="Segoe UI Emoji" w:cs="Segoe UI Emoji"/>
+                <w:highlight w:val="green"/>
                 <w:lang w:val="en-US"/>
               </w:rPr>
               <w:t>✅</w:t>
             </w:r>
             <w:r>
               <w:rPr>
+                <w:highlight w:val="green"/>
                 <w:lang w:val="en-US"/>
               </w:rPr>
               <w:t> </w:t>
@@ -6204,12 +6250,14 @@
               <w:rPr>
                 <w:b/>
                 <w:bCs/>
+                <w:highlight w:val="green"/>
                 <w:lang w:val="en-US"/>
               </w:rPr>
               <w:t>DeepSeek-V3.2</w:t>
             </w:r>
             <w:r>
               <w:rPr>
+                <w:highlight w:val="green"/>
                 <w:lang w:val="en-US"/>
               </w:rPr>
               <w:t> (state reconstruction perf)</w:t>

</xml_diff>

<commit_message>
feat: implement Estimates API with CRUD operations, schemas, and tests.
</commit_message>
<xml_diff>
--- a/IA Model selection.docx
+++ b/IA Model selection.docx
@@ -6288,10 +6288,16 @@
             <w:hideMark/>
           </w:tcPr>
           <w:p>
-            <w:r>
-              <w:rPr>
-                <w:b/>
-                <w:bCs/>
+            <w:pPr>
+              <w:rPr>
+                <w:highlight w:val="green"/>
+              </w:rPr>
+            </w:pPr>
+            <w:r>
+              <w:rPr>
+                <w:b/>
+                <w:bCs/>
+                <w:highlight w:val="green"/>
               </w:rPr>
               <w:lastRenderedPageBreak/>
               <w:t>2.16</w:t>
@@ -6317,11 +6323,22 @@
             <w:hideMark/>
           </w:tcPr>
           <w:p>
-            <w:r>
+            <w:pPr>
+              <w:rPr>
+                <w:highlight w:val="green"/>
+              </w:rPr>
+            </w:pPr>
+            <w:r>
+              <w:rPr>
+                <w:highlight w:val="green"/>
+              </w:rPr>
               <w:t xml:space="preserve">API Router </w:t>
             </w:r>
             <w:proofErr w:type="spellStart"/>
             <w:r>
+              <w:rPr>
+                <w:highlight w:val="green"/>
+              </w:rPr>
               <w:t>Estimates</w:t>
             </w:r>
             <w:proofErr w:type="spellEnd"/>
@@ -6346,10 +6363,16 @@
             <w:hideMark/>
           </w:tcPr>
           <w:p>
-            <w:r>
-              <w:rPr>
-                <w:b/>
-                <w:bCs/>
+            <w:pPr>
+              <w:rPr>
+                <w:highlight w:val="green"/>
+              </w:rPr>
+            </w:pPr>
+            <w:r>
+              <w:rPr>
+                <w:b/>
+                <w:bCs/>
+                <w:highlight w:val="green"/>
               </w:rPr>
               <w:t>GPT-4o</w:t>
             </w:r>
@@ -6374,7 +6397,15 @@
             <w:hideMark/>
           </w:tcPr>
           <w:p>
-            <w:r>
+            <w:pPr>
+              <w:rPr>
+                <w:highlight w:val="green"/>
+              </w:rPr>
+            </w:pPr>
+            <w:r>
+              <w:rPr>
+                <w:highlight w:val="green"/>
+              </w:rPr>
               <w:t>GPT-5.1-Codex</w:t>
             </w:r>
           </w:p>
@@ -6398,7 +6429,15 @@
             <w:hideMark/>
           </w:tcPr>
           <w:p>
-            <w:r>
+            <w:pPr>
+              <w:rPr>
+                <w:highlight w:val="green"/>
+              </w:rPr>
+            </w:pPr>
+            <w:r>
+              <w:rPr>
+                <w:highlight w:val="green"/>
+              </w:rPr>
               <w:t>0x/1x</w:t>
             </w:r>
           </w:p>
@@ -6422,13 +6461,22 @@
             <w:hideMark/>
           </w:tcPr>
           <w:p>
+            <w:pPr>
+              <w:rPr>
+                <w:highlight w:val="green"/>
+              </w:rPr>
+            </w:pPr>
             <w:r>
               <w:rPr>
                 <w:rFonts w:ascii="Segoe UI Emoji" w:hAnsi="Segoe UI Emoji" w:cs="Segoe UI Emoji"/>
+                <w:highlight w:val="green"/>
               </w:rPr>
               <w:t>❌</w:t>
             </w:r>
             <w:r>
+              <w:rPr>
+                <w:highlight w:val="green"/>
+              </w:rPr>
               <w:t xml:space="preserve"> Non necessario</w:t>
             </w:r>
           </w:p>

</xml_diff>

<commit_message>
feat: Implement market data provider module with domain, services, Yahoo integration, and documentation.
</commit_message>
<xml_diff>
--- a/IA Model selection.docx
+++ b/IA Model selection.docx
@@ -6668,10 +6668,16 @@
             <w:hideMark/>
           </w:tcPr>
           <w:p>
-            <w:r>
-              <w:rPr>
-                <w:b/>
-                <w:bCs/>
+            <w:pPr>
+              <w:rPr>
+                <w:highlight w:val="green"/>
+              </w:rPr>
+            </w:pPr>
+            <w:r>
+              <w:rPr>
+                <w:b/>
+                <w:bCs/>
+                <w:highlight w:val="green"/>
               </w:rPr>
               <w:t>2.18</w:t>
             </w:r>
@@ -6696,12 +6702,23 @@
             <w:hideMark/>
           </w:tcPr>
           <w:p>
+            <w:pPr>
+              <w:rPr>
+                <w:highlight w:val="green"/>
+              </w:rPr>
+            </w:pPr>
             <w:proofErr w:type="spellStart"/>
             <w:r>
+              <w:rPr>
+                <w:highlight w:val="green"/>
+              </w:rPr>
               <w:t>MarketDataProvider</w:t>
             </w:r>
             <w:proofErr w:type="spellEnd"/>
             <w:r>
+              <w:rPr>
+                <w:highlight w:val="green"/>
+              </w:rPr>
               <w:t xml:space="preserve"> Astratto</w:t>
             </w:r>
           </w:p>
@@ -6725,10 +6742,16 @@
             <w:hideMark/>
           </w:tcPr>
           <w:p>
-            <w:r>
-              <w:rPr>
-                <w:b/>
-                <w:bCs/>
+            <w:pPr>
+              <w:rPr>
+                <w:highlight w:val="green"/>
+              </w:rPr>
+            </w:pPr>
+            <w:r>
+              <w:rPr>
+                <w:b/>
+                <w:bCs/>
+                <w:highlight w:val="green"/>
               </w:rPr>
               <w:t>Claude Sonnet 4.5</w:t>
             </w:r>
@@ -6753,7 +6776,15 @@
             <w:hideMark/>
           </w:tcPr>
           <w:p>
-            <w:r>
+            <w:pPr>
+              <w:rPr>
+                <w:highlight w:val="green"/>
+              </w:rPr>
+            </w:pPr>
+            <w:r>
+              <w:rPr>
+                <w:highlight w:val="green"/>
+              </w:rPr>
               <w:t>GPT-4o</w:t>
             </w:r>
           </w:p>
@@ -6777,7 +6808,15 @@
             <w:hideMark/>
           </w:tcPr>
           <w:p>
-            <w:r>
+            <w:pPr>
+              <w:rPr>
+                <w:highlight w:val="green"/>
+              </w:rPr>
+            </w:pPr>
+            <w:r>
+              <w:rPr>
+                <w:highlight w:val="green"/>
+              </w:rPr>
               <w:t>1x/0x</w:t>
             </w:r>
           </w:p>
@@ -6801,31 +6840,50 @@
             <w:hideMark/>
           </w:tcPr>
           <w:p>
+            <w:pPr>
+              <w:rPr>
+                <w:highlight w:val="green"/>
+              </w:rPr>
+            </w:pPr>
             <w:r>
               <w:rPr>
                 <w:rFonts w:ascii="Segoe UI Emoji" w:hAnsi="Segoe UI Emoji" w:cs="Segoe UI Emoji"/>
+                <w:highlight w:val="green"/>
               </w:rPr>
               <w:t>✅</w:t>
             </w:r>
             <w:r>
+              <w:rPr>
+                <w:highlight w:val="green"/>
+              </w:rPr>
               <w:t> </w:t>
             </w:r>
             <w:r>
               <w:rPr>
                 <w:b/>
                 <w:bCs/>
+                <w:highlight w:val="green"/>
               </w:rPr>
               <w:t>GPT-5.1-Codex</w:t>
             </w:r>
             <w:r>
+              <w:rPr>
+                <w:highlight w:val="green"/>
+              </w:rPr>
               <w:t> (</w:t>
             </w:r>
             <w:proofErr w:type="spellStart"/>
             <w:r>
+              <w:rPr>
+                <w:highlight w:val="green"/>
+              </w:rPr>
               <w:t>protocol</w:t>
             </w:r>
             <w:proofErr w:type="spellEnd"/>
             <w:r>
+              <w:rPr>
+                <w:highlight w:val="green"/>
+              </w:rPr>
               <w:t xml:space="preserve"> ABC test)</w:t>
             </w:r>
           </w:p>

</xml_diff>

<commit_message>
feat: Implement market data API routes for price, history, fundamentals, and search, alongside new tests and a task report.
</commit_message>
<xml_diff>
--- a/IA Model selection.docx
+++ b/IA Model selection.docx
@@ -6505,10 +6505,16 @@
             <w:hideMark/>
           </w:tcPr>
           <w:p>
-            <w:r>
-              <w:rPr>
-                <w:b/>
-                <w:bCs/>
+            <w:pPr>
+              <w:rPr>
+                <w:highlight w:val="green"/>
+              </w:rPr>
+            </w:pPr>
+            <w:r>
+              <w:rPr>
+                <w:b/>
+                <w:bCs/>
+                <w:highlight w:val="green"/>
               </w:rPr>
               <w:t>2.17</w:t>
             </w:r>
@@ -6533,7 +6539,15 @@
             <w:hideMark/>
           </w:tcPr>
           <w:p>
-            <w:r>
+            <w:pPr>
+              <w:rPr>
+                <w:highlight w:val="green"/>
+              </w:rPr>
+            </w:pPr>
+            <w:r>
+              <w:rPr>
+                <w:highlight w:val="green"/>
+              </w:rPr>
               <w:t>API Router Market Data</w:t>
             </w:r>
           </w:p>
@@ -6557,10 +6571,16 @@
             <w:hideMark/>
           </w:tcPr>
           <w:p>
-            <w:r>
-              <w:rPr>
-                <w:b/>
-                <w:bCs/>
+            <w:pPr>
+              <w:rPr>
+                <w:highlight w:val="green"/>
+              </w:rPr>
+            </w:pPr>
+            <w:r>
+              <w:rPr>
+                <w:b/>
+                <w:bCs/>
+                <w:highlight w:val="green"/>
               </w:rPr>
               <w:t>GPT-4o</w:t>
             </w:r>
@@ -6585,7 +6605,15 @@
             <w:hideMark/>
           </w:tcPr>
           <w:p>
-            <w:r>
+            <w:pPr>
+              <w:rPr>
+                <w:highlight w:val="green"/>
+              </w:rPr>
+            </w:pPr>
+            <w:r>
+              <w:rPr>
+                <w:highlight w:val="green"/>
+              </w:rPr>
               <w:t>GPT-5 mini</w:t>
             </w:r>
           </w:p>
@@ -6609,7 +6637,15 @@
             <w:hideMark/>
           </w:tcPr>
           <w:p>
-            <w:r>
+            <w:pPr>
+              <w:rPr>
+                <w:highlight w:val="green"/>
+              </w:rPr>
+            </w:pPr>
+            <w:r>
+              <w:rPr>
+                <w:highlight w:val="green"/>
+              </w:rPr>
               <w:t>0x/0x</w:t>
             </w:r>
           </w:p>
@@ -6633,13 +6669,22 @@
             <w:hideMark/>
           </w:tcPr>
           <w:p>
+            <w:pPr>
+              <w:rPr>
+                <w:highlight w:val="green"/>
+              </w:rPr>
+            </w:pPr>
             <w:r>
               <w:rPr>
                 <w:rFonts w:ascii="Segoe UI Emoji" w:hAnsi="Segoe UI Emoji" w:cs="Segoe UI Emoji"/>
+                <w:highlight w:val="green"/>
               </w:rPr>
               <w:t>❌</w:t>
             </w:r>
             <w:r>
+              <w:rPr>
+                <w:highlight w:val="green"/>
+              </w:rPr>
               <w:t xml:space="preserve"> Non necessario</w:t>
             </w:r>
           </w:p>
@@ -6912,10 +6957,16 @@
             <w:hideMark/>
           </w:tcPr>
           <w:p>
-            <w:r>
-              <w:rPr>
-                <w:b/>
-                <w:bCs/>
+            <w:pPr>
+              <w:rPr>
+                <w:highlight w:val="green"/>
+              </w:rPr>
+            </w:pPr>
+            <w:r>
+              <w:rPr>
+                <w:b/>
+                <w:bCs/>
+                <w:highlight w:val="green"/>
               </w:rPr>
               <w:t>2.19</w:t>
             </w:r>
@@ -6940,7 +6991,15 @@
             <w:hideMark/>
           </w:tcPr>
           <w:p>
-            <w:r>
+            <w:pPr>
+              <w:rPr>
+                <w:highlight w:val="green"/>
+              </w:rPr>
+            </w:pPr>
+            <w:r>
+              <w:rPr>
+                <w:highlight w:val="green"/>
+              </w:rPr>
               <w:t>Caching &amp; Backoff Provider</w:t>
             </w:r>
           </w:p>
@@ -6964,10 +7023,16 @@
             <w:hideMark/>
           </w:tcPr>
           <w:p>
-            <w:r>
-              <w:rPr>
-                <w:b/>
-                <w:bCs/>
+            <w:pPr>
+              <w:rPr>
+                <w:highlight w:val="green"/>
+              </w:rPr>
+            </w:pPr>
+            <w:r>
+              <w:rPr>
+                <w:b/>
+                <w:bCs/>
+                <w:highlight w:val="green"/>
               </w:rPr>
               <w:t>Claude Sonnet 4.5</w:t>
             </w:r>
@@ -6992,7 +7057,15 @@
             <w:hideMark/>
           </w:tcPr>
           <w:p>
-            <w:r>
+            <w:pPr>
+              <w:rPr>
+                <w:highlight w:val="green"/>
+              </w:rPr>
+            </w:pPr>
+            <w:r>
+              <w:rPr>
+                <w:highlight w:val="green"/>
+              </w:rPr>
               <w:t>GPT-5.2-Codex</w:t>
             </w:r>
           </w:p>
@@ -7016,7 +7089,15 @@
             <w:hideMark/>
           </w:tcPr>
           <w:p>
-            <w:r>
+            <w:pPr>
+              <w:rPr>
+                <w:highlight w:val="green"/>
+              </w:rPr>
+            </w:pPr>
+            <w:r>
+              <w:rPr>
+                <w:highlight w:val="green"/>
+              </w:rPr>
               <w:t>1x/1x</w:t>
             </w:r>
           </w:p>
@@ -7042,18 +7123,21 @@
           <w:p>
             <w:pPr>
               <w:rPr>
+                <w:highlight w:val="green"/>
                 <w:lang w:val="en-US"/>
               </w:rPr>
             </w:pPr>
             <w:r>
               <w:rPr>
                 <w:rFonts w:ascii="Segoe UI Emoji" w:hAnsi="Segoe UI Emoji" w:cs="Segoe UI Emoji"/>
+                <w:highlight w:val="green"/>
                 <w:lang w:val="en-US"/>
               </w:rPr>
               <w:t>✅</w:t>
             </w:r>
             <w:r>
               <w:rPr>
+                <w:highlight w:val="green"/>
                 <w:lang w:val="en-US"/>
               </w:rPr>
               <w:t> </w:t>
@@ -7062,12 +7146,14 @@
               <w:rPr>
                 <w:b/>
                 <w:bCs/>
+                <w:highlight w:val="green"/>
                 <w:lang w:val="en-US"/>
               </w:rPr>
               <w:t>DeepSeek-V3.2</w:t>
             </w:r>
             <w:r>
               <w:rPr>
+                <w:highlight w:val="green"/>
                 <w:lang w:val="en-US"/>
               </w:rPr>
               <w:t> (TTL + backoff logic)</w:t>

</xml_diff>

<commit_message>
feat: Implement bidirectional CSV parser for legacy TickerTracker estimate and history data, including models, tests, and documentation.
</commit_message>
<xml_diff>
--- a/IA Model selection.docx
+++ b/IA Model selection.docx
@@ -7471,10 +7471,16 @@
             <w:hideMark/>
           </w:tcPr>
           <w:p>
-            <w:r>
-              <w:rPr>
-                <w:b/>
-                <w:bCs/>
+            <w:pPr>
+              <w:rPr>
+                <w:highlight w:val="green"/>
+              </w:rPr>
+            </w:pPr>
+            <w:r>
+              <w:rPr>
+                <w:b/>
+                <w:bCs/>
+                <w:highlight w:val="green"/>
               </w:rPr>
               <w:t>2.20</w:t>
             </w:r>
@@ -7499,7 +7505,15 @@
             <w:hideMark/>
           </w:tcPr>
           <w:p>
-            <w:r>
+            <w:pPr>
+              <w:rPr>
+                <w:highlight w:val="green"/>
+              </w:rPr>
+            </w:pPr>
+            <w:r>
+              <w:rPr>
+                <w:highlight w:val="green"/>
+              </w:rPr>
               <w:t>Google Drive Client</w:t>
             </w:r>
           </w:p>
@@ -7523,10 +7537,16 @@
             <w:hideMark/>
           </w:tcPr>
           <w:p>
-            <w:r>
-              <w:rPr>
-                <w:b/>
-                <w:bCs/>
+            <w:pPr>
+              <w:rPr>
+                <w:highlight w:val="green"/>
+              </w:rPr>
+            </w:pPr>
+            <w:r>
+              <w:rPr>
+                <w:b/>
+                <w:bCs/>
+                <w:highlight w:val="green"/>
               </w:rPr>
               <w:t>GPT-4o</w:t>
             </w:r>
@@ -7551,7 +7571,15 @@
             <w:hideMark/>
           </w:tcPr>
           <w:p>
-            <w:r>
+            <w:pPr>
+              <w:rPr>
+                <w:highlight w:val="green"/>
+              </w:rPr>
+            </w:pPr>
+            <w:r>
+              <w:rPr>
+                <w:highlight w:val="green"/>
+              </w:rPr>
               <w:t>GPT-5.1-Codex</w:t>
             </w:r>
           </w:p>
@@ -7575,7 +7603,15 @@
             <w:hideMark/>
           </w:tcPr>
           <w:p>
-            <w:r>
+            <w:pPr>
+              <w:rPr>
+                <w:highlight w:val="green"/>
+              </w:rPr>
+            </w:pPr>
+            <w:r>
+              <w:rPr>
+                <w:highlight w:val="green"/>
+              </w:rPr>
               <w:t>0x/1x</w:t>
             </w:r>
           </w:p>
@@ -7601,18 +7637,21 @@
           <w:p>
             <w:pPr>
               <w:rPr>
+                <w:highlight w:val="green"/>
                 <w:lang w:val="en-US"/>
               </w:rPr>
             </w:pPr>
             <w:r>
               <w:rPr>
                 <w:rFonts w:ascii="Segoe UI Emoji" w:hAnsi="Segoe UI Emoji" w:cs="Segoe UI Emoji"/>
+                <w:highlight w:val="green"/>
                 <w:lang w:val="en-US"/>
               </w:rPr>
               <w:t>✅</w:t>
             </w:r>
             <w:r>
               <w:rPr>
+                <w:highlight w:val="green"/>
                 <w:lang w:val="en-US"/>
               </w:rPr>
               <w:t> </w:t>
@@ -7621,12 +7660,14 @@
               <w:rPr>
                 <w:b/>
                 <w:bCs/>
+                <w:highlight w:val="green"/>
                 <w:lang w:val="en-US"/>
               </w:rPr>
               <w:t>GPT-5 mini</w:t>
             </w:r>
             <w:r>
               <w:rPr>
+                <w:highlight w:val="green"/>
                 <w:lang w:val="en-US"/>
               </w:rPr>
               <w:t> (auth service account test)</w:t>
@@ -7657,10 +7698,16 @@
             <w:hideMark/>
           </w:tcPr>
           <w:p>
-            <w:r>
-              <w:rPr>
-                <w:b/>
-                <w:bCs/>
+            <w:pPr>
+              <w:rPr>
+                <w:highlight w:val="green"/>
+              </w:rPr>
+            </w:pPr>
+            <w:r>
+              <w:rPr>
+                <w:b/>
+                <w:bCs/>
+                <w:highlight w:val="green"/>
               </w:rPr>
               <w:t>2.21</w:t>
             </w:r>
@@ -7685,7 +7732,15 @@
             <w:hideMark/>
           </w:tcPr>
           <w:p>
-            <w:r>
+            <w:pPr>
+              <w:rPr>
+                <w:highlight w:val="green"/>
+              </w:rPr>
+            </w:pPr>
+            <w:r>
+              <w:rPr>
+                <w:highlight w:val="green"/>
+              </w:rPr>
               <w:t>CSV Parser Legacy</w:t>
             </w:r>
           </w:p>
@@ -7709,10 +7764,16 @@
             <w:hideMark/>
           </w:tcPr>
           <w:p>
-            <w:r>
-              <w:rPr>
-                <w:b/>
-                <w:bCs/>
+            <w:pPr>
+              <w:rPr>
+                <w:highlight w:val="green"/>
+              </w:rPr>
+            </w:pPr>
+            <w:r>
+              <w:rPr>
+                <w:b/>
+                <w:bCs/>
+                <w:highlight w:val="green"/>
               </w:rPr>
               <w:t>Claude Sonnet 4.5</w:t>
             </w:r>
@@ -7737,7 +7798,15 @@
             <w:hideMark/>
           </w:tcPr>
           <w:p>
-            <w:r>
+            <w:pPr>
+              <w:rPr>
+                <w:highlight w:val="green"/>
+              </w:rPr>
+            </w:pPr>
+            <w:r>
+              <w:rPr>
+                <w:highlight w:val="green"/>
+              </w:rPr>
               <w:t>GPT-5.2-Codex</w:t>
             </w:r>
           </w:p>
@@ -7761,7 +7830,15 @@
             <w:hideMark/>
           </w:tcPr>
           <w:p>
-            <w:r>
+            <w:pPr>
+              <w:rPr>
+                <w:highlight w:val="green"/>
+              </w:rPr>
+            </w:pPr>
+            <w:r>
+              <w:rPr>
+                <w:highlight w:val="green"/>
+              </w:rPr>
               <w:t>1x/1x</w:t>
             </w:r>
           </w:p>
@@ -7787,18 +7864,21 @@
           <w:p>
             <w:pPr>
               <w:rPr>
+                <w:highlight w:val="green"/>
                 <w:lang w:val="en-US"/>
               </w:rPr>
             </w:pPr>
             <w:r>
               <w:rPr>
                 <w:rFonts w:ascii="Segoe UI Emoji" w:hAnsi="Segoe UI Emoji" w:cs="Segoe UI Emoji"/>
+                <w:highlight w:val="green"/>
                 <w:lang w:val="en-US"/>
               </w:rPr>
               <w:t>✅</w:t>
             </w:r>
             <w:r>
               <w:rPr>
+                <w:highlight w:val="green"/>
                 <w:lang w:val="en-US"/>
               </w:rPr>
               <w:t> </w:t>
@@ -7807,12 +7887,14 @@
               <w:rPr>
                 <w:b/>
                 <w:bCs/>
+                <w:highlight w:val="green"/>
                 <w:lang w:val="en-US"/>
               </w:rPr>
               <w:t>DeepSeek-V3.2</w:t>
             </w:r>
             <w:r>
               <w:rPr>
+                <w:highlight w:val="green"/>
                 <w:lang w:val="en-US"/>
               </w:rPr>
               <w:t xml:space="preserve"> (120+ </w:t>
@@ -7820,6 +7902,7 @@
             <w:proofErr w:type="gramStart"/>
             <w:r>
               <w:rPr>
+                <w:highlight w:val="green"/>
                 <w:lang w:val="en-US"/>
               </w:rPr>
               <w:t>col</w:t>
@@ -7827,6 +7910,7 @@
             <w:proofErr w:type="gramEnd"/>
             <w:r>
               <w:rPr>
+                <w:highlight w:val="green"/>
                 <w:lang w:val="en-US"/>
               </w:rPr>
               <w:t xml:space="preserve"> UTF-8 BOM)</w:t>

</xml_diff>

<commit_message>
test: Add new legacy CSV and JSON fixtures for historical data.
</commit_message>
<xml_diff>
--- a/IA Model selection.docx
+++ b/IA Model selection.docx
@@ -7941,10 +7941,16 @@
             <w:hideMark/>
           </w:tcPr>
           <w:p>
-            <w:r>
-              <w:rPr>
-                <w:b/>
-                <w:bCs/>
+            <w:pPr>
+              <w:rPr>
+                <w:highlight w:val="green"/>
+              </w:rPr>
+            </w:pPr>
+            <w:r>
+              <w:rPr>
+                <w:b/>
+                <w:bCs/>
+                <w:highlight w:val="green"/>
               </w:rPr>
               <w:t>2.22</w:t>
             </w:r>
@@ -7969,12 +7975,23 @@
             <w:hideMark/>
           </w:tcPr>
           <w:p>
+            <w:pPr>
+              <w:rPr>
+                <w:highlight w:val="green"/>
+              </w:rPr>
+            </w:pPr>
             <w:proofErr w:type="spellStart"/>
             <w:r>
+              <w:rPr>
+                <w:highlight w:val="green"/>
+              </w:rPr>
               <w:t>Sync</w:t>
             </w:r>
             <w:proofErr w:type="spellEnd"/>
             <w:r>
+              <w:rPr>
+                <w:highlight w:val="green"/>
+              </w:rPr>
               <w:t xml:space="preserve"> Service</w:t>
             </w:r>
           </w:p>
@@ -7998,19 +8015,29 @@
             <w:hideMark/>
           </w:tcPr>
           <w:p>
-            <w:r>
-              <w:rPr>
-                <w:b/>
-                <w:bCs/>
+            <w:pPr>
+              <w:rPr>
+                <w:highlight w:val="green"/>
+              </w:rPr>
+            </w:pPr>
+            <w:r>
+              <w:rPr>
+                <w:b/>
+                <w:bCs/>
+                <w:highlight w:val="green"/>
               </w:rPr>
               <w:t>Claude Opus 4.5</w:t>
             </w:r>
             <w:r>
+              <w:rPr>
+                <w:highlight w:val="green"/>
+              </w:rPr>
               <w:t> </w:t>
             </w:r>
             <w:r>
               <w:rPr>
                 <w:rFonts w:ascii="Segoe UI Emoji" w:hAnsi="Segoe UI Emoji" w:cs="Segoe UI Emoji"/>
+                <w:highlight w:val="green"/>
               </w:rPr>
               <w:t>🔴</w:t>
             </w:r>
@@ -8035,7 +8062,15 @@
             <w:hideMark/>
           </w:tcPr>
           <w:p>
-            <w:r>
+            <w:pPr>
+              <w:rPr>
+                <w:highlight w:val="green"/>
+              </w:rPr>
+            </w:pPr>
+            <w:r>
+              <w:rPr>
+                <w:highlight w:val="green"/>
+              </w:rPr>
               <w:t>Claude Sonnet 4.5</w:t>
             </w:r>
           </w:p>
@@ -8059,7 +8094,15 @@
             <w:hideMark/>
           </w:tcPr>
           <w:p>
-            <w:r>
+            <w:pPr>
+              <w:rPr>
+                <w:highlight w:val="green"/>
+              </w:rPr>
+            </w:pPr>
+            <w:r>
+              <w:rPr>
+                <w:highlight w:val="green"/>
+              </w:rPr>
               <w:t>3x/1x</w:t>
             </w:r>
           </w:p>
@@ -8085,18 +8128,21 @@
           <w:p>
             <w:pPr>
               <w:rPr>
+                <w:highlight w:val="green"/>
                 <w:lang w:val="en-US"/>
               </w:rPr>
             </w:pPr>
             <w:r>
               <w:rPr>
                 <w:rFonts w:ascii="Segoe UI Emoji" w:hAnsi="Segoe UI Emoji" w:cs="Segoe UI Emoji"/>
+                <w:highlight w:val="green"/>
                 <w:lang w:val="en-US"/>
               </w:rPr>
               <w:t>✅</w:t>
             </w:r>
             <w:r>
               <w:rPr>
+                <w:highlight w:val="green"/>
                 <w:lang w:val="en-US"/>
               </w:rPr>
               <w:t> </w:t>
@@ -8105,12 +8151,14 @@
               <w:rPr>
                 <w:b/>
                 <w:bCs/>
+                <w:highlight w:val="green"/>
                 <w:lang w:val="en-US"/>
               </w:rPr>
               <w:t>GPT-5.1-Codex</w:t>
             </w:r>
             <w:r>
               <w:rPr>
+                <w:highlight w:val="green"/>
                 <w:lang w:val="en-US"/>
               </w:rPr>
               <w:t> (conflict resolution test)</w:t>

</xml_diff>

<commit_message>
feat: Add legacy CSV and JSON parsers, a synchronization service, and associated tests and fixtures.
</commit_message>
<xml_diff>
--- a/IA Model selection.docx
+++ b/IA Model selection.docx
@@ -8189,10 +8189,16 @@
             <w:hideMark/>
           </w:tcPr>
           <w:p>
-            <w:r>
-              <w:rPr>
-                <w:b/>
-                <w:bCs/>
+            <w:pPr>
+              <w:rPr>
+                <w:highlight w:val="green"/>
+              </w:rPr>
+            </w:pPr>
+            <w:r>
+              <w:rPr>
+                <w:b/>
+                <w:bCs/>
+                <w:highlight w:val="green"/>
               </w:rPr>
               <w:t>2.23</w:t>
             </w:r>
@@ -8217,15 +8223,29 @@
             <w:hideMark/>
           </w:tcPr>
           <w:p>
-            <w:r>
+            <w:pPr>
+              <w:rPr>
+                <w:highlight w:val="green"/>
+              </w:rPr>
+            </w:pPr>
+            <w:r>
+              <w:rPr>
+                <w:highlight w:val="green"/>
+              </w:rPr>
               <w:t xml:space="preserve">Test </w:t>
             </w:r>
             <w:proofErr w:type="gramStart"/>
             <w:r>
+              <w:rPr>
+                <w:highlight w:val="green"/>
+              </w:rPr>
               <w:t>Retro-compatibilità</w:t>
             </w:r>
             <w:proofErr w:type="gramEnd"/>
             <w:r>
+              <w:rPr>
+                <w:highlight w:val="green"/>
+              </w:rPr>
               <w:t xml:space="preserve"> E2E</w:t>
             </w:r>
           </w:p>
@@ -8249,10 +8269,16 @@
             <w:hideMark/>
           </w:tcPr>
           <w:p>
-            <w:r>
-              <w:rPr>
-                <w:b/>
-                <w:bCs/>
+            <w:pPr>
+              <w:rPr>
+                <w:highlight w:val="green"/>
+              </w:rPr>
+            </w:pPr>
+            <w:r>
+              <w:rPr>
+                <w:b/>
+                <w:bCs/>
+                <w:highlight w:val="green"/>
               </w:rPr>
               <w:t>Claude Sonnet 4.5</w:t>
             </w:r>
@@ -8277,7 +8303,15 @@
             <w:hideMark/>
           </w:tcPr>
           <w:p>
-            <w:r>
+            <w:pPr>
+              <w:rPr>
+                <w:highlight w:val="green"/>
+              </w:rPr>
+            </w:pPr>
+            <w:r>
+              <w:rPr>
+                <w:highlight w:val="green"/>
+              </w:rPr>
               <w:t>GPT-5.2-Codex</w:t>
             </w:r>
           </w:p>
@@ -8301,7 +8335,15 @@
             <w:hideMark/>
           </w:tcPr>
           <w:p>
-            <w:r>
+            <w:pPr>
+              <w:rPr>
+                <w:highlight w:val="green"/>
+              </w:rPr>
+            </w:pPr>
+            <w:r>
+              <w:rPr>
+                <w:highlight w:val="green"/>
+              </w:rPr>
               <w:t>1x/1x</w:t>
             </w:r>
           </w:p>
@@ -8327,18 +8369,21 @@
           <w:p>
             <w:pPr>
               <w:rPr>
+                <w:highlight w:val="green"/>
                 <w:lang w:val="en-US"/>
               </w:rPr>
             </w:pPr>
             <w:r>
               <w:rPr>
                 <w:rFonts w:ascii="Segoe UI Emoji" w:hAnsi="Segoe UI Emoji" w:cs="Segoe UI Emoji"/>
+                <w:highlight w:val="green"/>
                 <w:lang w:val="en-US"/>
               </w:rPr>
               <w:t>✅</w:t>
             </w:r>
             <w:r>
               <w:rPr>
+                <w:highlight w:val="green"/>
                 <w:lang w:val="en-US"/>
               </w:rPr>
               <w:t> </w:t>
@@ -8347,12 +8392,14 @@
               <w:rPr>
                 <w:b/>
                 <w:bCs/>
+                <w:highlight w:val="green"/>
                 <w:lang w:val="en-US"/>
               </w:rPr>
               <w:t>Grok Code Fast 1</w:t>
             </w:r>
             <w:r>
               <w:rPr>
+                <w:highlight w:val="green"/>
                 <w:lang w:val="en-US"/>
               </w:rPr>
               <w:t> (roundtrip fixtures)</w:t>

</xml_diff>

<commit_message>
test: Add legacy TickerTracker data fixture.
</commit_message>
<xml_diff>
--- a/IA Model selection.docx
+++ b/IA Model selection.docx
@@ -8430,10 +8430,16 @@
             <w:hideMark/>
           </w:tcPr>
           <w:p>
-            <w:r>
-              <w:rPr>
-                <w:b/>
-                <w:bCs/>
+            <w:pPr>
+              <w:rPr>
+                <w:highlight w:val="green"/>
+              </w:rPr>
+            </w:pPr>
+            <w:r>
+              <w:rPr>
+                <w:b/>
+                <w:bCs/>
+                <w:highlight w:val="green"/>
               </w:rPr>
               <w:lastRenderedPageBreak/>
               <w:t>2.24</w:t>
@@ -8459,11 +8465,22 @@
             <w:hideMark/>
           </w:tcPr>
           <w:p>
-            <w:r>
+            <w:pPr>
+              <w:rPr>
+                <w:highlight w:val="green"/>
+              </w:rPr>
+            </w:pPr>
+            <w:r>
+              <w:rPr>
+                <w:highlight w:val="green"/>
+              </w:rPr>
               <w:t xml:space="preserve">Background Worker </w:t>
             </w:r>
             <w:proofErr w:type="spellStart"/>
             <w:r>
+              <w:rPr>
+                <w:highlight w:val="green"/>
+              </w:rPr>
               <w:t>APScheduler</w:t>
             </w:r>
             <w:proofErr w:type="spellEnd"/>
@@ -8488,10 +8505,16 @@
             <w:hideMark/>
           </w:tcPr>
           <w:p>
-            <w:r>
-              <w:rPr>
-                <w:b/>
-                <w:bCs/>
+            <w:pPr>
+              <w:rPr>
+                <w:highlight w:val="green"/>
+              </w:rPr>
+            </w:pPr>
+            <w:r>
+              <w:rPr>
+                <w:b/>
+                <w:bCs/>
+                <w:highlight w:val="green"/>
               </w:rPr>
               <w:t>GPT-4o</w:t>
             </w:r>
@@ -8516,7 +8539,15 @@
             <w:hideMark/>
           </w:tcPr>
           <w:p>
-            <w:r>
+            <w:pPr>
+              <w:rPr>
+                <w:highlight w:val="green"/>
+              </w:rPr>
+            </w:pPr>
+            <w:r>
+              <w:rPr>
+                <w:highlight w:val="green"/>
+              </w:rPr>
               <w:t>DeepSeek-V3.2</w:t>
             </w:r>
           </w:p>
@@ -8540,7 +8571,15 @@
             <w:hideMark/>
           </w:tcPr>
           <w:p>
-            <w:r>
+            <w:pPr>
+              <w:rPr>
+                <w:highlight w:val="green"/>
+              </w:rPr>
+            </w:pPr>
+            <w:r>
+              <w:rPr>
+                <w:highlight w:val="green"/>
+              </w:rPr>
               <w:t>0x/1x</w:t>
             </w:r>
           </w:p>
@@ -8566,18 +8605,21 @@
           <w:p>
             <w:pPr>
               <w:rPr>
+                <w:highlight w:val="green"/>
                 <w:lang w:val="en-US"/>
               </w:rPr>
             </w:pPr>
             <w:r>
               <w:rPr>
                 <w:rFonts w:ascii="Segoe UI Emoji" w:hAnsi="Segoe UI Emoji" w:cs="Segoe UI Emoji"/>
+                <w:highlight w:val="green"/>
                 <w:lang w:val="en-US"/>
               </w:rPr>
               <w:t>✅</w:t>
             </w:r>
             <w:r>
               <w:rPr>
+                <w:highlight w:val="green"/>
                 <w:lang w:val="en-US"/>
               </w:rPr>
               <w:t> </w:t>
@@ -8586,12 +8628,14 @@
               <w:rPr>
                 <w:b/>
                 <w:bCs/>
+                <w:highlight w:val="green"/>
                 <w:lang w:val="en-US"/>
               </w:rPr>
               <w:t>GPT-5 mini</w:t>
             </w:r>
             <w:r>
               <w:rPr>
+                <w:highlight w:val="green"/>
                 <w:lang w:val="en-US"/>
               </w:rPr>
               <w:t> (graceful shutdown test)</w:t>

</xml_diff>

<commit_message>
feat: Implement outbox pattern for reliable EstimateEvent processing with Drive sync, including a processor, scheduler, and tests.
</commit_message>
<xml_diff>
--- a/IA Model selection.docx
+++ b/IA Model selection.docx
@@ -8666,10 +8666,16 @@
             <w:hideMark/>
           </w:tcPr>
           <w:p>
-            <w:r>
-              <w:rPr>
-                <w:b/>
-                <w:bCs/>
+            <w:pPr>
+              <w:rPr>
+                <w:highlight w:val="green"/>
+              </w:rPr>
+            </w:pPr>
+            <w:r>
+              <w:rPr>
+                <w:b/>
+                <w:bCs/>
+                <w:highlight w:val="green"/>
               </w:rPr>
               <w:t>2.25</w:t>
             </w:r>
@@ -8694,15 +8700,29 @@
             <w:hideMark/>
           </w:tcPr>
           <w:p>
-            <w:r>
+            <w:pPr>
+              <w:rPr>
+                <w:highlight w:val="green"/>
+              </w:rPr>
+            </w:pPr>
+            <w:r>
+              <w:rPr>
+                <w:highlight w:val="green"/>
+              </w:rPr>
               <w:t xml:space="preserve">Pattern </w:t>
             </w:r>
             <w:proofErr w:type="spellStart"/>
             <w:r>
+              <w:rPr>
+                <w:highlight w:val="green"/>
+              </w:rPr>
               <w:t>Outbox</w:t>
             </w:r>
             <w:proofErr w:type="spellEnd"/>
             <w:r>
+              <w:rPr>
+                <w:highlight w:val="green"/>
+              </w:rPr>
               <w:t xml:space="preserve"> Eventi</w:t>
             </w:r>
           </w:p>
@@ -8726,19 +8746,29 @@
             <w:hideMark/>
           </w:tcPr>
           <w:p>
-            <w:r>
-              <w:rPr>
-                <w:b/>
-                <w:bCs/>
+            <w:pPr>
+              <w:rPr>
+                <w:highlight w:val="green"/>
+              </w:rPr>
+            </w:pPr>
+            <w:r>
+              <w:rPr>
+                <w:b/>
+                <w:bCs/>
+                <w:highlight w:val="green"/>
               </w:rPr>
               <w:t>Claude Opus 4.5</w:t>
             </w:r>
             <w:r>
+              <w:rPr>
+                <w:highlight w:val="green"/>
+              </w:rPr>
               <w:t> </w:t>
             </w:r>
             <w:r>
               <w:rPr>
                 <w:rFonts w:ascii="Segoe UI Emoji" w:hAnsi="Segoe UI Emoji" w:cs="Segoe UI Emoji"/>
+                <w:highlight w:val="green"/>
               </w:rPr>
               <w:t>🔴</w:t>
             </w:r>
@@ -8763,7 +8793,15 @@
             <w:hideMark/>
           </w:tcPr>
           <w:p>
-            <w:r>
+            <w:pPr>
+              <w:rPr>
+                <w:highlight w:val="green"/>
+              </w:rPr>
+            </w:pPr>
+            <w:r>
+              <w:rPr>
+                <w:highlight w:val="green"/>
+              </w:rPr>
               <w:t>Claude Sonnet 4.5</w:t>
             </w:r>
           </w:p>
@@ -8787,7 +8825,15 @@
             <w:hideMark/>
           </w:tcPr>
           <w:p>
-            <w:r>
+            <w:pPr>
+              <w:rPr>
+                <w:highlight w:val="green"/>
+              </w:rPr>
+            </w:pPr>
+            <w:r>
+              <w:rPr>
+                <w:highlight w:val="green"/>
+              </w:rPr>
               <w:t>3x/1x</w:t>
             </w:r>
           </w:p>
@@ -8813,18 +8859,21 @@
           <w:p>
             <w:pPr>
               <w:rPr>
+                <w:highlight w:val="green"/>
                 <w:lang w:val="en-US"/>
               </w:rPr>
             </w:pPr>
             <w:r>
               <w:rPr>
                 <w:rFonts w:ascii="Segoe UI Emoji" w:hAnsi="Segoe UI Emoji" w:cs="Segoe UI Emoji"/>
+                <w:highlight w:val="green"/>
                 <w:lang w:val="en-US"/>
               </w:rPr>
               <w:t>✅</w:t>
             </w:r>
             <w:r>
               <w:rPr>
+                <w:highlight w:val="green"/>
                 <w:lang w:val="en-US"/>
               </w:rPr>
               <w:t> </w:t>
@@ -8833,12 +8882,14 @@
               <w:rPr>
                 <w:b/>
                 <w:bCs/>
+                <w:highlight w:val="green"/>
                 <w:lang w:val="en-US"/>
               </w:rPr>
               <w:t>DeepSeek-V3.2</w:t>
             </w:r>
             <w:r>
               <w:rPr>
+                <w:highlight w:val="green"/>
                 <w:lang w:val="en-US"/>
               </w:rPr>
               <w:t> (transactional outbox perf)</w:t>

</xml_diff>

<commit_message>
infra: Add security middleware, shared configuration, project setup files, and infrastructure task documentation.
</commit_message>
<xml_diff>
--- a/IA Model selection.docx
+++ b/IA Model selection.docx
@@ -22,23 +22,7 @@
           <w:b/>
           <w:bCs/>
         </w:rPr>
-        <w:t xml:space="preserve"> IA Model </w:t>
-      </w:r>
-      <w:proofErr w:type="spellStart"/>
-      <w:r>
-        <w:rPr>
-          <w:b/>
-          <w:bCs/>
-        </w:rPr>
-        <w:t>Selection</w:t>
-      </w:r>
-      <w:proofErr w:type="spellEnd"/>
-      <w:r>
-        <w:rPr>
-          <w:b/>
-          <w:bCs/>
-        </w:rPr>
-        <w:t xml:space="preserve"> Ottimizzata v2.0</w:t>
+        <w:t xml:space="preserve"> IA Model Selection Ottimizzata v2.0</w:t>
       </w:r>
     </w:p>
     <w:p>
@@ -392,16 +376,8 @@
               <w:rPr>
                 <w:highlight w:val="green"/>
               </w:rPr>
-              <w:t xml:space="preserve">Setup Struttura Layer </w:t>
-            </w:r>
-            <w:proofErr w:type="spellStart"/>
-            <w:r>
-              <w:rPr>
-                <w:highlight w:val="green"/>
-              </w:rPr>
-              <w:t>Backend</w:t>
-            </w:r>
-            <w:proofErr w:type="spellEnd"/>
+              <w:t>Setup Struttura Layer Backend</w:t>
+            </w:r>
           </w:p>
         </w:tc>
         <w:tc>
@@ -608,21 +584,7 @@
               <w:rPr>
                 <w:highlight w:val="green"/>
               </w:rPr>
-              <w:t xml:space="preserve">Modello API </w:t>
-            </w:r>
-            <w:proofErr w:type="spellStart"/>
-            <w:r>
-              <w:rPr>
-                <w:highlight w:val="green"/>
-              </w:rPr>
-              <w:t>Response</w:t>
-            </w:r>
-            <w:proofErr w:type="spellEnd"/>
-            <w:r>
-              <w:rPr>
-                <w:highlight w:val="green"/>
-              </w:rPr>
-              <w:t xml:space="preserve"> Standard</w:t>
+              <w:t>Modello API Response Standard</w:t>
             </w:r>
           </w:p>
         </w:tc>
@@ -981,35 +943,7 @@
               <w:rPr>
                 <w:highlight w:val="green"/>
               </w:rPr>
-              <w:t xml:space="preserve"> (test </w:t>
-            </w:r>
-            <w:proofErr w:type="spellStart"/>
-            <w:r>
-              <w:rPr>
-                <w:highlight w:val="green"/>
-              </w:rPr>
-              <w:t>Decimal</w:t>
-            </w:r>
-            <w:proofErr w:type="spellEnd"/>
-            <w:r>
-              <w:rPr>
-                <w:highlight w:val="green"/>
-              </w:rPr>
-              <w:t xml:space="preserve"> </w:t>
-            </w:r>
-            <w:proofErr w:type="spellStart"/>
-            <w:r>
-              <w:rPr>
-                <w:highlight w:val="green"/>
-              </w:rPr>
-              <w:t>precision</w:t>
-            </w:r>
-            <w:proofErr w:type="spellEnd"/>
-            <w:r>
-              <w:rPr>
-                <w:highlight w:val="green"/>
-              </w:rPr>
-              <w:t>)</w:t>
+              <w:t> (test Decimal precision)</w:t>
             </w:r>
           </w:p>
         </w:tc>
@@ -1080,16 +1014,8 @@
               <w:rPr>
                 <w:highlight w:val="green"/>
               </w:rPr>
-              <w:t xml:space="preserve">Value Object </w:t>
-            </w:r>
-            <w:proofErr w:type="spellStart"/>
-            <w:r>
-              <w:rPr>
-                <w:highlight w:val="green"/>
-              </w:rPr>
-              <w:t>Percentage</w:t>
-            </w:r>
-            <w:proofErr w:type="spellEnd"/>
+              <w:t>Value Object Percentage</w:t>
+            </w:r>
           </w:p>
         </w:tc>
         <w:tc>
@@ -1315,16 +1241,8 @@
               <w:rPr>
                 <w:highlight w:val="green"/>
               </w:rPr>
-              <w:t xml:space="preserve">Value Object </w:t>
-            </w:r>
-            <w:proofErr w:type="spellStart"/>
-            <w:r>
-              <w:rPr>
-                <w:highlight w:val="green"/>
-              </w:rPr>
-              <w:t>PriceTarget</w:t>
-            </w:r>
-            <w:proofErr w:type="spellEnd"/>
+              <w:t>Value Object PriceTarget</w:t>
+            </w:r>
           </w:p>
         </w:tc>
         <w:tc>
@@ -1479,23 +1397,7 @@
                 <w:highlight w:val="green"/>
                 <w:lang w:val="en-US"/>
               </w:rPr>
-              <w:t> (</w:t>
-            </w:r>
-            <w:proofErr w:type="spellStart"/>
-            <w:r>
-              <w:rPr>
-                <w:highlight w:val="green"/>
-                <w:lang w:val="en-US"/>
-              </w:rPr>
-              <w:t>validazioni</w:t>
-            </w:r>
-            <w:proofErr w:type="spellEnd"/>
-            <w:r>
-              <w:rPr>
-                <w:highlight w:val="green"/>
-                <w:lang w:val="en-US"/>
-              </w:rPr>
-              <w:t xml:space="preserve"> LONG/SHORT)</w:t>
+              <w:t> (validazioni LONG/SHORT)</w:t>
             </w:r>
           </w:p>
         </w:tc>
@@ -1562,33 +1464,11 @@
                 <w:highlight w:val="green"/>
               </w:rPr>
             </w:pPr>
-            <w:proofErr w:type="spellStart"/>
-            <w:r>
-              <w:rPr>
-                <w:highlight w:val="green"/>
-              </w:rPr>
-              <w:t>Config</w:t>
-            </w:r>
-            <w:proofErr w:type="spellEnd"/>
-            <w:r>
-              <w:rPr>
-                <w:highlight w:val="green"/>
-              </w:rPr>
-              <w:t xml:space="preserve"> </w:t>
-            </w:r>
-            <w:proofErr w:type="spellStart"/>
-            <w:r>
-              <w:rPr>
-                <w:highlight w:val="green"/>
-              </w:rPr>
-              <w:t>Pydantic</w:t>
-            </w:r>
-            <w:proofErr w:type="spellEnd"/>
-            <w:r>
-              <w:rPr>
-                <w:highlight w:val="green"/>
-              </w:rPr>
-              <w:t xml:space="preserve"> Settings</w:t>
+            <w:r>
+              <w:rPr>
+                <w:highlight w:val="green"/>
+              </w:rPr>
+              <w:t>Config Pydantic Settings</w:t>
             </w:r>
           </w:p>
         </w:tc>
@@ -2019,33 +1899,11 @@
                 <w:highlight w:val="green"/>
               </w:rPr>
             </w:pPr>
-            <w:proofErr w:type="spellStart"/>
-            <w:r>
-              <w:rPr>
-                <w:highlight w:val="green"/>
-              </w:rPr>
-              <w:t>Wrapper</w:t>
-            </w:r>
-            <w:proofErr w:type="spellEnd"/>
-            <w:r>
-              <w:rPr>
-                <w:highlight w:val="green"/>
-              </w:rPr>
-              <w:t xml:space="preserve"> </w:t>
-            </w:r>
-            <w:proofErr w:type="spellStart"/>
-            <w:r>
-              <w:rPr>
-                <w:highlight w:val="green"/>
-              </w:rPr>
-              <w:t>TypeScript</w:t>
-            </w:r>
-            <w:proofErr w:type="spellEnd"/>
-            <w:r>
-              <w:rPr>
-                <w:highlight w:val="green"/>
-              </w:rPr>
-              <w:t xml:space="preserve"> Decimali</w:t>
+            <w:r>
+              <w:rPr>
+                <w:highlight w:val="green"/>
+              </w:rPr>
+              <w:t>Wrapper TypeScript Decimali</w:t>
             </w:r>
           </w:p>
         </w:tc>
@@ -2779,30 +2637,8 @@
               <w:rPr>
                 <w:highlight w:val="green"/>
               </w:rPr>
-              <w:t xml:space="preserve">Docker Compose </w:t>
-            </w:r>
-            <w:proofErr w:type="spellStart"/>
-            <w:r>
-              <w:rPr>
-                <w:highlight w:val="green"/>
-              </w:rPr>
-              <w:t>PostgreSQL</w:t>
-            </w:r>
-            <w:proofErr w:type="spellEnd"/>
-            <w:r>
-              <w:rPr>
-                <w:highlight w:val="green"/>
-              </w:rPr>
-              <w:t>/</w:t>
-            </w:r>
-            <w:proofErr w:type="spellStart"/>
-            <w:r>
-              <w:rPr>
-                <w:highlight w:val="green"/>
-              </w:rPr>
-              <w:t>Redis</w:t>
-            </w:r>
-            <w:proofErr w:type="spellEnd"/>
+              <w:t>Docker Compose PostgreSQL/Redis</w:t>
+            </w:r>
           </w:p>
         </w:tc>
         <w:tc>
@@ -2952,35 +2788,7 @@
               <w:rPr>
                 <w:highlight w:val="green"/>
               </w:rPr>
-              <w:t> (</w:t>
-            </w:r>
-            <w:proofErr w:type="spellStart"/>
-            <w:r>
-              <w:rPr>
-                <w:highlight w:val="green"/>
-              </w:rPr>
-              <w:t>healthcheck</w:t>
-            </w:r>
-            <w:proofErr w:type="spellEnd"/>
-            <w:r>
-              <w:rPr>
-                <w:highlight w:val="green"/>
-              </w:rPr>
-              <w:t xml:space="preserve"> </w:t>
-            </w:r>
-            <w:proofErr w:type="spellStart"/>
-            <w:r>
-              <w:rPr>
-                <w:highlight w:val="green"/>
-              </w:rPr>
-              <w:t>syntax</w:t>
-            </w:r>
-            <w:proofErr w:type="spellEnd"/>
-            <w:r>
-              <w:rPr>
-                <w:highlight w:val="green"/>
-              </w:rPr>
-              <w:t>)</w:t>
+              <w:t> (healthcheck syntax)</w:t>
             </w:r>
           </w:p>
         </w:tc>
@@ -3051,21 +2859,7 @@
               <w:rPr>
                 <w:highlight w:val="green"/>
               </w:rPr>
-              <w:t xml:space="preserve">Modello Ticker + </w:t>
-            </w:r>
-            <w:proofErr w:type="spellStart"/>
-            <w:r>
-              <w:rPr>
-                <w:highlight w:val="green"/>
-              </w:rPr>
-              <w:t>SQLAlchemy</w:t>
-            </w:r>
-            <w:proofErr w:type="spellEnd"/>
-            <w:r>
-              <w:rPr>
-                <w:highlight w:val="green"/>
-              </w:rPr>
-              <w:t xml:space="preserve"> Base</w:t>
+              <w:t>Modello Ticker + SQLAlchemy Base</w:t>
             </w:r>
           </w:p>
         </w:tc>
@@ -3443,21 +3237,7 @@
               <w:rPr>
                 <w:highlight w:val="green"/>
               </w:rPr>
-              <w:t xml:space="preserve"> (DECIMAL </w:t>
-            </w:r>
-            <w:proofErr w:type="spellStart"/>
-            <w:r>
-              <w:rPr>
-                <w:highlight w:val="green"/>
-              </w:rPr>
-              <w:t>validation</w:t>
-            </w:r>
-            <w:proofErr w:type="spellEnd"/>
-            <w:r>
-              <w:rPr>
-                <w:highlight w:val="green"/>
-              </w:rPr>
-              <w:t>)</w:t>
+              <w:t> (DECIMAL validation)</w:t>
             </w:r>
           </w:p>
         </w:tc>
@@ -3524,19 +3304,11 @@
                 <w:highlight w:val="green"/>
               </w:rPr>
             </w:pPr>
-            <w:proofErr w:type="spellStart"/>
-            <w:r>
-              <w:rPr>
-                <w:highlight w:val="green"/>
-              </w:rPr>
-              <w:t>EstimateEvent</w:t>
-            </w:r>
-            <w:proofErr w:type="spellEnd"/>
-            <w:r>
-              <w:rPr>
-                <w:highlight w:val="green"/>
-              </w:rPr>
-              <w:t xml:space="preserve"> (Event Sourcing)</w:t>
+            <w:r>
+              <w:rPr>
+                <w:highlight w:val="green"/>
+              </w:rPr>
+              <w:t>EstimateEvent (Event Sourcing)</w:t>
             </w:r>
           </w:p>
         </w:tc>
@@ -3759,19 +3531,11 @@
                 <w:highlight w:val="green"/>
               </w:rPr>
             </w:pPr>
-            <w:proofErr w:type="spellStart"/>
-            <w:r>
-              <w:rPr>
-                <w:highlight w:val="green"/>
-              </w:rPr>
-              <w:t>MarketData</w:t>
-            </w:r>
-            <w:proofErr w:type="spellEnd"/>
-            <w:r>
-              <w:rPr>
-                <w:highlight w:val="green"/>
-              </w:rPr>
-              <w:t xml:space="preserve"> (OHLCV)</w:t>
+            <w:r>
+              <w:rPr>
+                <w:highlight w:val="green"/>
+              </w:rPr>
+              <w:t>MarketData (OHLCV)</w:t>
             </w:r>
           </w:p>
         </w:tc>
@@ -4197,14 +3961,12 @@
                 <w:highlight w:val="green"/>
               </w:rPr>
             </w:pPr>
-            <w:proofErr w:type="spellStart"/>
             <w:r>
               <w:rPr>
                 <w:highlight w:val="green"/>
               </w:rPr>
               <w:t>SyncJob</w:t>
             </w:r>
-            <w:proofErr w:type="spellEnd"/>
           </w:p>
         </w:tc>
         <w:tc>
@@ -4403,14 +4165,12 @@
                 <w:highlight w:val="green"/>
               </w:rPr>
             </w:pPr>
-            <w:proofErr w:type="spellStart"/>
             <w:r>
               <w:rPr>
                 <w:highlight w:val="green"/>
               </w:rPr>
               <w:t>AiModelRun</w:t>
             </w:r>
-            <w:proofErr w:type="spellEnd"/>
           </w:p>
         </w:tc>
         <w:tc>
@@ -4617,21 +4377,7 @@
               <w:rPr>
                 <w:highlight w:val="green"/>
               </w:rPr>
-              <w:t xml:space="preserve">Setup </w:t>
-            </w:r>
-            <w:proofErr w:type="spellStart"/>
-            <w:r>
-              <w:rPr>
-                <w:highlight w:val="green"/>
-              </w:rPr>
-              <w:t>Alembic</w:t>
-            </w:r>
-            <w:proofErr w:type="spellEnd"/>
-            <w:r>
-              <w:rPr>
-                <w:highlight w:val="green"/>
-              </w:rPr>
-              <w:t xml:space="preserve"> Migrazioni</w:t>
+              <w:t>Setup Alembic Migrazioni</w:t>
             </w:r>
           </w:p>
         </w:tc>
@@ -4853,19 +4599,11 @@
                 <w:highlight w:val="green"/>
               </w:rPr>
             </w:pPr>
-            <w:proofErr w:type="spellStart"/>
-            <w:r>
-              <w:rPr>
-                <w:highlight w:val="green"/>
-              </w:rPr>
-              <w:t>Materialized</w:t>
-            </w:r>
-            <w:proofErr w:type="spellEnd"/>
-            <w:r>
-              <w:rPr>
-                <w:highlight w:val="green"/>
-              </w:rPr>
-              <w:t xml:space="preserve"> View (CQRS)</w:t>
+            <w:r>
+              <w:rPr>
+                <w:highlight w:val="green"/>
+              </w:rPr>
+              <w:t>Materialized View (CQRS)</w:t>
             </w:r>
           </w:p>
         </w:tc>
@@ -5597,16 +5335,8 @@
               <w:rPr>
                 <w:highlight w:val="green"/>
               </w:rPr>
-              <w:t xml:space="preserve">Repository </w:t>
-            </w:r>
-            <w:proofErr w:type="spellStart"/>
-            <w:r>
-              <w:rPr>
-                <w:highlight w:val="green"/>
-              </w:rPr>
-              <w:t>MarketData</w:t>
-            </w:r>
-            <w:proofErr w:type="spellEnd"/>
+              <w:t>Repository MarketData</w:t>
+            </w:r>
           </w:p>
         </w:tc>
         <w:tc>
@@ -5761,23 +5491,7 @@
                 <w:highlight w:val="green"/>
                 <w:lang w:val="en-US"/>
               </w:rPr>
-              <w:t> (</w:t>
-            </w:r>
-            <w:proofErr w:type="spellStart"/>
-            <w:r>
-              <w:rPr>
-                <w:highlight w:val="green"/>
-                <w:lang w:val="en-US"/>
-              </w:rPr>
-              <w:t>upsert</w:t>
-            </w:r>
-            <w:proofErr w:type="spellEnd"/>
-            <w:r>
-              <w:rPr>
-                <w:highlight w:val="green"/>
-                <w:lang w:val="en-US"/>
-              </w:rPr>
-              <w:t xml:space="preserve"> N+1 check)</w:t>
+              <w:t> (upsert N+1 check)</w:t>
             </w:r>
           </w:p>
         </w:tc>
@@ -5848,16 +5562,8 @@
               <w:rPr>
                 <w:highlight w:val="green"/>
               </w:rPr>
-              <w:t xml:space="preserve">Service </w:t>
-            </w:r>
-            <w:proofErr w:type="spellStart"/>
-            <w:r>
-              <w:rPr>
-                <w:highlight w:val="green"/>
-              </w:rPr>
-              <w:t>EstimateService</w:t>
-            </w:r>
-            <w:proofErr w:type="spellEnd"/>
+              <w:t>Service EstimateService</w:t>
+            </w:r>
           </w:p>
         </w:tc>
         <w:tc>
@@ -6079,19 +5785,11 @@
                 <w:highlight w:val="green"/>
               </w:rPr>
             </w:pPr>
-            <w:proofErr w:type="spellStart"/>
-            <w:r>
-              <w:rPr>
-                <w:highlight w:val="green"/>
-              </w:rPr>
-              <w:t>EstimateHistory</w:t>
-            </w:r>
-            <w:proofErr w:type="spellEnd"/>
-            <w:r>
-              <w:rPr>
-                <w:highlight w:val="green"/>
-              </w:rPr>
-              <w:t xml:space="preserve"> (Event Sourcing)</w:t>
+            <w:r>
+              <w:rPr>
+                <w:highlight w:val="green"/>
+              </w:rPr>
+              <w:t>EstimateHistory (Event Sourcing)</w:t>
             </w:r>
           </w:p>
         </w:tc>
@@ -6332,16 +6030,8 @@
               <w:rPr>
                 <w:highlight w:val="green"/>
               </w:rPr>
-              <w:t xml:space="preserve">API Router </w:t>
-            </w:r>
-            <w:proofErr w:type="spellStart"/>
-            <w:r>
-              <w:rPr>
-                <w:highlight w:val="green"/>
-              </w:rPr>
-              <w:t>Estimates</w:t>
-            </w:r>
-            <w:proofErr w:type="spellEnd"/>
+              <w:t>API Router Estimates</w:t>
+            </w:r>
           </w:p>
         </w:tc>
         <w:tc>
@@ -6752,19 +6442,11 @@
                 <w:highlight w:val="green"/>
               </w:rPr>
             </w:pPr>
-            <w:proofErr w:type="spellStart"/>
-            <w:r>
-              <w:rPr>
-                <w:highlight w:val="green"/>
-              </w:rPr>
-              <w:t>MarketDataProvider</w:t>
-            </w:r>
-            <w:proofErr w:type="spellEnd"/>
-            <w:r>
-              <w:rPr>
-                <w:highlight w:val="green"/>
-              </w:rPr>
-              <w:t xml:space="preserve"> Astratto</w:t>
+            <w:r>
+              <w:rPr>
+                <w:highlight w:val="green"/>
+              </w:rPr>
+              <w:t>MarketDataProvider Astratto</w:t>
             </w:r>
           </w:p>
         </w:tc>
@@ -6915,21 +6597,7 @@
               <w:rPr>
                 <w:highlight w:val="green"/>
               </w:rPr>
-              <w:t> (</w:t>
-            </w:r>
-            <w:proofErr w:type="spellStart"/>
-            <w:r>
-              <w:rPr>
-                <w:highlight w:val="green"/>
-              </w:rPr>
-              <w:t>protocol</w:t>
-            </w:r>
-            <w:proofErr w:type="spellEnd"/>
-            <w:r>
-              <w:rPr>
-                <w:highlight w:val="green"/>
-              </w:rPr>
-              <w:t xml:space="preserve"> ABC test)</w:t>
+              <w:t> (protocol ABC test)</w:t>
             </w:r>
           </w:p>
         </w:tc>
@@ -7174,17 +6842,8 @@
           <w:b/>
           <w:bCs/>
         </w:rPr>
-        <w:t xml:space="preserve">Google Drive &amp; </w:t>
+        <w:t>Google Drive &amp; Sync</w:t>
       </w:r>
-      <w:proofErr w:type="spellStart"/>
-      <w:r>
-        <w:rPr>
-          <w:b/>
-          <w:bCs/>
-        </w:rPr>
-        <w:t>Sync</w:t>
-      </w:r>
-      <w:proofErr w:type="spellEnd"/>
     </w:p>
     <w:tbl>
       <w:tblPr>
@@ -7897,23 +7556,7 @@
                 <w:highlight w:val="green"/>
                 <w:lang w:val="en-US"/>
               </w:rPr>
-              <w:t xml:space="preserve"> (120+ </w:t>
-            </w:r>
-            <w:proofErr w:type="gramStart"/>
-            <w:r>
-              <w:rPr>
-                <w:highlight w:val="green"/>
-                <w:lang w:val="en-US"/>
-              </w:rPr>
-              <w:t>col</w:t>
-            </w:r>
-            <w:proofErr w:type="gramEnd"/>
-            <w:r>
-              <w:rPr>
-                <w:highlight w:val="green"/>
-                <w:lang w:val="en-US"/>
-              </w:rPr>
-              <w:t xml:space="preserve"> UTF-8 BOM)</w:t>
+              <w:t> (120+ col UTF-8 BOM)</w:t>
             </w:r>
           </w:p>
         </w:tc>
@@ -7980,19 +7623,11 @@
                 <w:highlight w:val="green"/>
               </w:rPr>
             </w:pPr>
-            <w:proofErr w:type="spellStart"/>
-            <w:r>
-              <w:rPr>
-                <w:highlight w:val="green"/>
-              </w:rPr>
-              <w:t>Sync</w:t>
-            </w:r>
-            <w:proofErr w:type="spellEnd"/>
-            <w:r>
-              <w:rPr>
-                <w:highlight w:val="green"/>
-              </w:rPr>
-              <w:t xml:space="preserve"> Service</w:t>
+            <w:r>
+              <w:rPr>
+                <w:highlight w:val="green"/>
+              </w:rPr>
+              <w:t>Sync Service</w:t>
             </w:r>
           </w:p>
         </w:tc>
@@ -8232,21 +7867,7 @@
               <w:rPr>
                 <w:highlight w:val="green"/>
               </w:rPr>
-              <w:t xml:space="preserve">Test </w:t>
-            </w:r>
-            <w:proofErr w:type="gramStart"/>
-            <w:r>
-              <w:rPr>
-                <w:highlight w:val="green"/>
-              </w:rPr>
-              <w:t>Retro-compatibilità</w:t>
-            </w:r>
-            <w:proofErr w:type="gramEnd"/>
-            <w:r>
-              <w:rPr>
-                <w:highlight w:val="green"/>
-              </w:rPr>
-              <w:t xml:space="preserve"> E2E</w:t>
+              <w:t>Test Retro-compatibilità E2E</w:t>
             </w:r>
           </w:p>
         </w:tc>
@@ -8474,16 +8095,8 @@
               <w:rPr>
                 <w:highlight w:val="green"/>
               </w:rPr>
-              <w:t xml:space="preserve">Background Worker </w:t>
-            </w:r>
-            <w:proofErr w:type="spellStart"/>
-            <w:r>
-              <w:rPr>
-                <w:highlight w:val="green"/>
-              </w:rPr>
-              <w:t>APScheduler</w:t>
-            </w:r>
-            <w:proofErr w:type="spellEnd"/>
+              <w:t>Background Worker APScheduler</w:t>
+            </w:r>
           </w:p>
         </w:tc>
         <w:tc>
@@ -8709,21 +8322,7 @@
               <w:rPr>
                 <w:highlight w:val="green"/>
               </w:rPr>
-              <w:t xml:space="preserve">Pattern </w:t>
-            </w:r>
-            <w:proofErr w:type="spellStart"/>
-            <w:r>
-              <w:rPr>
-                <w:highlight w:val="green"/>
-              </w:rPr>
-              <w:t>Outbox</w:t>
-            </w:r>
-            <w:proofErr w:type="spellEnd"/>
-            <w:r>
-              <w:rPr>
-                <w:highlight w:val="green"/>
-              </w:rPr>
-              <w:t xml:space="preserve"> Eventi</w:t>
+              <w:t>Pattern Outbox Eventi</w:t>
             </w:r>
           </w:p>
         </w:tc>
@@ -9213,10 +8812,16 @@
             <w:hideMark/>
           </w:tcPr>
           <w:p>
-            <w:r>
-              <w:rPr>
-                <w:b/>
-                <w:bCs/>
+            <w:pPr>
+              <w:rPr>
+                <w:highlight w:val="green"/>
+              </w:rPr>
+            </w:pPr>
+            <w:r>
+              <w:rPr>
+                <w:b/>
+                <w:bCs/>
+                <w:highlight w:val="green"/>
               </w:rPr>
               <w:t>3.1</w:t>
             </w:r>
@@ -9241,7 +8846,15 @@
             <w:hideMark/>
           </w:tcPr>
           <w:p>
-            <w:r>
+            <w:pPr>
+              <w:rPr>
+                <w:highlight w:val="green"/>
+              </w:rPr>
+            </w:pPr>
+            <w:r>
+              <w:rPr>
+                <w:highlight w:val="green"/>
+              </w:rPr>
               <w:t>Security Middleware</w:t>
             </w:r>
           </w:p>
@@ -9265,10 +8878,16 @@
             <w:hideMark/>
           </w:tcPr>
           <w:p>
-            <w:r>
-              <w:rPr>
-                <w:b/>
-                <w:bCs/>
+            <w:pPr>
+              <w:rPr>
+                <w:highlight w:val="green"/>
+              </w:rPr>
+            </w:pPr>
+            <w:r>
+              <w:rPr>
+                <w:b/>
+                <w:bCs/>
+                <w:highlight w:val="green"/>
               </w:rPr>
               <w:t>GPT-4o</w:t>
             </w:r>
@@ -9293,7 +8912,15 @@
             <w:hideMark/>
           </w:tcPr>
           <w:p>
-            <w:r>
+            <w:pPr>
+              <w:rPr>
+                <w:highlight w:val="green"/>
+              </w:rPr>
+            </w:pPr>
+            <w:r>
+              <w:rPr>
+                <w:highlight w:val="green"/>
+              </w:rPr>
               <w:t>DeepSeek-V3.2</w:t>
             </w:r>
           </w:p>
@@ -9317,7 +8944,15 @@
             <w:hideMark/>
           </w:tcPr>
           <w:p>
-            <w:r>
+            <w:pPr>
+              <w:rPr>
+                <w:highlight w:val="green"/>
+              </w:rPr>
+            </w:pPr>
+            <w:r>
+              <w:rPr>
+                <w:highlight w:val="green"/>
+              </w:rPr>
               <w:t>0x/1x</w:t>
             </w:r>
           </w:p>
@@ -9343,18 +8978,21 @@
           <w:p>
             <w:pPr>
               <w:rPr>
+                <w:highlight w:val="green"/>
                 <w:lang w:val="en-US"/>
               </w:rPr>
             </w:pPr>
             <w:r>
               <w:rPr>
                 <w:rFonts w:ascii="Segoe UI Emoji" w:hAnsi="Segoe UI Emoji" w:cs="Segoe UI Emoji"/>
+                <w:highlight w:val="green"/>
                 <w:lang w:val="en-US"/>
               </w:rPr>
               <w:t>✅</w:t>
             </w:r>
             <w:r>
               <w:rPr>
+                <w:highlight w:val="green"/>
                 <w:lang w:val="en-US"/>
               </w:rPr>
               <w:t> </w:t>
@@ -9363,12 +9001,14 @@
               <w:rPr>
                 <w:b/>
                 <w:bCs/>
+                <w:highlight w:val="green"/>
                 <w:lang w:val="en-US"/>
               </w:rPr>
               <w:t>GPT-5 mini</w:t>
             </w:r>
             <w:r>
               <w:rPr>
+                <w:highlight w:val="green"/>
                 <w:lang w:val="en-US"/>
               </w:rPr>
               <w:t> (CSP headers test)</w:t>
@@ -9428,21 +9068,8 @@
           </w:tcPr>
           <w:p>
             <w:r>
-              <w:t xml:space="preserve">Rate </w:t>
-            </w:r>
-            <w:proofErr w:type="spellStart"/>
-            <w:r>
-              <w:t>Limiting</w:t>
-            </w:r>
-            <w:proofErr w:type="spellEnd"/>
-            <w:r>
-              <w:t xml:space="preserve"> </w:t>
-            </w:r>
-            <w:proofErr w:type="spellStart"/>
-            <w:r>
-              <w:t>SlowAPI</w:t>
-            </w:r>
-            <w:proofErr w:type="spellEnd"/>
+              <w:t>Rate Limiting SlowAPI</w:t>
+            </w:r>
           </w:p>
         </w:tc>
         <w:tc>
@@ -9627,15 +9254,7 @@
           </w:tcPr>
           <w:p>
             <w:r>
-              <w:t xml:space="preserve">Input </w:t>
-            </w:r>
-            <w:proofErr w:type="spellStart"/>
-            <w:r>
-              <w:t>Validation</w:t>
-            </w:r>
-            <w:proofErr w:type="spellEnd"/>
-            <w:r>
-              <w:t xml:space="preserve"> Avanzata</w:t>
+              <w:t>Input Validation Avanzata</w:t>
             </w:r>
           </w:p>
         </w:tc>
@@ -9820,27 +9439,9 @@
             <w:hideMark/>
           </w:tcPr>
           <w:p>
-            <w:proofErr w:type="spellStart"/>
-            <w:r>
-              <w:t>Encryption</w:t>
-            </w:r>
-            <w:proofErr w:type="spellEnd"/>
-            <w:r>
-              <w:t xml:space="preserve"> </w:t>
-            </w:r>
-            <w:proofErr w:type="spellStart"/>
-            <w:r>
-              <w:t>at</w:t>
-            </w:r>
-            <w:proofErr w:type="spellEnd"/>
-            <w:r>
-              <w:t xml:space="preserve"> </w:t>
-            </w:r>
-            <w:proofErr w:type="spellStart"/>
-            <w:r>
-              <w:t>Rest</w:t>
-            </w:r>
-            <w:proofErr w:type="spellEnd"/>
+            <w:r>
+              <w:t>Encryption at Rest</w:t>
+            </w:r>
           </w:p>
         </w:tc>
         <w:tc>
@@ -10024,19 +9625,9 @@
             <w:hideMark/>
           </w:tcPr>
           <w:p>
-            <w:proofErr w:type="spellStart"/>
-            <w:r>
-              <w:t>Structured</w:t>
-            </w:r>
-            <w:proofErr w:type="spellEnd"/>
-            <w:r>
-              <w:t xml:space="preserve"> </w:t>
-            </w:r>
-            <w:proofErr w:type="spellStart"/>
-            <w:r>
-              <w:t>Logging</w:t>
-            </w:r>
-            <w:proofErr w:type="spellEnd"/>
+            <w:r>
+              <w:t>Structured Logging</w:t>
+            </w:r>
           </w:p>
         </w:tc>
         <w:tc>
@@ -10687,23 +10278,7 @@
               <w:t>Gemini 3 Flash</w:t>
             </w:r>
             <w:r>
-              <w:t> (</w:t>
-            </w:r>
-            <w:proofErr w:type="spellStart"/>
-            <w:r>
-              <w:t>anomaly</w:t>
-            </w:r>
-            <w:proofErr w:type="spellEnd"/>
-            <w:r>
-              <w:t xml:space="preserve"> </w:t>
-            </w:r>
-            <w:proofErr w:type="spellStart"/>
-            <w:r>
-              <w:t>detection</w:t>
-            </w:r>
-            <w:proofErr w:type="spellEnd"/>
-            <w:r>
-              <w:t>)</w:t>
+              <w:t> (anomaly detection)</w:t>
             </w:r>
           </w:p>
         </w:tc>
@@ -10760,15 +10335,7 @@
           </w:tcPr>
           <w:p>
             <w:r>
-              <w:t xml:space="preserve">Data </w:t>
-            </w:r>
-            <w:proofErr w:type="spellStart"/>
-            <w:r>
-              <w:t>Lineage</w:t>
-            </w:r>
-            <w:proofErr w:type="spellEnd"/>
-            <w:r>
-              <w:t xml:space="preserve"> Tracking</w:t>
+              <w:t>Data Lineage Tracking</w:t>
             </w:r>
           </w:p>
         </w:tc>
@@ -11057,23 +10624,7 @@
               <w:t>GPT-5 mini</w:t>
             </w:r>
             <w:r>
-              <w:t> (</w:t>
-            </w:r>
-            <w:proofErr w:type="spellStart"/>
-            <w:r>
-              <w:t>QueuePool</w:t>
-            </w:r>
-            <w:proofErr w:type="spellEnd"/>
-            <w:r>
-              <w:t xml:space="preserve"> </w:t>
-            </w:r>
-            <w:proofErr w:type="spellStart"/>
-            <w:r>
-              <w:t>metrics</w:t>
-            </w:r>
-            <w:proofErr w:type="spellEnd"/>
-            <w:r>
-              <w:t>)</w:t>
+              <w:t> (QueuePool metrics)</w:t>
             </w:r>
           </w:p>
         </w:tc>
@@ -11129,19 +10680,9 @@
             <w:hideMark/>
           </w:tcPr>
           <w:p>
-            <w:proofErr w:type="spellStart"/>
-            <w:r>
-              <w:t>Cursor-Based</w:t>
-            </w:r>
-            <w:proofErr w:type="spellEnd"/>
-            <w:r>
-              <w:t xml:space="preserve"> </w:t>
-            </w:r>
-            <w:proofErr w:type="spellStart"/>
-            <w:r>
-              <w:t>Pagination</w:t>
-            </w:r>
-            <w:proofErr w:type="spellEnd"/>
+            <w:r>
+              <w:t>Cursor-Based Pagination</w:t>
+            </w:r>
           </w:p>
         </w:tc>
         <w:tc>
@@ -11269,21 +10810,7 @@
               <w:rPr>
                 <w:lang w:val="en-US"/>
               </w:rPr>
-              <w:t> (</w:t>
-            </w:r>
-            <w:proofErr w:type="gramStart"/>
-            <w:r>
-              <w:rPr>
-                <w:lang w:val="en-US"/>
-              </w:rPr>
-              <w:t>O(</w:t>
-            </w:r>
-            <w:proofErr w:type="gramEnd"/>
-            <w:r>
-              <w:rPr>
-                <w:lang w:val="en-US"/>
-              </w:rPr>
-              <w:t>1) perf test)</w:t>
+              <w:t> (O(1) perf test)</w:t>
             </w:r>
           </w:p>
         </w:tc>
@@ -11456,15 +10983,7 @@
               <w:t>GPT-5 mini</w:t>
             </w:r>
             <w:r>
-              <w:t xml:space="preserve"> (multi-service </w:t>
-            </w:r>
-            <w:proofErr w:type="spellStart"/>
-            <w:r>
-              <w:t>orchestration</w:t>
-            </w:r>
-            <w:proofErr w:type="spellEnd"/>
-            <w:r>
-              <w:t>)</w:t>
+              <w:t> (multi-service orchestration)</w:t>
             </w:r>
           </w:p>
         </w:tc>
@@ -11993,13 +11512,8 @@
           </w:tcPr>
           <w:p>
             <w:r>
-              <w:t xml:space="preserve">Struttura Feature </w:t>
-            </w:r>
-            <w:proofErr w:type="spellStart"/>
-            <w:r>
-              <w:t>Modules</w:t>
-            </w:r>
-            <w:proofErr w:type="spellEnd"/>
+              <w:t>Struttura Feature Modules</w:t>
+            </w:r>
           </w:p>
         </w:tc>
         <w:tc>
@@ -12160,13 +11674,8 @@
             <w:hideMark/>
           </w:tcPr>
           <w:p>
-            <w:proofErr w:type="spellStart"/>
-            <w:r>
-              <w:t>Config</w:t>
-            </w:r>
-            <w:proofErr w:type="spellEnd"/>
-            <w:r>
-              <w:t xml:space="preserve"> React Query</w:t>
+            <w:r>
+              <w:t>Config React Query</w:t>
             </w:r>
           </w:p>
         </w:tc>
@@ -12282,15 +11791,7 @@
               <w:t>GPT-5 mini</w:t>
             </w:r>
             <w:r>
-              <w:t> (</w:t>
-            </w:r>
-            <w:proofErr w:type="spellStart"/>
-            <w:r>
-              <w:t>QueryClient</w:t>
-            </w:r>
-            <w:proofErr w:type="spellEnd"/>
-            <w:r>
-              <w:t xml:space="preserve"> test)</w:t>
+              <w:t> (QueryClient test)</w:t>
             </w:r>
           </w:p>
         </w:tc>
@@ -12463,15 +11964,7 @@
               <w:t>GPT-5 mini</w:t>
             </w:r>
             <w:r>
-              <w:t> (</w:t>
-            </w:r>
-            <w:proofErr w:type="spellStart"/>
-            <w:r>
-              <w:t>interceptors</w:t>
-            </w:r>
-            <w:proofErr w:type="spellEnd"/>
-            <w:r>
-              <w:t xml:space="preserve"> test)</w:t>
+              <w:t> (interceptors test)</w:t>
             </w:r>
           </w:p>
         </w:tc>
@@ -12992,13 +12485,8 @@
           </w:tcPr>
           <w:p>
             <w:r>
-              <w:t xml:space="preserve">Component </w:t>
-            </w:r>
-            <w:proofErr w:type="spellStart"/>
-            <w:r>
-              <w:t>EstimateCard</w:t>
-            </w:r>
-            <w:proofErr w:type="spellEnd"/>
+              <w:t>Component EstimateCard</w:t>
+            </w:r>
           </w:p>
         </w:tc>
         <w:tc>
@@ -13160,13 +12648,8 @@
           </w:tcPr>
           <w:p>
             <w:r>
-              <w:t xml:space="preserve">Component </w:t>
-            </w:r>
-            <w:proofErr w:type="spellStart"/>
-            <w:r>
-              <w:t>EstimateForm</w:t>
-            </w:r>
-            <w:proofErr w:type="spellEnd"/>
+              <w:t>Component EstimateForm</w:t>
+            </w:r>
           </w:p>
         </w:tc>
         <w:tc>
@@ -13351,13 +12834,8 @@
           </w:tcPr>
           <w:p>
             <w:r>
-              <w:t xml:space="preserve">Component </w:t>
-            </w:r>
-            <w:proofErr w:type="spellStart"/>
-            <w:r>
-              <w:t>PriceChart</w:t>
-            </w:r>
-            <w:proofErr w:type="spellEnd"/>
+              <w:t>Component PriceChart</w:t>
+            </w:r>
           </w:p>
         </w:tc>
         <w:tc>
@@ -13472,15 +12950,7 @@
               <w:t>Gemini 3 Flash</w:t>
             </w:r>
             <w:r>
-              <w:t> (</w:t>
-            </w:r>
-            <w:proofErr w:type="gramStart"/>
-            <w:r>
-              <w:t>responsive test</w:t>
-            </w:r>
-            <w:proofErr w:type="gramEnd"/>
-            <w:r>
-              <w:t>)</w:t>
+              <w:t> (responsive test)</w:t>
             </w:r>
           </w:p>
         </w:tc>
@@ -13537,13 +13007,8 @@
           </w:tcPr>
           <w:p>
             <w:r>
-              <w:t xml:space="preserve">Component </w:t>
-            </w:r>
-            <w:proofErr w:type="spellStart"/>
-            <w:r>
-              <w:t>PortfolioSummary</w:t>
-            </w:r>
-            <w:proofErr w:type="spellEnd"/>
+              <w:t>Component PortfolioSummary</w:t>
+            </w:r>
           </w:p>
         </w:tc>
         <w:tc>
@@ -13705,13 +13170,8 @@
           </w:tcPr>
           <w:p>
             <w:r>
-              <w:t xml:space="preserve">Feature </w:t>
-            </w:r>
-            <w:proofErr w:type="spellStart"/>
-            <w:r>
-              <w:t>EstimatesList</w:t>
-            </w:r>
-            <w:proofErr w:type="spellEnd"/>
+              <w:t>Feature EstimatesList</w:t>
+            </w:r>
           </w:p>
         </w:tc>
         <w:tc>
@@ -13826,15 +13286,7 @@
               <w:t>GPT-5 mini</w:t>
             </w:r>
             <w:r>
-              <w:t> (</w:t>
-            </w:r>
-            <w:proofErr w:type="spellStart"/>
-            <w:r>
-              <w:t>pagination</w:t>
-            </w:r>
-            <w:proofErr w:type="spellEnd"/>
-            <w:r>
-              <w:t xml:space="preserve"> test)</w:t>
+              <w:t> (pagination test)</w:t>
             </w:r>
           </w:p>
         </w:tc>
@@ -13892,13 +13344,8 @@
           </w:tcPr>
           <w:p>
             <w:r>
-              <w:t xml:space="preserve">Feature </w:t>
-            </w:r>
-            <w:proofErr w:type="spellStart"/>
-            <w:r>
-              <w:t>EstimateDetail</w:t>
-            </w:r>
-            <w:proofErr w:type="spellEnd"/>
+              <w:t>Feature EstimateDetail</w:t>
+            </w:r>
           </w:p>
         </w:tc>
         <w:tc>
@@ -14176,15 +13623,7 @@
               <w:t>GPT-5.1-Codex</w:t>
             </w:r>
             <w:r>
-              <w:t xml:space="preserve"> (streaming </w:t>
-            </w:r>
-            <w:proofErr w:type="spellStart"/>
-            <w:r>
-              <w:t>context</w:t>
-            </w:r>
-            <w:proofErr w:type="spellEnd"/>
-            <w:r>
-              <w:t>)</w:t>
+              <w:t> (streaming context)</w:t>
             </w:r>
           </w:p>
         </w:tc>
@@ -14241,13 +13680,8 @@
           </w:tcPr>
           <w:p>
             <w:r>
-              <w:t xml:space="preserve">Hook </w:t>
-            </w:r>
-            <w:proofErr w:type="spellStart"/>
-            <w:r>
-              <w:t>useEstimates</w:t>
-            </w:r>
-            <w:proofErr w:type="spellEnd"/>
+              <w:t>Hook useEstimates</w:t>
+            </w:r>
           </w:p>
         </w:tc>
         <w:tc>
@@ -14409,13 +13843,8 @@
           </w:tcPr>
           <w:p>
             <w:r>
-              <w:t xml:space="preserve">Hook </w:t>
-            </w:r>
-            <w:proofErr w:type="spellStart"/>
-            <w:r>
-              <w:t>useMarketData</w:t>
-            </w:r>
-            <w:proofErr w:type="spellEnd"/>
+              <w:t>Hook useMarketData</w:t>
+            </w:r>
           </w:p>
         </w:tc>
         <w:tc>
@@ -14587,13 +14016,8 @@
           </w:tcPr>
           <w:p>
             <w:r>
-              <w:t xml:space="preserve">Hook </w:t>
-            </w:r>
-            <w:proofErr w:type="spellStart"/>
-            <w:r>
-              <w:t>useRealTimePnL</w:t>
-            </w:r>
-            <w:proofErr w:type="spellEnd"/>
+              <w:t>Hook useRealTimePnL</w:t>
+            </w:r>
           </w:p>
         </w:tc>
         <w:tc>
@@ -14721,21 +14145,7 @@
               <w:rPr>
                 <w:lang w:val="en-US"/>
               </w:rPr>
-              <w:t> (</w:t>
-            </w:r>
-            <w:proofErr w:type="spellStart"/>
-            <w:r>
-              <w:rPr>
-                <w:lang w:val="en-US"/>
-              </w:rPr>
-              <w:t>memoization</w:t>
-            </w:r>
-            <w:proofErr w:type="spellEnd"/>
-            <w:r>
-              <w:rPr>
-                <w:lang w:val="en-US"/>
-              </w:rPr>
-              <w:t xml:space="preserve"> perf)</w:t>
+              <w:t> (memoization perf)</w:t>
             </w:r>
           </w:p>
         </w:tc>
@@ -15233,15 +14643,7 @@
           </w:tcPr>
           <w:p>
             <w:r>
-              <w:t xml:space="preserve">Auth </w:t>
-            </w:r>
-            <w:proofErr w:type="spellStart"/>
-            <w:r>
-              <w:t>Context</w:t>
-            </w:r>
-            <w:proofErr w:type="spellEnd"/>
-            <w:r>
-              <w:t xml:space="preserve"> Provider</w:t>
+              <w:t>Auth Context Provider</w:t>
             </w:r>
           </w:p>
         </w:tc>
@@ -15427,13 +14829,8 @@
           </w:tcPr>
           <w:p>
             <w:r>
-              <w:t xml:space="preserve">Global State </w:t>
-            </w:r>
-            <w:proofErr w:type="spellStart"/>
-            <w:r>
-              <w:t>Zustand</w:t>
-            </w:r>
-            <w:proofErr w:type="spellEnd"/>
+              <w:t>Global State Zustand</w:t>
+            </w:r>
           </w:p>
         </w:tc>
         <w:tc>
@@ -15595,13 +14992,8 @@
           </w:tcPr>
           <w:p>
             <w:r>
-              <w:t xml:space="preserve">Error </w:t>
-            </w:r>
-            <w:proofErr w:type="spellStart"/>
-            <w:r>
-              <w:t>Boundary</w:t>
-            </w:r>
-            <w:proofErr w:type="spellEnd"/>
+              <w:t>Error Boundary</w:t>
+            </w:r>
           </w:p>
         </w:tc>
         <w:tc>
@@ -15764,13 +15156,8 @@
           </w:tcPr>
           <w:p>
             <w:r>
-              <w:t xml:space="preserve">Suspense </w:t>
-            </w:r>
-            <w:proofErr w:type="spellStart"/>
-            <w:r>
-              <w:t>Boundaries</w:t>
-            </w:r>
-            <w:proofErr w:type="spellEnd"/>
+              <w:t>Suspense Boundaries</w:t>
+            </w:r>
           </w:p>
         </w:tc>
         <w:tc>

</xml_diff>

<commit_message>
feat: Initialize FastAPI backend with comprehensive configuration, security middleware, and core API routing.
</commit_message>
<xml_diff>
--- a/IA Model selection.docx
+++ b/IA Model selection.docx
@@ -22,7 +22,23 @@
           <w:b/>
           <w:bCs/>
         </w:rPr>
-        <w:t xml:space="preserve"> IA Model Selection Ottimizzata v2.0</w:t>
+        <w:t xml:space="preserve"> IA Model </w:t>
+      </w:r>
+      <w:proofErr w:type="spellStart"/>
+      <w:r>
+        <w:rPr>
+          <w:b/>
+          <w:bCs/>
+        </w:rPr>
+        <w:t>Selection</w:t>
+      </w:r>
+      <w:proofErr w:type="spellEnd"/>
+      <w:r>
+        <w:rPr>
+          <w:b/>
+          <w:bCs/>
+        </w:rPr>
+        <w:t xml:space="preserve"> Ottimizzata v2.0</w:t>
       </w:r>
     </w:p>
     <w:p>
@@ -376,8 +392,16 @@
               <w:rPr>
                 <w:highlight w:val="green"/>
               </w:rPr>
-              <w:t>Setup Struttura Layer Backend</w:t>
-            </w:r>
+              <w:t xml:space="preserve">Setup Struttura Layer </w:t>
+            </w:r>
+            <w:proofErr w:type="spellStart"/>
+            <w:r>
+              <w:rPr>
+                <w:highlight w:val="green"/>
+              </w:rPr>
+              <w:t>Backend</w:t>
+            </w:r>
+            <w:proofErr w:type="spellEnd"/>
           </w:p>
         </w:tc>
         <w:tc>
@@ -584,7 +608,21 @@
               <w:rPr>
                 <w:highlight w:val="green"/>
               </w:rPr>
-              <w:t>Modello API Response Standard</w:t>
+              <w:t xml:space="preserve">Modello API </w:t>
+            </w:r>
+            <w:proofErr w:type="spellStart"/>
+            <w:r>
+              <w:rPr>
+                <w:highlight w:val="green"/>
+              </w:rPr>
+              <w:t>Response</w:t>
+            </w:r>
+            <w:proofErr w:type="spellEnd"/>
+            <w:r>
+              <w:rPr>
+                <w:highlight w:val="green"/>
+              </w:rPr>
+              <w:t xml:space="preserve"> Standard</w:t>
             </w:r>
           </w:p>
         </w:tc>
@@ -943,7 +981,35 @@
               <w:rPr>
                 <w:highlight w:val="green"/>
               </w:rPr>
-              <w:t> (test Decimal precision)</w:t>
+              <w:t xml:space="preserve"> (test </w:t>
+            </w:r>
+            <w:proofErr w:type="spellStart"/>
+            <w:r>
+              <w:rPr>
+                <w:highlight w:val="green"/>
+              </w:rPr>
+              <w:t>Decimal</w:t>
+            </w:r>
+            <w:proofErr w:type="spellEnd"/>
+            <w:r>
+              <w:rPr>
+                <w:highlight w:val="green"/>
+              </w:rPr>
+              <w:t xml:space="preserve"> </w:t>
+            </w:r>
+            <w:proofErr w:type="spellStart"/>
+            <w:r>
+              <w:rPr>
+                <w:highlight w:val="green"/>
+              </w:rPr>
+              <w:t>precision</w:t>
+            </w:r>
+            <w:proofErr w:type="spellEnd"/>
+            <w:r>
+              <w:rPr>
+                <w:highlight w:val="green"/>
+              </w:rPr>
+              <w:t>)</w:t>
             </w:r>
           </w:p>
         </w:tc>
@@ -1014,8 +1080,16 @@
               <w:rPr>
                 <w:highlight w:val="green"/>
               </w:rPr>
-              <w:t>Value Object Percentage</w:t>
-            </w:r>
+              <w:t xml:space="preserve">Value Object </w:t>
+            </w:r>
+            <w:proofErr w:type="spellStart"/>
+            <w:r>
+              <w:rPr>
+                <w:highlight w:val="green"/>
+              </w:rPr>
+              <w:t>Percentage</w:t>
+            </w:r>
+            <w:proofErr w:type="spellEnd"/>
           </w:p>
         </w:tc>
         <w:tc>
@@ -1241,8 +1315,16 @@
               <w:rPr>
                 <w:highlight w:val="green"/>
               </w:rPr>
-              <w:t>Value Object PriceTarget</w:t>
-            </w:r>
+              <w:t xml:space="preserve">Value Object </w:t>
+            </w:r>
+            <w:proofErr w:type="spellStart"/>
+            <w:r>
+              <w:rPr>
+                <w:highlight w:val="green"/>
+              </w:rPr>
+              <w:t>PriceTarget</w:t>
+            </w:r>
+            <w:proofErr w:type="spellEnd"/>
           </w:p>
         </w:tc>
         <w:tc>
@@ -1397,7 +1479,23 @@
                 <w:highlight w:val="green"/>
                 <w:lang w:val="en-US"/>
               </w:rPr>
-              <w:t> (validazioni LONG/SHORT)</w:t>
+              <w:t> (</w:t>
+            </w:r>
+            <w:proofErr w:type="spellStart"/>
+            <w:r>
+              <w:rPr>
+                <w:highlight w:val="green"/>
+                <w:lang w:val="en-US"/>
+              </w:rPr>
+              <w:t>validazioni</w:t>
+            </w:r>
+            <w:proofErr w:type="spellEnd"/>
+            <w:r>
+              <w:rPr>
+                <w:highlight w:val="green"/>
+                <w:lang w:val="en-US"/>
+              </w:rPr>
+              <w:t xml:space="preserve"> LONG/SHORT)</w:t>
             </w:r>
           </w:p>
         </w:tc>
@@ -1464,11 +1562,33 @@
                 <w:highlight w:val="green"/>
               </w:rPr>
             </w:pPr>
-            <w:r>
-              <w:rPr>
-                <w:highlight w:val="green"/>
-              </w:rPr>
-              <w:t>Config Pydantic Settings</w:t>
+            <w:proofErr w:type="spellStart"/>
+            <w:r>
+              <w:rPr>
+                <w:highlight w:val="green"/>
+              </w:rPr>
+              <w:t>Config</w:t>
+            </w:r>
+            <w:proofErr w:type="spellEnd"/>
+            <w:r>
+              <w:rPr>
+                <w:highlight w:val="green"/>
+              </w:rPr>
+              <w:t xml:space="preserve"> </w:t>
+            </w:r>
+            <w:proofErr w:type="spellStart"/>
+            <w:r>
+              <w:rPr>
+                <w:highlight w:val="green"/>
+              </w:rPr>
+              <w:t>Pydantic</w:t>
+            </w:r>
+            <w:proofErr w:type="spellEnd"/>
+            <w:r>
+              <w:rPr>
+                <w:highlight w:val="green"/>
+              </w:rPr>
+              <w:t xml:space="preserve"> Settings</w:t>
             </w:r>
           </w:p>
         </w:tc>
@@ -1899,11 +2019,33 @@
                 <w:highlight w:val="green"/>
               </w:rPr>
             </w:pPr>
-            <w:r>
-              <w:rPr>
-                <w:highlight w:val="green"/>
-              </w:rPr>
-              <w:t>Wrapper TypeScript Decimali</w:t>
+            <w:proofErr w:type="spellStart"/>
+            <w:r>
+              <w:rPr>
+                <w:highlight w:val="green"/>
+              </w:rPr>
+              <w:t>Wrapper</w:t>
+            </w:r>
+            <w:proofErr w:type="spellEnd"/>
+            <w:r>
+              <w:rPr>
+                <w:highlight w:val="green"/>
+              </w:rPr>
+              <w:t xml:space="preserve"> </w:t>
+            </w:r>
+            <w:proofErr w:type="spellStart"/>
+            <w:r>
+              <w:rPr>
+                <w:highlight w:val="green"/>
+              </w:rPr>
+              <w:t>TypeScript</w:t>
+            </w:r>
+            <w:proofErr w:type="spellEnd"/>
+            <w:r>
+              <w:rPr>
+                <w:highlight w:val="green"/>
+              </w:rPr>
+              <w:t xml:space="preserve"> Decimali</w:t>
             </w:r>
           </w:p>
         </w:tc>
@@ -2637,8 +2779,30 @@
               <w:rPr>
                 <w:highlight w:val="green"/>
               </w:rPr>
-              <w:t>Docker Compose PostgreSQL/Redis</w:t>
-            </w:r>
+              <w:t xml:space="preserve">Docker Compose </w:t>
+            </w:r>
+            <w:proofErr w:type="spellStart"/>
+            <w:r>
+              <w:rPr>
+                <w:highlight w:val="green"/>
+              </w:rPr>
+              <w:t>PostgreSQL</w:t>
+            </w:r>
+            <w:proofErr w:type="spellEnd"/>
+            <w:r>
+              <w:rPr>
+                <w:highlight w:val="green"/>
+              </w:rPr>
+              <w:t>/</w:t>
+            </w:r>
+            <w:proofErr w:type="spellStart"/>
+            <w:r>
+              <w:rPr>
+                <w:highlight w:val="green"/>
+              </w:rPr>
+              <w:t>Redis</w:t>
+            </w:r>
+            <w:proofErr w:type="spellEnd"/>
           </w:p>
         </w:tc>
         <w:tc>
@@ -2788,7 +2952,35 @@
               <w:rPr>
                 <w:highlight w:val="green"/>
               </w:rPr>
-              <w:t> (healthcheck syntax)</w:t>
+              <w:t> (</w:t>
+            </w:r>
+            <w:proofErr w:type="spellStart"/>
+            <w:r>
+              <w:rPr>
+                <w:highlight w:val="green"/>
+              </w:rPr>
+              <w:t>healthcheck</w:t>
+            </w:r>
+            <w:proofErr w:type="spellEnd"/>
+            <w:r>
+              <w:rPr>
+                <w:highlight w:val="green"/>
+              </w:rPr>
+              <w:t xml:space="preserve"> </w:t>
+            </w:r>
+            <w:proofErr w:type="spellStart"/>
+            <w:r>
+              <w:rPr>
+                <w:highlight w:val="green"/>
+              </w:rPr>
+              <w:t>syntax</w:t>
+            </w:r>
+            <w:proofErr w:type="spellEnd"/>
+            <w:r>
+              <w:rPr>
+                <w:highlight w:val="green"/>
+              </w:rPr>
+              <w:t>)</w:t>
             </w:r>
           </w:p>
         </w:tc>
@@ -2859,7 +3051,21 @@
               <w:rPr>
                 <w:highlight w:val="green"/>
               </w:rPr>
-              <w:t>Modello Ticker + SQLAlchemy Base</w:t>
+              <w:t xml:space="preserve">Modello Ticker + </w:t>
+            </w:r>
+            <w:proofErr w:type="spellStart"/>
+            <w:r>
+              <w:rPr>
+                <w:highlight w:val="green"/>
+              </w:rPr>
+              <w:t>SQLAlchemy</w:t>
+            </w:r>
+            <w:proofErr w:type="spellEnd"/>
+            <w:r>
+              <w:rPr>
+                <w:highlight w:val="green"/>
+              </w:rPr>
+              <w:t xml:space="preserve"> Base</w:t>
             </w:r>
           </w:p>
         </w:tc>
@@ -3237,7 +3443,21 @@
               <w:rPr>
                 <w:highlight w:val="green"/>
               </w:rPr>
-              <w:t> (DECIMAL validation)</w:t>
+              <w:t xml:space="preserve"> (DECIMAL </w:t>
+            </w:r>
+            <w:proofErr w:type="spellStart"/>
+            <w:r>
+              <w:rPr>
+                <w:highlight w:val="green"/>
+              </w:rPr>
+              <w:t>validation</w:t>
+            </w:r>
+            <w:proofErr w:type="spellEnd"/>
+            <w:r>
+              <w:rPr>
+                <w:highlight w:val="green"/>
+              </w:rPr>
+              <w:t>)</w:t>
             </w:r>
           </w:p>
         </w:tc>
@@ -3304,11 +3524,19 @@
                 <w:highlight w:val="green"/>
               </w:rPr>
             </w:pPr>
-            <w:r>
-              <w:rPr>
-                <w:highlight w:val="green"/>
-              </w:rPr>
-              <w:t>EstimateEvent (Event Sourcing)</w:t>
+            <w:proofErr w:type="spellStart"/>
+            <w:r>
+              <w:rPr>
+                <w:highlight w:val="green"/>
+              </w:rPr>
+              <w:t>EstimateEvent</w:t>
+            </w:r>
+            <w:proofErr w:type="spellEnd"/>
+            <w:r>
+              <w:rPr>
+                <w:highlight w:val="green"/>
+              </w:rPr>
+              <w:t xml:space="preserve"> (Event Sourcing)</w:t>
             </w:r>
           </w:p>
         </w:tc>
@@ -3531,11 +3759,19 @@
                 <w:highlight w:val="green"/>
               </w:rPr>
             </w:pPr>
-            <w:r>
-              <w:rPr>
-                <w:highlight w:val="green"/>
-              </w:rPr>
-              <w:t>MarketData (OHLCV)</w:t>
+            <w:proofErr w:type="spellStart"/>
+            <w:r>
+              <w:rPr>
+                <w:highlight w:val="green"/>
+              </w:rPr>
+              <w:t>MarketData</w:t>
+            </w:r>
+            <w:proofErr w:type="spellEnd"/>
+            <w:r>
+              <w:rPr>
+                <w:highlight w:val="green"/>
+              </w:rPr>
+              <w:t xml:space="preserve"> (OHLCV)</w:t>
             </w:r>
           </w:p>
         </w:tc>
@@ -3961,12 +4197,14 @@
                 <w:highlight w:val="green"/>
               </w:rPr>
             </w:pPr>
+            <w:proofErr w:type="spellStart"/>
             <w:r>
               <w:rPr>
                 <w:highlight w:val="green"/>
               </w:rPr>
               <w:t>SyncJob</w:t>
             </w:r>
+            <w:proofErr w:type="spellEnd"/>
           </w:p>
         </w:tc>
         <w:tc>
@@ -4165,12 +4403,14 @@
                 <w:highlight w:val="green"/>
               </w:rPr>
             </w:pPr>
+            <w:proofErr w:type="spellStart"/>
             <w:r>
               <w:rPr>
                 <w:highlight w:val="green"/>
               </w:rPr>
               <w:t>AiModelRun</w:t>
             </w:r>
+            <w:proofErr w:type="spellEnd"/>
           </w:p>
         </w:tc>
         <w:tc>
@@ -4377,7 +4617,21 @@
               <w:rPr>
                 <w:highlight w:val="green"/>
               </w:rPr>
-              <w:t>Setup Alembic Migrazioni</w:t>
+              <w:t xml:space="preserve">Setup </w:t>
+            </w:r>
+            <w:proofErr w:type="spellStart"/>
+            <w:r>
+              <w:rPr>
+                <w:highlight w:val="green"/>
+              </w:rPr>
+              <w:t>Alembic</w:t>
+            </w:r>
+            <w:proofErr w:type="spellEnd"/>
+            <w:r>
+              <w:rPr>
+                <w:highlight w:val="green"/>
+              </w:rPr>
+              <w:t xml:space="preserve"> Migrazioni</w:t>
             </w:r>
           </w:p>
         </w:tc>
@@ -4599,11 +4853,19 @@
                 <w:highlight w:val="green"/>
               </w:rPr>
             </w:pPr>
-            <w:r>
-              <w:rPr>
-                <w:highlight w:val="green"/>
-              </w:rPr>
-              <w:t>Materialized View (CQRS)</w:t>
+            <w:proofErr w:type="spellStart"/>
+            <w:r>
+              <w:rPr>
+                <w:highlight w:val="green"/>
+              </w:rPr>
+              <w:t>Materialized</w:t>
+            </w:r>
+            <w:proofErr w:type="spellEnd"/>
+            <w:r>
+              <w:rPr>
+                <w:highlight w:val="green"/>
+              </w:rPr>
+              <w:t xml:space="preserve"> View (CQRS)</w:t>
             </w:r>
           </w:p>
         </w:tc>
@@ -5335,8 +5597,16 @@
               <w:rPr>
                 <w:highlight w:val="green"/>
               </w:rPr>
-              <w:t>Repository MarketData</w:t>
-            </w:r>
+              <w:t xml:space="preserve">Repository </w:t>
+            </w:r>
+            <w:proofErr w:type="spellStart"/>
+            <w:r>
+              <w:rPr>
+                <w:highlight w:val="green"/>
+              </w:rPr>
+              <w:t>MarketData</w:t>
+            </w:r>
+            <w:proofErr w:type="spellEnd"/>
           </w:p>
         </w:tc>
         <w:tc>
@@ -5491,7 +5761,23 @@
                 <w:highlight w:val="green"/>
                 <w:lang w:val="en-US"/>
               </w:rPr>
-              <w:t> (upsert N+1 check)</w:t>
+              <w:t> (</w:t>
+            </w:r>
+            <w:proofErr w:type="spellStart"/>
+            <w:r>
+              <w:rPr>
+                <w:highlight w:val="green"/>
+                <w:lang w:val="en-US"/>
+              </w:rPr>
+              <w:t>upsert</w:t>
+            </w:r>
+            <w:proofErr w:type="spellEnd"/>
+            <w:r>
+              <w:rPr>
+                <w:highlight w:val="green"/>
+                <w:lang w:val="en-US"/>
+              </w:rPr>
+              <w:t xml:space="preserve"> N+1 check)</w:t>
             </w:r>
           </w:p>
         </w:tc>
@@ -5562,8 +5848,16 @@
               <w:rPr>
                 <w:highlight w:val="green"/>
               </w:rPr>
-              <w:t>Service EstimateService</w:t>
-            </w:r>
+              <w:t xml:space="preserve">Service </w:t>
+            </w:r>
+            <w:proofErr w:type="spellStart"/>
+            <w:r>
+              <w:rPr>
+                <w:highlight w:val="green"/>
+              </w:rPr>
+              <w:t>EstimateService</w:t>
+            </w:r>
+            <w:proofErr w:type="spellEnd"/>
           </w:p>
         </w:tc>
         <w:tc>
@@ -5785,11 +6079,19 @@
                 <w:highlight w:val="green"/>
               </w:rPr>
             </w:pPr>
-            <w:r>
-              <w:rPr>
-                <w:highlight w:val="green"/>
-              </w:rPr>
-              <w:t>EstimateHistory (Event Sourcing)</w:t>
+            <w:proofErr w:type="spellStart"/>
+            <w:r>
+              <w:rPr>
+                <w:highlight w:val="green"/>
+              </w:rPr>
+              <w:t>EstimateHistory</w:t>
+            </w:r>
+            <w:proofErr w:type="spellEnd"/>
+            <w:r>
+              <w:rPr>
+                <w:highlight w:val="green"/>
+              </w:rPr>
+              <w:t xml:space="preserve"> (Event Sourcing)</w:t>
             </w:r>
           </w:p>
         </w:tc>
@@ -6030,8 +6332,16 @@
               <w:rPr>
                 <w:highlight w:val="green"/>
               </w:rPr>
-              <w:t>API Router Estimates</w:t>
-            </w:r>
+              <w:t xml:space="preserve">API Router </w:t>
+            </w:r>
+            <w:proofErr w:type="spellStart"/>
+            <w:r>
+              <w:rPr>
+                <w:highlight w:val="green"/>
+              </w:rPr>
+              <w:t>Estimates</w:t>
+            </w:r>
+            <w:proofErr w:type="spellEnd"/>
           </w:p>
         </w:tc>
         <w:tc>
@@ -6442,11 +6752,19 @@
                 <w:highlight w:val="green"/>
               </w:rPr>
             </w:pPr>
-            <w:r>
-              <w:rPr>
-                <w:highlight w:val="green"/>
-              </w:rPr>
-              <w:t>MarketDataProvider Astratto</w:t>
+            <w:proofErr w:type="spellStart"/>
+            <w:r>
+              <w:rPr>
+                <w:highlight w:val="green"/>
+              </w:rPr>
+              <w:t>MarketDataProvider</w:t>
+            </w:r>
+            <w:proofErr w:type="spellEnd"/>
+            <w:r>
+              <w:rPr>
+                <w:highlight w:val="green"/>
+              </w:rPr>
+              <w:t xml:space="preserve"> Astratto</w:t>
             </w:r>
           </w:p>
         </w:tc>
@@ -6597,7 +6915,21 @@
               <w:rPr>
                 <w:highlight w:val="green"/>
               </w:rPr>
-              <w:t> (protocol ABC test)</w:t>
+              <w:t> (</w:t>
+            </w:r>
+            <w:proofErr w:type="spellStart"/>
+            <w:r>
+              <w:rPr>
+                <w:highlight w:val="green"/>
+              </w:rPr>
+              <w:t>protocol</w:t>
+            </w:r>
+            <w:proofErr w:type="spellEnd"/>
+            <w:r>
+              <w:rPr>
+                <w:highlight w:val="green"/>
+              </w:rPr>
+              <w:t xml:space="preserve"> ABC test)</w:t>
             </w:r>
           </w:p>
         </w:tc>
@@ -6842,8 +7174,17 @@
           <w:b/>
           <w:bCs/>
         </w:rPr>
-        <w:t>Google Drive &amp; Sync</w:t>
+        <w:t xml:space="preserve">Google Drive &amp; </w:t>
       </w:r>
+      <w:proofErr w:type="spellStart"/>
+      <w:r>
+        <w:rPr>
+          <w:b/>
+          <w:bCs/>
+        </w:rPr>
+        <w:t>Sync</w:t>
+      </w:r>
+      <w:proofErr w:type="spellEnd"/>
     </w:p>
     <w:tbl>
       <w:tblPr>
@@ -7556,7 +7897,23 @@
                 <w:highlight w:val="green"/>
                 <w:lang w:val="en-US"/>
               </w:rPr>
-              <w:t> (120+ col UTF-8 BOM)</w:t>
+              <w:t xml:space="preserve"> (120+ </w:t>
+            </w:r>
+            <w:proofErr w:type="gramStart"/>
+            <w:r>
+              <w:rPr>
+                <w:highlight w:val="green"/>
+                <w:lang w:val="en-US"/>
+              </w:rPr>
+              <w:t>col</w:t>
+            </w:r>
+            <w:proofErr w:type="gramEnd"/>
+            <w:r>
+              <w:rPr>
+                <w:highlight w:val="green"/>
+                <w:lang w:val="en-US"/>
+              </w:rPr>
+              <w:t xml:space="preserve"> UTF-8 BOM)</w:t>
             </w:r>
           </w:p>
         </w:tc>
@@ -7623,11 +7980,19 @@
                 <w:highlight w:val="green"/>
               </w:rPr>
             </w:pPr>
-            <w:r>
-              <w:rPr>
-                <w:highlight w:val="green"/>
-              </w:rPr>
-              <w:t>Sync Service</w:t>
+            <w:proofErr w:type="spellStart"/>
+            <w:r>
+              <w:rPr>
+                <w:highlight w:val="green"/>
+              </w:rPr>
+              <w:t>Sync</w:t>
+            </w:r>
+            <w:proofErr w:type="spellEnd"/>
+            <w:r>
+              <w:rPr>
+                <w:highlight w:val="green"/>
+              </w:rPr>
+              <w:t xml:space="preserve"> Service</w:t>
             </w:r>
           </w:p>
         </w:tc>
@@ -7867,7 +8232,21 @@
               <w:rPr>
                 <w:highlight w:val="green"/>
               </w:rPr>
-              <w:t>Test Retro-compatibilità E2E</w:t>
+              <w:t xml:space="preserve">Test </w:t>
+            </w:r>
+            <w:proofErr w:type="gramStart"/>
+            <w:r>
+              <w:rPr>
+                <w:highlight w:val="green"/>
+              </w:rPr>
+              <w:t>Retro-compatibilità</w:t>
+            </w:r>
+            <w:proofErr w:type="gramEnd"/>
+            <w:r>
+              <w:rPr>
+                <w:highlight w:val="green"/>
+              </w:rPr>
+              <w:t xml:space="preserve"> E2E</w:t>
             </w:r>
           </w:p>
         </w:tc>
@@ -8095,8 +8474,16 @@
               <w:rPr>
                 <w:highlight w:val="green"/>
               </w:rPr>
-              <w:t>Background Worker APScheduler</w:t>
-            </w:r>
+              <w:t xml:space="preserve">Background Worker </w:t>
+            </w:r>
+            <w:proofErr w:type="spellStart"/>
+            <w:r>
+              <w:rPr>
+                <w:highlight w:val="green"/>
+              </w:rPr>
+              <w:t>APScheduler</w:t>
+            </w:r>
+            <w:proofErr w:type="spellEnd"/>
           </w:p>
         </w:tc>
         <w:tc>
@@ -8322,7 +8709,21 @@
               <w:rPr>
                 <w:highlight w:val="green"/>
               </w:rPr>
-              <w:t>Pattern Outbox Eventi</w:t>
+              <w:t xml:space="preserve">Pattern </w:t>
+            </w:r>
+            <w:proofErr w:type="spellStart"/>
+            <w:r>
+              <w:rPr>
+                <w:highlight w:val="green"/>
+              </w:rPr>
+              <w:t>Outbox</w:t>
+            </w:r>
+            <w:proofErr w:type="spellEnd"/>
+            <w:r>
+              <w:rPr>
+                <w:highlight w:val="green"/>
+              </w:rPr>
+              <w:t xml:space="preserve"> Eventi</w:t>
             </w:r>
           </w:p>
         </w:tc>
@@ -9039,10 +9440,16 @@
             <w:hideMark/>
           </w:tcPr>
           <w:p>
-            <w:r>
-              <w:rPr>
-                <w:b/>
-                <w:bCs/>
+            <w:pPr>
+              <w:rPr>
+                <w:highlight w:val="green"/>
+              </w:rPr>
+            </w:pPr>
+            <w:r>
+              <w:rPr>
+                <w:b/>
+                <w:bCs/>
+                <w:highlight w:val="green"/>
               </w:rPr>
               <w:t>3.2</w:t>
             </w:r>
@@ -9067,34 +9474,70 @@
             <w:hideMark/>
           </w:tcPr>
           <w:p>
-            <w:r>
-              <w:t>Rate Limiting SlowAPI</w:t>
-            </w:r>
-          </w:p>
-        </w:tc>
-        <w:tc>
-          <w:tcPr>
-            <w:tcW w:w="0" w:type="auto"/>
-            <w:tcBorders>
-              <w:top w:val="single" w:sz="2" w:space="0" w:color="auto"/>
-              <w:left w:val="single" w:sz="2" w:space="0" w:color="auto"/>
-              <w:bottom w:val="single" w:sz="6" w:space="0" w:color="auto"/>
-              <w:right w:val="single" w:sz="6" w:space="0" w:color="auto"/>
-            </w:tcBorders>
-            <w:tcMar>
-              <w:top w:w="137" w:type="dxa"/>
-              <w:left w:w="120" w:type="dxa"/>
-              <w:bottom w:w="137" w:type="dxa"/>
-              <w:right w:w="120" w:type="dxa"/>
-            </w:tcMar>
-            <w:vAlign w:val="bottom"/>
-            <w:hideMark/>
-          </w:tcPr>
-          <w:p>
-            <w:r>
-              <w:rPr>
-                <w:b/>
-                <w:bCs/>
+            <w:pPr>
+              <w:rPr>
+                <w:highlight w:val="green"/>
+              </w:rPr>
+            </w:pPr>
+            <w:r>
+              <w:rPr>
+                <w:highlight w:val="green"/>
+              </w:rPr>
+              <w:t xml:space="preserve">Rate </w:t>
+            </w:r>
+            <w:proofErr w:type="spellStart"/>
+            <w:r>
+              <w:rPr>
+                <w:highlight w:val="green"/>
+              </w:rPr>
+              <w:t>Limiting</w:t>
+            </w:r>
+            <w:proofErr w:type="spellEnd"/>
+            <w:r>
+              <w:rPr>
+                <w:highlight w:val="green"/>
+              </w:rPr>
+              <w:t xml:space="preserve"> </w:t>
+            </w:r>
+            <w:proofErr w:type="spellStart"/>
+            <w:r>
+              <w:rPr>
+                <w:highlight w:val="green"/>
+              </w:rPr>
+              <w:t>SlowAPI</w:t>
+            </w:r>
+            <w:proofErr w:type="spellEnd"/>
+          </w:p>
+        </w:tc>
+        <w:tc>
+          <w:tcPr>
+            <w:tcW w:w="0" w:type="auto"/>
+            <w:tcBorders>
+              <w:top w:val="single" w:sz="2" w:space="0" w:color="auto"/>
+              <w:left w:val="single" w:sz="2" w:space="0" w:color="auto"/>
+              <w:bottom w:val="single" w:sz="6" w:space="0" w:color="auto"/>
+              <w:right w:val="single" w:sz="6" w:space="0" w:color="auto"/>
+            </w:tcBorders>
+            <w:tcMar>
+              <w:top w:w="137" w:type="dxa"/>
+              <w:left w:w="120" w:type="dxa"/>
+              <w:bottom w:w="137" w:type="dxa"/>
+              <w:right w:w="120" w:type="dxa"/>
+            </w:tcMar>
+            <w:vAlign w:val="bottom"/>
+            <w:hideMark/>
+          </w:tcPr>
+          <w:p>
+            <w:pPr>
+              <w:rPr>
+                <w:highlight w:val="green"/>
+              </w:rPr>
+            </w:pPr>
+            <w:r>
+              <w:rPr>
+                <w:b/>
+                <w:bCs/>
+                <w:highlight w:val="green"/>
               </w:rPr>
               <w:t>GPT-4o</w:t>
             </w:r>
@@ -9119,7 +9562,15 @@
             <w:hideMark/>
           </w:tcPr>
           <w:p>
-            <w:r>
+            <w:pPr>
+              <w:rPr>
+                <w:highlight w:val="green"/>
+              </w:rPr>
+            </w:pPr>
+            <w:r>
+              <w:rPr>
+                <w:highlight w:val="green"/>
+              </w:rPr>
               <w:t>GPT-5 mini</w:t>
             </w:r>
           </w:p>
@@ -9143,7 +9594,15 @@
             <w:hideMark/>
           </w:tcPr>
           <w:p>
-            <w:r>
+            <w:pPr>
+              <w:rPr>
+                <w:highlight w:val="green"/>
+              </w:rPr>
+            </w:pPr>
+            <w:r>
+              <w:rPr>
+                <w:highlight w:val="green"/>
+              </w:rPr>
               <w:t>0x/0x</w:t>
             </w:r>
           </w:p>
@@ -9169,18 +9628,21 @@
           <w:p>
             <w:pPr>
               <w:rPr>
+                <w:highlight w:val="green"/>
                 <w:lang w:val="en-US"/>
               </w:rPr>
             </w:pPr>
             <w:r>
               <w:rPr>
                 <w:rFonts w:ascii="Segoe UI Emoji" w:hAnsi="Segoe UI Emoji" w:cs="Segoe UI Emoji"/>
+                <w:highlight w:val="green"/>
                 <w:lang w:val="en-US"/>
               </w:rPr>
               <w:t>✅</w:t>
             </w:r>
             <w:r>
               <w:rPr>
+                <w:highlight w:val="green"/>
                 <w:lang w:val="en-US"/>
               </w:rPr>
               <w:t> </w:t>
@@ -9189,12 +9651,14 @@
               <w:rPr>
                 <w:b/>
                 <w:bCs/>
+                <w:highlight w:val="green"/>
                 <w:lang w:val="en-US"/>
               </w:rPr>
               <w:t>DeepSeek-V3.2</w:t>
             </w:r>
             <w:r>
               <w:rPr>
+                <w:highlight w:val="green"/>
                 <w:lang w:val="en-US"/>
               </w:rPr>
               <w:t> (Redis storage test)</w:t>
@@ -9254,7 +9718,15 @@
           </w:tcPr>
           <w:p>
             <w:r>
-              <w:t>Input Validation Avanzata</w:t>
+              <w:t xml:space="preserve">Input </w:t>
+            </w:r>
+            <w:proofErr w:type="spellStart"/>
+            <w:r>
+              <w:t>Validation</w:t>
+            </w:r>
+            <w:proofErr w:type="spellEnd"/>
+            <w:r>
+              <w:t xml:space="preserve"> Avanzata</w:t>
             </w:r>
           </w:p>
         </w:tc>
@@ -9439,9 +9911,27 @@
             <w:hideMark/>
           </w:tcPr>
           <w:p>
-            <w:r>
-              <w:t>Encryption at Rest</w:t>
-            </w:r>
+            <w:proofErr w:type="spellStart"/>
+            <w:r>
+              <w:t>Encryption</w:t>
+            </w:r>
+            <w:proofErr w:type="spellEnd"/>
+            <w:r>
+              <w:t xml:space="preserve"> </w:t>
+            </w:r>
+            <w:proofErr w:type="spellStart"/>
+            <w:r>
+              <w:t>at</w:t>
+            </w:r>
+            <w:proofErr w:type="spellEnd"/>
+            <w:r>
+              <w:t xml:space="preserve"> </w:t>
+            </w:r>
+            <w:proofErr w:type="spellStart"/>
+            <w:r>
+              <w:t>Rest</w:t>
+            </w:r>
+            <w:proofErr w:type="spellEnd"/>
           </w:p>
         </w:tc>
         <w:tc>
@@ -9625,9 +10115,19 @@
             <w:hideMark/>
           </w:tcPr>
           <w:p>
-            <w:r>
-              <w:t>Structured Logging</w:t>
-            </w:r>
+            <w:proofErr w:type="spellStart"/>
+            <w:r>
+              <w:t>Structured</w:t>
+            </w:r>
+            <w:proofErr w:type="spellEnd"/>
+            <w:r>
+              <w:t xml:space="preserve"> </w:t>
+            </w:r>
+            <w:proofErr w:type="spellStart"/>
+            <w:r>
+              <w:t>Logging</w:t>
+            </w:r>
+            <w:proofErr w:type="spellEnd"/>
           </w:p>
         </w:tc>
         <w:tc>
@@ -10278,7 +10778,23 @@
               <w:t>Gemini 3 Flash</w:t>
             </w:r>
             <w:r>
-              <w:t> (anomaly detection)</w:t>
+              <w:t> (</w:t>
+            </w:r>
+            <w:proofErr w:type="spellStart"/>
+            <w:r>
+              <w:t>anomaly</w:t>
+            </w:r>
+            <w:proofErr w:type="spellEnd"/>
+            <w:r>
+              <w:t xml:space="preserve"> </w:t>
+            </w:r>
+            <w:proofErr w:type="spellStart"/>
+            <w:r>
+              <w:t>detection</w:t>
+            </w:r>
+            <w:proofErr w:type="spellEnd"/>
+            <w:r>
+              <w:t>)</w:t>
             </w:r>
           </w:p>
         </w:tc>
@@ -10335,7 +10851,15 @@
           </w:tcPr>
           <w:p>
             <w:r>
-              <w:t>Data Lineage Tracking</w:t>
+              <w:t xml:space="preserve">Data </w:t>
+            </w:r>
+            <w:proofErr w:type="spellStart"/>
+            <w:r>
+              <w:t>Lineage</w:t>
+            </w:r>
+            <w:proofErr w:type="spellEnd"/>
+            <w:r>
+              <w:t xml:space="preserve"> Tracking</w:t>
             </w:r>
           </w:p>
         </w:tc>
@@ -10624,7 +11148,23 @@
               <w:t>GPT-5 mini</w:t>
             </w:r>
             <w:r>
-              <w:t> (QueuePool metrics)</w:t>
+              <w:t> (</w:t>
+            </w:r>
+            <w:proofErr w:type="spellStart"/>
+            <w:r>
+              <w:t>QueuePool</w:t>
+            </w:r>
+            <w:proofErr w:type="spellEnd"/>
+            <w:r>
+              <w:t xml:space="preserve"> </w:t>
+            </w:r>
+            <w:proofErr w:type="spellStart"/>
+            <w:r>
+              <w:t>metrics</w:t>
+            </w:r>
+            <w:proofErr w:type="spellEnd"/>
+            <w:r>
+              <w:t>)</w:t>
             </w:r>
           </w:p>
         </w:tc>
@@ -10680,9 +11220,19 @@
             <w:hideMark/>
           </w:tcPr>
           <w:p>
-            <w:r>
-              <w:t>Cursor-Based Pagination</w:t>
-            </w:r>
+            <w:proofErr w:type="spellStart"/>
+            <w:r>
+              <w:t>Cursor-Based</w:t>
+            </w:r>
+            <w:proofErr w:type="spellEnd"/>
+            <w:r>
+              <w:t xml:space="preserve"> </w:t>
+            </w:r>
+            <w:proofErr w:type="spellStart"/>
+            <w:r>
+              <w:t>Pagination</w:t>
+            </w:r>
+            <w:proofErr w:type="spellEnd"/>
           </w:p>
         </w:tc>
         <w:tc>
@@ -10810,7 +11360,21 @@
               <w:rPr>
                 <w:lang w:val="en-US"/>
               </w:rPr>
-              <w:t> (O(1) perf test)</w:t>
+              <w:t> (</w:t>
+            </w:r>
+            <w:proofErr w:type="gramStart"/>
+            <w:r>
+              <w:rPr>
+                <w:lang w:val="en-US"/>
+              </w:rPr>
+              <w:t>O(</w:t>
+            </w:r>
+            <w:proofErr w:type="gramEnd"/>
+            <w:r>
+              <w:rPr>
+                <w:lang w:val="en-US"/>
+              </w:rPr>
+              <w:t>1) perf test)</w:t>
             </w:r>
           </w:p>
         </w:tc>
@@ -10983,7 +11547,15 @@
               <w:t>GPT-5 mini</w:t>
             </w:r>
             <w:r>
-              <w:t> (multi-service orchestration)</w:t>
+              <w:t xml:space="preserve"> (multi-service </w:t>
+            </w:r>
+            <w:proofErr w:type="spellStart"/>
+            <w:r>
+              <w:t>orchestration</w:t>
+            </w:r>
+            <w:proofErr w:type="spellEnd"/>
+            <w:r>
+              <w:t>)</w:t>
             </w:r>
           </w:p>
         </w:tc>
@@ -11512,8 +12084,13 @@
           </w:tcPr>
           <w:p>
             <w:r>
-              <w:t>Struttura Feature Modules</w:t>
-            </w:r>
+              <w:t xml:space="preserve">Struttura Feature </w:t>
+            </w:r>
+            <w:proofErr w:type="spellStart"/>
+            <w:r>
+              <w:t>Modules</w:t>
+            </w:r>
+            <w:proofErr w:type="spellEnd"/>
           </w:p>
         </w:tc>
         <w:tc>
@@ -11674,8 +12251,13 @@
             <w:hideMark/>
           </w:tcPr>
           <w:p>
-            <w:r>
-              <w:t>Config React Query</w:t>
+            <w:proofErr w:type="spellStart"/>
+            <w:r>
+              <w:t>Config</w:t>
+            </w:r>
+            <w:proofErr w:type="spellEnd"/>
+            <w:r>
+              <w:t xml:space="preserve"> React Query</w:t>
             </w:r>
           </w:p>
         </w:tc>
@@ -11791,7 +12373,15 @@
               <w:t>GPT-5 mini</w:t>
             </w:r>
             <w:r>
-              <w:t> (QueryClient test)</w:t>
+              <w:t> (</w:t>
+            </w:r>
+            <w:proofErr w:type="spellStart"/>
+            <w:r>
+              <w:t>QueryClient</w:t>
+            </w:r>
+            <w:proofErr w:type="spellEnd"/>
+            <w:r>
+              <w:t xml:space="preserve"> test)</w:t>
             </w:r>
           </w:p>
         </w:tc>
@@ -11964,7 +12554,15 @@
               <w:t>GPT-5 mini</w:t>
             </w:r>
             <w:r>
-              <w:t> (interceptors test)</w:t>
+              <w:t> (</w:t>
+            </w:r>
+            <w:proofErr w:type="spellStart"/>
+            <w:r>
+              <w:t>interceptors</w:t>
+            </w:r>
+            <w:proofErr w:type="spellEnd"/>
+            <w:r>
+              <w:t xml:space="preserve"> test)</w:t>
             </w:r>
           </w:p>
         </w:tc>
@@ -12485,8 +13083,13 @@
           </w:tcPr>
           <w:p>
             <w:r>
-              <w:t>Component EstimateCard</w:t>
-            </w:r>
+              <w:t xml:space="preserve">Component </w:t>
+            </w:r>
+            <w:proofErr w:type="spellStart"/>
+            <w:r>
+              <w:t>EstimateCard</w:t>
+            </w:r>
+            <w:proofErr w:type="spellEnd"/>
           </w:p>
         </w:tc>
         <w:tc>
@@ -12648,8 +13251,13 @@
           </w:tcPr>
           <w:p>
             <w:r>
-              <w:t>Component EstimateForm</w:t>
-            </w:r>
+              <w:t xml:space="preserve">Component </w:t>
+            </w:r>
+            <w:proofErr w:type="spellStart"/>
+            <w:r>
+              <w:t>EstimateForm</w:t>
+            </w:r>
+            <w:proofErr w:type="spellEnd"/>
           </w:p>
         </w:tc>
         <w:tc>
@@ -12834,8 +13442,13 @@
           </w:tcPr>
           <w:p>
             <w:r>
-              <w:t>Component PriceChart</w:t>
-            </w:r>
+              <w:t xml:space="preserve">Component </w:t>
+            </w:r>
+            <w:proofErr w:type="spellStart"/>
+            <w:r>
+              <w:t>PriceChart</w:t>
+            </w:r>
+            <w:proofErr w:type="spellEnd"/>
           </w:p>
         </w:tc>
         <w:tc>
@@ -12950,7 +13563,15 @@
               <w:t>Gemini 3 Flash</w:t>
             </w:r>
             <w:r>
-              <w:t> (responsive test)</w:t>
+              <w:t> (</w:t>
+            </w:r>
+            <w:proofErr w:type="gramStart"/>
+            <w:r>
+              <w:t>responsive test</w:t>
+            </w:r>
+            <w:proofErr w:type="gramEnd"/>
+            <w:r>
+              <w:t>)</w:t>
             </w:r>
           </w:p>
         </w:tc>
@@ -13007,8 +13628,13 @@
           </w:tcPr>
           <w:p>
             <w:r>
-              <w:t>Component PortfolioSummary</w:t>
-            </w:r>
+              <w:t xml:space="preserve">Component </w:t>
+            </w:r>
+            <w:proofErr w:type="spellStart"/>
+            <w:r>
+              <w:t>PortfolioSummary</w:t>
+            </w:r>
+            <w:proofErr w:type="spellEnd"/>
           </w:p>
         </w:tc>
         <w:tc>
@@ -13170,8 +13796,13 @@
           </w:tcPr>
           <w:p>
             <w:r>
-              <w:t>Feature EstimatesList</w:t>
-            </w:r>
+              <w:t xml:space="preserve">Feature </w:t>
+            </w:r>
+            <w:proofErr w:type="spellStart"/>
+            <w:r>
+              <w:t>EstimatesList</w:t>
+            </w:r>
+            <w:proofErr w:type="spellEnd"/>
           </w:p>
         </w:tc>
         <w:tc>
@@ -13286,7 +13917,15 @@
               <w:t>GPT-5 mini</w:t>
             </w:r>
             <w:r>
-              <w:t> (pagination test)</w:t>
+              <w:t> (</w:t>
+            </w:r>
+            <w:proofErr w:type="spellStart"/>
+            <w:r>
+              <w:t>pagination</w:t>
+            </w:r>
+            <w:proofErr w:type="spellEnd"/>
+            <w:r>
+              <w:t xml:space="preserve"> test)</w:t>
             </w:r>
           </w:p>
         </w:tc>
@@ -13344,8 +13983,13 @@
           </w:tcPr>
           <w:p>
             <w:r>
-              <w:t>Feature EstimateDetail</w:t>
-            </w:r>
+              <w:t xml:space="preserve">Feature </w:t>
+            </w:r>
+            <w:proofErr w:type="spellStart"/>
+            <w:r>
+              <w:t>EstimateDetail</w:t>
+            </w:r>
+            <w:proofErr w:type="spellEnd"/>
           </w:p>
         </w:tc>
         <w:tc>
@@ -13623,7 +14267,15 @@
               <w:t>GPT-5.1-Codex</w:t>
             </w:r>
             <w:r>
-              <w:t> (streaming context)</w:t>
+              <w:t xml:space="preserve"> (streaming </w:t>
+            </w:r>
+            <w:proofErr w:type="spellStart"/>
+            <w:r>
+              <w:t>context</w:t>
+            </w:r>
+            <w:proofErr w:type="spellEnd"/>
+            <w:r>
+              <w:t>)</w:t>
             </w:r>
           </w:p>
         </w:tc>
@@ -13680,8 +14332,13 @@
           </w:tcPr>
           <w:p>
             <w:r>
-              <w:t>Hook useEstimates</w:t>
-            </w:r>
+              <w:t xml:space="preserve">Hook </w:t>
+            </w:r>
+            <w:proofErr w:type="spellStart"/>
+            <w:r>
+              <w:t>useEstimates</w:t>
+            </w:r>
+            <w:proofErr w:type="spellEnd"/>
           </w:p>
         </w:tc>
         <w:tc>
@@ -13843,8 +14500,13 @@
           </w:tcPr>
           <w:p>
             <w:r>
-              <w:t>Hook useMarketData</w:t>
-            </w:r>
+              <w:t xml:space="preserve">Hook </w:t>
+            </w:r>
+            <w:proofErr w:type="spellStart"/>
+            <w:r>
+              <w:t>useMarketData</w:t>
+            </w:r>
+            <w:proofErr w:type="spellEnd"/>
           </w:p>
         </w:tc>
         <w:tc>
@@ -14016,8 +14678,13 @@
           </w:tcPr>
           <w:p>
             <w:r>
-              <w:t>Hook useRealTimePnL</w:t>
-            </w:r>
+              <w:t xml:space="preserve">Hook </w:t>
+            </w:r>
+            <w:proofErr w:type="spellStart"/>
+            <w:r>
+              <w:t>useRealTimePnL</w:t>
+            </w:r>
+            <w:proofErr w:type="spellEnd"/>
           </w:p>
         </w:tc>
         <w:tc>
@@ -14145,7 +14812,21 @@
               <w:rPr>
                 <w:lang w:val="en-US"/>
               </w:rPr>
-              <w:t> (memoization perf)</w:t>
+              <w:t> (</w:t>
+            </w:r>
+            <w:proofErr w:type="spellStart"/>
+            <w:r>
+              <w:rPr>
+                <w:lang w:val="en-US"/>
+              </w:rPr>
+              <w:t>memoization</w:t>
+            </w:r>
+            <w:proofErr w:type="spellEnd"/>
+            <w:r>
+              <w:rPr>
+                <w:lang w:val="en-US"/>
+              </w:rPr>
+              <w:t xml:space="preserve"> perf)</w:t>
             </w:r>
           </w:p>
         </w:tc>
@@ -14643,7 +15324,15 @@
           </w:tcPr>
           <w:p>
             <w:r>
-              <w:t>Auth Context Provider</w:t>
+              <w:t xml:space="preserve">Auth </w:t>
+            </w:r>
+            <w:proofErr w:type="spellStart"/>
+            <w:r>
+              <w:t>Context</w:t>
+            </w:r>
+            <w:proofErr w:type="spellEnd"/>
+            <w:r>
+              <w:t xml:space="preserve"> Provider</w:t>
             </w:r>
           </w:p>
         </w:tc>
@@ -14829,8 +15518,13 @@
           </w:tcPr>
           <w:p>
             <w:r>
-              <w:t>Global State Zustand</w:t>
-            </w:r>
+              <w:t xml:space="preserve">Global State </w:t>
+            </w:r>
+            <w:proofErr w:type="spellStart"/>
+            <w:r>
+              <w:t>Zustand</w:t>
+            </w:r>
+            <w:proofErr w:type="spellEnd"/>
           </w:p>
         </w:tc>
         <w:tc>
@@ -14992,8 +15686,13 @@
           </w:tcPr>
           <w:p>
             <w:r>
-              <w:t>Error Boundary</w:t>
-            </w:r>
+              <w:t xml:space="preserve">Error </w:t>
+            </w:r>
+            <w:proofErr w:type="spellStart"/>
+            <w:r>
+              <w:t>Boundary</w:t>
+            </w:r>
+            <w:proofErr w:type="spellEnd"/>
           </w:p>
         </w:tc>
         <w:tc>
@@ -15156,8 +15855,13 @@
           </w:tcPr>
           <w:p>
             <w:r>
-              <w:t>Suspense Boundaries</w:t>
-            </w:r>
+              <w:t xml:space="preserve">Suspense </w:t>
+            </w:r>
+            <w:proofErr w:type="spellStart"/>
+            <w:r>
+              <w:t>Boundaries</w:t>
+            </w:r>
+            <w:proofErr w:type="spellEnd"/>
           </w:p>
         </w:tc>
         <w:tc>

</xml_diff>

<commit_message>
feat: Implement initial backend setup including core infrastructure, estimates module, shared utilities, and comprehensive documentation.
</commit_message>
<xml_diff>
--- a/IA Model selection.docx
+++ b/IA Model selection.docx
@@ -9689,10 +9689,16 @@
             <w:hideMark/>
           </w:tcPr>
           <w:p>
-            <w:r>
-              <w:rPr>
-                <w:b/>
-                <w:bCs/>
+            <w:pPr>
+              <w:rPr>
+                <w:highlight w:val="green"/>
+              </w:rPr>
+            </w:pPr>
+            <w:r>
+              <w:rPr>
+                <w:b/>
+                <w:bCs/>
+                <w:highlight w:val="green"/>
               </w:rPr>
               <w:t>3.3</w:t>
             </w:r>
@@ -9717,15 +9723,29 @@
             <w:hideMark/>
           </w:tcPr>
           <w:p>
-            <w:r>
+            <w:pPr>
+              <w:rPr>
+                <w:highlight w:val="green"/>
+              </w:rPr>
+            </w:pPr>
+            <w:r>
+              <w:rPr>
+                <w:highlight w:val="green"/>
+              </w:rPr>
               <w:t xml:space="preserve">Input </w:t>
             </w:r>
             <w:proofErr w:type="spellStart"/>
             <w:r>
+              <w:rPr>
+                <w:highlight w:val="green"/>
+              </w:rPr>
               <w:t>Validation</w:t>
             </w:r>
             <w:proofErr w:type="spellEnd"/>
             <w:r>
+              <w:rPr>
+                <w:highlight w:val="green"/>
+              </w:rPr>
               <w:t xml:space="preserve"> Avanzata</w:t>
             </w:r>
           </w:p>
@@ -9749,10 +9769,16 @@
             <w:hideMark/>
           </w:tcPr>
           <w:p>
-            <w:r>
-              <w:rPr>
-                <w:b/>
-                <w:bCs/>
+            <w:pPr>
+              <w:rPr>
+                <w:highlight w:val="green"/>
+              </w:rPr>
+            </w:pPr>
+            <w:r>
+              <w:rPr>
+                <w:b/>
+                <w:bCs/>
+                <w:highlight w:val="green"/>
               </w:rPr>
               <w:t>Claude Sonnet 4.5</w:t>
             </w:r>
@@ -9777,7 +9803,15 @@
             <w:hideMark/>
           </w:tcPr>
           <w:p>
-            <w:r>
+            <w:pPr>
+              <w:rPr>
+                <w:highlight w:val="green"/>
+              </w:rPr>
+            </w:pPr>
+            <w:r>
+              <w:rPr>
+                <w:highlight w:val="green"/>
+              </w:rPr>
               <w:t>GPT-5.1-Codex</w:t>
             </w:r>
           </w:p>
@@ -9801,7 +9835,15 @@
             <w:hideMark/>
           </w:tcPr>
           <w:p>
-            <w:r>
+            <w:pPr>
+              <w:rPr>
+                <w:highlight w:val="green"/>
+              </w:rPr>
+            </w:pPr>
+            <w:r>
+              <w:rPr>
+                <w:highlight w:val="green"/>
+              </w:rPr>
               <w:t>1x/1x</w:t>
             </w:r>
           </w:p>
@@ -9827,18 +9869,21 @@
           <w:p>
             <w:pPr>
               <w:rPr>
+                <w:highlight w:val="green"/>
                 <w:lang w:val="en-US"/>
               </w:rPr>
             </w:pPr>
             <w:r>
               <w:rPr>
                 <w:rFonts w:ascii="Segoe UI Emoji" w:hAnsi="Segoe UI Emoji" w:cs="Segoe UI Emoji"/>
+                <w:highlight w:val="green"/>
                 <w:lang w:val="en-US"/>
               </w:rPr>
               <w:t>✅</w:t>
             </w:r>
             <w:r>
               <w:rPr>
+                <w:highlight w:val="green"/>
                 <w:lang w:val="en-US"/>
               </w:rPr>
               <w:t> </w:t>
@@ -9847,12 +9892,14 @@
               <w:rPr>
                 <w:b/>
                 <w:bCs/>
+                <w:highlight w:val="green"/>
                 <w:lang w:val="en-US"/>
               </w:rPr>
               <w:t>Grok Code Fast 1</w:t>
             </w:r>
             <w:r>
               <w:rPr>
+                <w:highlight w:val="green"/>
                 <w:lang w:val="en-US"/>
               </w:rPr>
               <w:t> (injection prevention)</w:t>

</xml_diff>

<commit_message>
feat: Add backend README, AGENTS documentation, and initial security infrastructure with encryption module and tests.
</commit_message>
<xml_diff>
--- a/IA Model selection.docx
+++ b/IA Model selection.docx
@@ -9930,10 +9930,16 @@
             <w:hideMark/>
           </w:tcPr>
           <w:p>
-            <w:r>
-              <w:rPr>
-                <w:b/>
-                <w:bCs/>
+            <w:pPr>
+              <w:rPr>
+                <w:highlight w:val="green"/>
+              </w:rPr>
+            </w:pPr>
+            <w:r>
+              <w:rPr>
+                <w:b/>
+                <w:bCs/>
+                <w:highlight w:val="green"/>
               </w:rPr>
               <w:t>3.4</w:t>
             </w:r>
@@ -9958,24 +9964,44 @@
             <w:hideMark/>
           </w:tcPr>
           <w:p>
+            <w:pPr>
+              <w:rPr>
+                <w:highlight w:val="green"/>
+              </w:rPr>
+            </w:pPr>
             <w:proofErr w:type="spellStart"/>
             <w:r>
+              <w:rPr>
+                <w:highlight w:val="green"/>
+              </w:rPr>
               <w:t>Encryption</w:t>
             </w:r>
             <w:proofErr w:type="spellEnd"/>
             <w:r>
+              <w:rPr>
+                <w:highlight w:val="green"/>
+              </w:rPr>
               <w:t xml:space="preserve"> </w:t>
             </w:r>
             <w:proofErr w:type="spellStart"/>
             <w:r>
+              <w:rPr>
+                <w:highlight w:val="green"/>
+              </w:rPr>
               <w:t>at</w:t>
             </w:r>
             <w:proofErr w:type="spellEnd"/>
             <w:r>
+              <w:rPr>
+                <w:highlight w:val="green"/>
+              </w:rPr>
               <w:t xml:space="preserve"> </w:t>
             </w:r>
             <w:proofErr w:type="spellStart"/>
             <w:r>
+              <w:rPr>
+                <w:highlight w:val="green"/>
+              </w:rPr>
               <w:t>Rest</w:t>
             </w:r>
             <w:proofErr w:type="spellEnd"/>
@@ -10000,10 +10026,16 @@
             <w:hideMark/>
           </w:tcPr>
           <w:p>
-            <w:r>
-              <w:rPr>
-                <w:b/>
-                <w:bCs/>
+            <w:pPr>
+              <w:rPr>
+                <w:highlight w:val="green"/>
+              </w:rPr>
+            </w:pPr>
+            <w:r>
+              <w:rPr>
+                <w:b/>
+                <w:bCs/>
+                <w:highlight w:val="green"/>
               </w:rPr>
               <w:t>Claude Sonnet 4.5</w:t>
             </w:r>
@@ -10028,7 +10060,15 @@
             <w:hideMark/>
           </w:tcPr>
           <w:p>
-            <w:r>
+            <w:pPr>
+              <w:rPr>
+                <w:highlight w:val="green"/>
+              </w:rPr>
+            </w:pPr>
+            <w:r>
+              <w:rPr>
+                <w:highlight w:val="green"/>
+              </w:rPr>
               <w:t>GPT-4o</w:t>
             </w:r>
           </w:p>
@@ -10052,7 +10092,15 @@
             <w:hideMark/>
           </w:tcPr>
           <w:p>
-            <w:r>
+            <w:pPr>
+              <w:rPr>
+                <w:highlight w:val="green"/>
+              </w:rPr>
+            </w:pPr>
+            <w:r>
+              <w:rPr>
+                <w:highlight w:val="green"/>
+              </w:rPr>
               <w:t>1x/0x</w:t>
             </w:r>
           </w:p>
@@ -10078,18 +10126,21 @@
           <w:p>
             <w:pPr>
               <w:rPr>
+                <w:highlight w:val="green"/>
                 <w:lang w:val="en-US"/>
               </w:rPr>
             </w:pPr>
             <w:r>
               <w:rPr>
                 <w:rFonts w:ascii="Segoe UI Emoji" w:hAnsi="Segoe UI Emoji" w:cs="Segoe UI Emoji"/>
+                <w:highlight w:val="green"/>
                 <w:lang w:val="en-US"/>
               </w:rPr>
               <w:t>✅</w:t>
             </w:r>
             <w:r>
               <w:rPr>
+                <w:highlight w:val="green"/>
                 <w:lang w:val="en-US"/>
               </w:rPr>
               <w:t> </w:t>
@@ -10098,12 +10149,14 @@
               <w:rPr>
                 <w:b/>
                 <w:bCs/>
+                <w:highlight w:val="green"/>
                 <w:lang w:val="en-US"/>
               </w:rPr>
               <w:t>DeepSeek-V3.2</w:t>
             </w:r>
             <w:r>
               <w:rPr>
+                <w:highlight w:val="green"/>
                 <w:lang w:val="en-US"/>
               </w:rPr>
               <w:t> (Fernet key rotation)</w:t>

</xml_diff>

<commit_message>
feat: Implement initial FastAPI backend with structured logging, encryption at rest, and core routing.
</commit_message>
<xml_diff>
--- a/IA Model selection.docx
+++ b/IA Model selection.docx
@@ -10187,10 +10187,16 @@
             <w:hideMark/>
           </w:tcPr>
           <w:p>
-            <w:r>
-              <w:rPr>
-                <w:b/>
-                <w:bCs/>
+            <w:pPr>
+              <w:rPr>
+                <w:highlight w:val="green"/>
+              </w:rPr>
+            </w:pPr>
+            <w:r>
+              <w:rPr>
+                <w:b/>
+                <w:bCs/>
+                <w:highlight w:val="green"/>
               </w:rPr>
               <w:t>3.5</w:t>
             </w:r>
@@ -10215,16 +10221,30 @@
             <w:hideMark/>
           </w:tcPr>
           <w:p>
+            <w:pPr>
+              <w:rPr>
+                <w:highlight w:val="green"/>
+              </w:rPr>
+            </w:pPr>
             <w:proofErr w:type="spellStart"/>
             <w:r>
+              <w:rPr>
+                <w:highlight w:val="green"/>
+              </w:rPr>
               <w:t>Structured</w:t>
             </w:r>
             <w:proofErr w:type="spellEnd"/>
             <w:r>
+              <w:rPr>
+                <w:highlight w:val="green"/>
+              </w:rPr>
               <w:t xml:space="preserve"> </w:t>
             </w:r>
             <w:proofErr w:type="spellStart"/>
             <w:r>
+              <w:rPr>
+                <w:highlight w:val="green"/>
+              </w:rPr>
               <w:t>Logging</w:t>
             </w:r>
             <w:proofErr w:type="spellEnd"/>
@@ -10249,10 +10269,16 @@
             <w:hideMark/>
           </w:tcPr>
           <w:p>
-            <w:r>
-              <w:rPr>
-                <w:b/>
-                <w:bCs/>
+            <w:pPr>
+              <w:rPr>
+                <w:highlight w:val="green"/>
+              </w:rPr>
+            </w:pPr>
+            <w:r>
+              <w:rPr>
+                <w:b/>
+                <w:bCs/>
+                <w:highlight w:val="green"/>
               </w:rPr>
               <w:t>GPT-4o</w:t>
             </w:r>
@@ -10277,7 +10303,15 @@
             <w:hideMark/>
           </w:tcPr>
           <w:p>
-            <w:r>
+            <w:pPr>
+              <w:rPr>
+                <w:highlight w:val="green"/>
+              </w:rPr>
+            </w:pPr>
+            <w:r>
+              <w:rPr>
+                <w:highlight w:val="green"/>
+              </w:rPr>
               <w:t>DeepSeek-V3.2</w:t>
             </w:r>
           </w:p>
@@ -10301,7 +10335,15 @@
             <w:hideMark/>
           </w:tcPr>
           <w:p>
-            <w:r>
+            <w:pPr>
+              <w:rPr>
+                <w:highlight w:val="green"/>
+              </w:rPr>
+            </w:pPr>
+            <w:r>
+              <w:rPr>
+                <w:highlight w:val="green"/>
+              </w:rPr>
               <w:t>0x/1x</w:t>
             </w:r>
           </w:p>
@@ -10325,13 +10367,22 @@
             <w:hideMark/>
           </w:tcPr>
           <w:p>
+            <w:pPr>
+              <w:rPr>
+                <w:highlight w:val="green"/>
+              </w:rPr>
+            </w:pPr>
             <w:r>
               <w:rPr>
                 <w:rFonts w:ascii="Segoe UI Emoji" w:hAnsi="Segoe UI Emoji" w:cs="Segoe UI Emoji"/>
+                <w:highlight w:val="green"/>
               </w:rPr>
               <w:t>❌</w:t>
             </w:r>
             <w:r>
+              <w:rPr>
+                <w:highlight w:val="green"/>
+              </w:rPr>
               <w:t xml:space="preserve"> Non necessario</w:t>
             </w:r>
           </w:p>

</xml_diff>